<commit_message>
completed till network policy
</commit_message>
<xml_diff>
--- a/docs (kubernetes)/kcna_summary.docx
+++ b/docs (kubernetes)/kcna_summary.docx
@@ -20171,8 +20171,6 @@
         </w:rPr>
         <w:t>user name</w:t>
       </w:r>
-      <w:bookmarkStart w:id="0" w:name="_GoBack"/>
-      <w:bookmarkEnd w:id="0"/>
       <w:r>
         <w:rPr>
           <w:rFonts w:hint="default" w:ascii="Sitka Subheading" w:hAnsi="Sitka Subheading" w:cs="Sitka Subheading"/>
@@ -20339,7 +20337,7 @@
           <w:rFonts w:hint="default" w:ascii="Sitka Subheading" w:hAnsi="Sitka Subheading" w:cs="Sitka Subheading"/>
           <w:lang w:val="en-IN"/>
         </w:rPr>
-        <w:t>Image Security  (page 92)</w:t>
+        <w:t>Image Security</w:t>
       </w:r>
     </w:p>
     <w:p>
@@ -20354,6 +20352,1174 @@
           <w:rFonts w:hint="default" w:ascii="Sitka Subheading" w:hAnsi="Sitka Subheading" w:cs="Sitka Subheading"/>
         </w:rPr>
       </w:pPr>
+      <w:r>
+        <w:rPr>
+          <w:rFonts w:hint="default" w:ascii="Sitka Subheading" w:hAnsi="Sitka Subheading" w:cs="Sitka Subheading"/>
+          <w:lang w:val="en-IN"/>
+        </w:rPr>
+        <w:t xml:space="preserve">Default docker registry: </w:t>
+      </w:r>
+      <w:r>
+        <w:rPr>
+          <w:rFonts w:hint="default" w:ascii="Sitka Subheading" w:hAnsi="Sitka Subheading" w:cs="Sitka Subheading"/>
+          <w:i/>
+          <w:iCs/>
+          <w:lang w:val="en-IN"/>
+        </w:rPr>
+        <w:t>docker hub</w:t>
+      </w:r>
+      <w:r>
+        <w:rPr>
+          <w:rFonts w:hint="default" w:ascii="Sitka Subheading" w:hAnsi="Sitka Subheading" w:cs="Sitka Subheading"/>
+          <w:b w:val="0"/>
+          <w:bCs w:val="0"/>
+          <w:i w:val="0"/>
+          <w:iCs w:val="0"/>
+          <w:lang w:val="en-IN"/>
+        </w:rPr>
+        <w:t xml:space="preserve"> </w:t>
+      </w:r>
+    </w:p>
+    <w:p>
+      <w:pPr>
+        <w:numPr>
+          <w:ilvl w:val="1"/>
+          <w:numId w:val="11"/>
+        </w:numPr>
+        <w:spacing w:line="360" w:lineRule="auto"/>
+        <w:ind w:left="840" w:leftChars="0" w:hanging="420" w:firstLineChars="0"/>
+        <w:rPr>
+          <w:rFonts w:hint="default" w:ascii="Sitka Subheading" w:hAnsi="Sitka Subheading" w:cs="Sitka Subheading"/>
+        </w:rPr>
+      </w:pPr>
+      <w:r>
+        <w:rPr>
+          <w:rFonts w:hint="default" w:ascii="Sitka Subheading" w:hAnsi="Sitka Subheading" w:cs="Sitka Subheading"/>
+          <w:b/>
+          <w:bCs/>
+          <w:i/>
+          <w:iCs/>
+          <w:color w:val="18605A" w:themeColor="accent5" w:themeShade="80"/>
+          <w:u w:val="single"/>
+          <w:lang w:val="en-IN"/>
+        </w:rPr>
+        <w:t>image</w:t>
+      </w:r>
+      <w:r>
+        <w:rPr>
+          <w:rFonts w:hint="default" w:ascii="Sitka Subheading" w:hAnsi="Sitka Subheading" w:cs="Sitka Subheading"/>
+          <w:b/>
+          <w:bCs/>
+          <w:i w:val="0"/>
+          <w:iCs w:val="0"/>
+          <w:lang w:val="en-IN"/>
+        </w:rPr>
+        <w:t xml:space="preserve">: </w:t>
+      </w:r>
+      <w:r>
+        <w:rPr>
+          <w:rFonts w:hint="default" w:ascii="Sitka Subheading" w:hAnsi="Sitka Subheading" w:cs="Sitka Subheading"/>
+          <w:b w:val="0"/>
+          <w:bCs w:val="0"/>
+          <w:i w:val="0"/>
+          <w:iCs w:val="0"/>
+          <w:lang w:val="en-IN"/>
+        </w:rPr>
+        <w:t xml:space="preserve">nginx </w:t>
+      </w:r>
+      <w:r>
+        <w:rPr>
+          <w:rFonts w:hint="default" w:ascii="Sitka Subheading" w:hAnsi="Sitka Subheading" w:cs="Sitka Subheading"/>
+          <w:b w:val="0"/>
+          <w:bCs w:val="0"/>
+          <w:i w:val="0"/>
+          <w:iCs w:val="0"/>
+          <w:lang w:val="en-IN"/>
+        </w:rPr>
+        <w:br w:type="textWrapping"/>
+      </w:r>
+      <w:r>
+        <w:rPr>
+          <w:rFonts w:hint="default" w:ascii="Sitka Subheading" w:hAnsi="Sitka Subheading" w:cs="Sitka Subheading"/>
+          <w:b w:val="0"/>
+          <w:bCs w:val="0"/>
+          <w:i w:val="0"/>
+          <w:iCs w:val="0"/>
+          <w:lang w:val="en-IN"/>
+        </w:rPr>
+        <w:t>registry: docker.io</w:t>
+      </w:r>
+      <w:r>
+        <w:rPr>
+          <w:rFonts w:hint="default" w:ascii="Sitka Subheading" w:hAnsi="Sitka Subheading" w:cs="Sitka Subheading"/>
+          <w:b w:val="0"/>
+          <w:bCs w:val="0"/>
+          <w:i w:val="0"/>
+          <w:iCs w:val="0"/>
+          <w:lang w:val="en-IN"/>
+        </w:rPr>
+        <w:br w:type="textWrapping"/>
+      </w:r>
+      <w:r>
+        <w:rPr>
+          <w:rFonts w:hint="default" w:ascii="Sitka Subheading" w:hAnsi="Sitka Subheading" w:cs="Sitka Subheading"/>
+          <w:b w:val="0"/>
+          <w:bCs w:val="0"/>
+          <w:i w:val="0"/>
+          <w:iCs w:val="0"/>
+          <w:lang w:val="en-IN"/>
+        </w:rPr>
+        <w:t>namespace (organization/user): library (official images present in this)</w:t>
+      </w:r>
+      <w:r>
+        <w:rPr>
+          <w:rFonts w:hint="default" w:ascii="Sitka Subheading" w:hAnsi="Sitka Subheading" w:cs="Sitka Subheading"/>
+          <w:b w:val="0"/>
+          <w:bCs w:val="0"/>
+          <w:i w:val="0"/>
+          <w:iCs w:val="0"/>
+          <w:lang w:val="en-IN"/>
+        </w:rPr>
+        <w:br w:type="textWrapping"/>
+      </w:r>
+      <w:r>
+        <w:rPr>
+          <w:rFonts w:hint="default" w:ascii="Sitka Subheading" w:hAnsi="Sitka Subheading" w:cs="Sitka Subheading"/>
+          <w:b w:val="0"/>
+          <w:bCs w:val="0"/>
+          <w:i w:val="0"/>
+          <w:iCs w:val="0"/>
+          <w:lang w:val="en-IN"/>
+        </w:rPr>
+        <w:t>repository: nginx</w:t>
+      </w:r>
+      <w:r>
+        <w:rPr>
+          <w:rFonts w:hint="default" w:ascii="Sitka Subheading" w:hAnsi="Sitka Subheading" w:cs="Sitka Subheading"/>
+          <w:b w:val="0"/>
+          <w:bCs w:val="0"/>
+          <w:i w:val="0"/>
+          <w:iCs w:val="0"/>
+          <w:lang w:val="en-IN"/>
+        </w:rPr>
+        <w:br w:type="textWrapping"/>
+      </w:r>
+      <w:r>
+        <w:rPr>
+          <w:rFonts w:hint="default" w:ascii="Sitka Subheading" w:hAnsi="Sitka Subheading" w:cs="Sitka Subheading"/>
+          <w:b w:val="0"/>
+          <w:bCs w:val="0"/>
+          <w:i w:val="0"/>
+          <w:iCs w:val="0"/>
+          <w:lang w:val="en-IN"/>
+        </w:rPr>
+        <w:t>tag: latest</w:t>
+      </w:r>
+    </w:p>
+    <w:p>
+      <w:pPr>
+        <w:numPr>
+          <w:ilvl w:val="1"/>
+          <w:numId w:val="11"/>
+        </w:numPr>
+        <w:spacing w:line="360" w:lineRule="auto"/>
+        <w:ind w:left="840" w:leftChars="0" w:hanging="420" w:firstLineChars="0"/>
+        <w:rPr>
+          <w:rFonts w:hint="default" w:ascii="Sitka Subheading" w:hAnsi="Sitka Subheading" w:cs="Sitka Subheading"/>
+          <w:shd w:val="clear" w:color="FFFFFF" w:fill="D9D9D9"/>
+        </w:rPr>
+      </w:pPr>
+      <w:r>
+        <w:rPr>
+          <w:rFonts w:hint="default" w:ascii="Sitka Subheading" w:hAnsi="Sitka Subheading" w:cs="Sitka Subheading"/>
+          <w:i/>
+          <w:iCs/>
+          <w:color w:val="18605A" w:themeColor="accent5" w:themeShade="80"/>
+          <w:u w:val="single"/>
+          <w:shd w:val="clear" w:color="FFFFFF" w:fill="D9D9D9"/>
+          <w:lang w:val="en-IN"/>
+        </w:rPr>
+        <w:t>image</w:t>
+      </w:r>
+      <w:r>
+        <w:rPr>
+          <w:rFonts w:hint="default" w:ascii="Sitka Subheading" w:hAnsi="Sitka Subheading" w:cs="Sitka Subheading"/>
+          <w:shd w:val="clear" w:color="FFFFFF" w:fill="D9D9D9"/>
+          <w:lang w:val="en-IN"/>
+        </w:rPr>
+        <w:t xml:space="preserve">: nginx  ==&gt;  </w:t>
+      </w:r>
+      <w:r>
+        <w:rPr>
+          <w:rFonts w:hint="default" w:ascii="Sitka Subheading" w:hAnsi="Sitka Subheading" w:cs="Sitka Subheading"/>
+          <w:i/>
+          <w:iCs/>
+          <w:color w:val="18605A" w:themeColor="accent5" w:themeShade="80"/>
+          <w:u w:val="single"/>
+          <w:shd w:val="clear" w:color="FFFFFF" w:fill="D9D9D9"/>
+          <w:lang w:val="en-IN"/>
+        </w:rPr>
+        <w:t>image</w:t>
+      </w:r>
+      <w:r>
+        <w:rPr>
+          <w:rFonts w:hint="default" w:ascii="Sitka Subheading" w:hAnsi="Sitka Subheading" w:cs="Sitka Subheading"/>
+          <w:shd w:val="clear" w:color="FFFFFF" w:fill="D9D9D9"/>
+          <w:lang w:val="en-IN"/>
+        </w:rPr>
+        <w:t>: docker.io/library/nginx</w:t>
+      </w:r>
+    </w:p>
+    <w:p>
+      <w:pPr>
+        <w:numPr>
+          <w:ilvl w:val="1"/>
+          <w:numId w:val="11"/>
+        </w:numPr>
+        <w:spacing w:line="360" w:lineRule="auto"/>
+        <w:ind w:left="840" w:leftChars="0" w:hanging="420" w:firstLineChars="0"/>
+        <w:rPr>
+          <w:rFonts w:hint="default" w:ascii="Sitka Subheading" w:hAnsi="Sitka Subheading" w:cs="Sitka Subheading"/>
+        </w:rPr>
+      </w:pPr>
+      <w:r>
+        <w:rPr>
+          <w:rFonts w:hint="default" w:ascii="Sitka Subheading" w:hAnsi="Sitka Subheading" w:cs="Sitka Subheading"/>
+          <w:i/>
+          <w:iCs/>
+          <w:color w:val="18605A" w:themeColor="accent5" w:themeShade="80"/>
+          <w:u w:val="single"/>
+          <w:lang w:val="en-IN"/>
+        </w:rPr>
+        <w:t>image</w:t>
+      </w:r>
+      <w:r>
+        <w:rPr>
+          <w:rFonts w:hint="default" w:ascii="Sitka Subheading" w:hAnsi="Sitka Subheading" w:cs="Sitka Subheading"/>
+          <w:color w:val="795D01" w:themeColor="accent3" w:themeShade="80"/>
+          <w:lang w:val="en-IN"/>
+        </w:rPr>
+        <w:t>: private-registry.io/apps/internal-app</w:t>
+      </w:r>
+      <w:r>
+        <w:rPr>
+          <w:rFonts w:hint="default" w:ascii="Sitka Subheading" w:hAnsi="Sitka Subheading" w:cs="Sitka Subheading"/>
+          <w:lang w:val="en-IN"/>
+        </w:rPr>
+        <w:br w:type="textWrapping"/>
+      </w:r>
+      <w:r>
+        <w:rPr>
+          <w:rFonts w:hint="default" w:ascii="Sitka Subheading" w:hAnsi="Sitka Subheading" w:cs="Sitka Subheading"/>
+          <w:lang w:val="en-IN"/>
+        </w:rPr>
+        <w:t>[ if you want to specify other registry or other namespace ]</w:t>
+      </w:r>
+    </w:p>
+    <w:p>
+      <w:pPr>
+        <w:numPr>
+          <w:ilvl w:val="1"/>
+          <w:numId w:val="11"/>
+        </w:numPr>
+        <w:spacing w:line="360" w:lineRule="auto"/>
+        <w:ind w:left="840" w:leftChars="0" w:hanging="420" w:firstLineChars="0"/>
+        <w:rPr>
+          <w:rFonts w:hint="default" w:ascii="Sitka Subheading" w:hAnsi="Sitka Subheading" w:cs="Sitka Subheading"/>
+        </w:rPr>
+      </w:pPr>
+      <w:r>
+        <w:rPr>
+          <w:rFonts w:hint="default" w:ascii="Sitka Subheading" w:hAnsi="Sitka Subheading" w:cs="Sitka Subheading"/>
+          <w:lang w:val="en-IN"/>
+        </w:rPr>
+        <w:t>In case of private registry, you need to authenticate in that.</w:t>
+      </w:r>
+    </w:p>
+    <w:p>
+      <w:pPr>
+        <w:numPr>
+          <w:ilvl w:val="1"/>
+          <w:numId w:val="11"/>
+        </w:numPr>
+        <w:spacing w:line="360" w:lineRule="auto"/>
+        <w:ind w:left="840" w:leftChars="0" w:hanging="420" w:firstLineChars="0"/>
+        <w:rPr>
+          <w:rFonts w:hint="default" w:ascii="Sitka Subheading" w:hAnsi="Sitka Subheading" w:cs="Sitka Subheading"/>
+        </w:rPr>
+      </w:pPr>
+      <w:r>
+        <w:rPr>
+          <w:rFonts w:hint="default" w:ascii="Sitka Subheading" w:hAnsi="Sitka Subheading" w:cs="Sitka Subheading"/>
+          <w:lang w:val="en-IN"/>
+        </w:rPr>
+        <w:t xml:space="preserve">Create a </w:t>
+      </w:r>
+      <w:r>
+        <w:rPr>
+          <w:rFonts w:hint="default" w:ascii="Sitka Subheading" w:hAnsi="Sitka Subheading" w:cs="Sitka Subheading"/>
+          <w:b/>
+          <w:bCs/>
+          <w:lang w:val="en-IN"/>
+        </w:rPr>
+        <w:t>Secret</w:t>
+      </w:r>
+      <w:r>
+        <w:rPr>
+          <w:rFonts w:hint="default" w:ascii="Sitka Subheading" w:hAnsi="Sitka Subheading" w:cs="Sitka Subheading"/>
+          <w:b w:val="0"/>
+          <w:bCs w:val="0"/>
+          <w:lang w:val="en-IN"/>
+        </w:rPr>
+        <w:t xml:space="preserve"> (Kubernetes Resource)</w:t>
+      </w:r>
+      <w:r>
+        <w:rPr>
+          <w:rFonts w:hint="default" w:ascii="Sitka Subheading" w:hAnsi="Sitka Subheading" w:cs="Sitka Subheading"/>
+          <w:b w:val="0"/>
+          <w:bCs w:val="0"/>
+          <w:lang w:val="en-IN"/>
+        </w:rPr>
+        <w:br w:type="textWrapping"/>
+      </w:r>
+      <w:r>
+        <w:rPr>
+          <w:rFonts w:hint="default" w:ascii="Sitka Subheading" w:hAnsi="Sitka Subheading" w:cs="Sitka Subheading"/>
+          <w:b w:val="0"/>
+          <w:bCs w:val="0"/>
+          <w:lang w:val="en-IN"/>
+        </w:rPr>
+        <w:t xml:space="preserve">mention secret object’s name in </w:t>
+      </w:r>
+      <w:r>
+        <w:rPr>
+          <w:rFonts w:hint="default" w:ascii="Sitka Subheading" w:hAnsi="Sitka Subheading" w:cs="Sitka Subheading"/>
+          <w:b w:val="0"/>
+          <w:bCs w:val="0"/>
+          <w:i/>
+          <w:iCs/>
+          <w:color w:val="18605A" w:themeColor="accent5" w:themeShade="80"/>
+          <w:u w:val="single"/>
+          <w:lang w:val="en-IN"/>
+        </w:rPr>
+        <w:t>pod.spec.</w:t>
+      </w:r>
+      <w:r>
+        <w:rPr>
+          <w:rFonts w:hint="default" w:ascii="Sitka Subheading" w:hAnsi="Sitka Subheading" w:cs="Sitka Subheading"/>
+          <w:b/>
+          <w:bCs/>
+          <w:i/>
+          <w:iCs/>
+          <w:color w:val="18605A" w:themeColor="accent5" w:themeShade="80"/>
+          <w:u w:val="single"/>
+          <w:lang w:val="en-IN"/>
+        </w:rPr>
+        <w:t>imagePullSecrets.name</w:t>
+      </w:r>
+      <w:r>
+        <w:rPr>
+          <w:rFonts w:hint="default" w:ascii="Sitka Subheading" w:hAnsi="Sitka Subheading" w:cs="Sitka Subheading"/>
+          <w:b w:val="0"/>
+          <w:bCs w:val="0"/>
+          <w:i w:val="0"/>
+          <w:iCs w:val="0"/>
+          <w:lang w:val="en-IN"/>
+        </w:rPr>
+        <w:t xml:space="preserve"> field.</w:t>
+      </w:r>
+    </w:p>
+    <w:p>
+      <w:pPr>
+        <w:numPr>
+          <w:ilvl w:val="1"/>
+          <w:numId w:val="11"/>
+        </w:numPr>
+        <w:spacing w:line="360" w:lineRule="auto"/>
+        <w:ind w:left="840" w:leftChars="0" w:hanging="420" w:firstLineChars="0"/>
+        <w:rPr>
+          <w:rFonts w:hint="default" w:ascii="Sitka Subheading" w:hAnsi="Sitka Subheading" w:cs="Sitka Subheading"/>
+        </w:rPr>
+      </w:pPr>
+      <w:r>
+        <w:rPr>
+          <w:rFonts w:hint="default" w:ascii="Sitka Subheading" w:hAnsi="Sitka Subheading" w:cs="Sitka Subheading"/>
+          <w:b/>
+          <w:bCs/>
+          <w:color w:val="C00000"/>
+          <w:lang w:val="en-IN"/>
+        </w:rPr>
+        <w:t>kubectl create secret docker-registry &lt;</w:t>
+      </w:r>
+      <w:r>
+        <w:rPr>
+          <w:rFonts w:hint="default" w:ascii="Sitka Subheading" w:hAnsi="Sitka Subheading" w:cs="Sitka Subheading"/>
+          <w:b w:val="0"/>
+          <w:bCs w:val="0"/>
+          <w:color w:val="C00000"/>
+          <w:lang w:val="en-IN"/>
+        </w:rPr>
+        <w:t>secret name</w:t>
+      </w:r>
+      <w:r>
+        <w:rPr>
+          <w:rFonts w:hint="default" w:ascii="Sitka Subheading" w:hAnsi="Sitka Subheading" w:cs="Sitka Subheading"/>
+          <w:b/>
+          <w:bCs/>
+          <w:color w:val="C00000"/>
+          <w:lang w:val="en-IN"/>
+        </w:rPr>
+        <w:t xml:space="preserve">&gt;   </w:t>
+      </w:r>
+      <w:r>
+        <w:rPr>
+          <w:rFonts w:hint="default" w:ascii="Sitka Subheading" w:hAnsi="Sitka Subheading" w:cs="Sitka Subheading"/>
+          <w:b w:val="0"/>
+          <w:bCs w:val="0"/>
+          <w:color w:val="C00000"/>
+          <w:lang w:val="en-IN"/>
+        </w:rPr>
+        <w:t>\</w:t>
+      </w:r>
+      <w:r>
+        <w:rPr>
+          <w:rFonts w:hint="default" w:ascii="Sitka Subheading" w:hAnsi="Sitka Subheading" w:cs="Sitka Subheading"/>
+          <w:b/>
+          <w:bCs/>
+          <w:color w:val="C00000"/>
+          <w:lang w:val="en-IN"/>
+        </w:rPr>
+        <w:br w:type="textWrapping"/>
+      </w:r>
+      <w:r>
+        <w:rPr>
+          <w:rFonts w:hint="default" w:ascii="Sitka Subheading" w:hAnsi="Sitka Subheading" w:cs="Sitka Subheading"/>
+          <w:b/>
+          <w:bCs/>
+          <w:color w:val="C00000"/>
+          <w:lang w:val="en-IN"/>
+        </w:rPr>
+        <w:t>--docker-server=&lt;</w:t>
+      </w:r>
+      <w:r>
+        <w:rPr>
+          <w:rFonts w:hint="default" w:ascii="Sitka Subheading" w:hAnsi="Sitka Subheading" w:cs="Sitka Subheading"/>
+          <w:b w:val="0"/>
+          <w:bCs w:val="0"/>
+          <w:color w:val="C00000"/>
+          <w:lang w:val="en-IN"/>
+        </w:rPr>
+        <w:t>docker registry server</w:t>
+      </w:r>
+      <w:r>
+        <w:rPr>
+          <w:rFonts w:hint="default" w:ascii="Sitka Subheading" w:hAnsi="Sitka Subheading" w:cs="Sitka Subheading"/>
+          <w:b/>
+          <w:bCs/>
+          <w:color w:val="C00000"/>
+          <w:lang w:val="en-IN"/>
+        </w:rPr>
+        <w:t>&gt;</w:t>
+      </w:r>
+      <w:r>
+        <w:rPr>
+          <w:rFonts w:hint="default" w:ascii="Sitka Subheading" w:hAnsi="Sitka Subheading" w:cs="Sitka Subheading"/>
+          <w:b w:val="0"/>
+          <w:bCs w:val="0"/>
+          <w:color w:val="C00000"/>
+          <w:lang w:val="en-IN"/>
+        </w:rPr>
+        <w:t xml:space="preserve">   \</w:t>
+      </w:r>
+      <w:r>
+        <w:rPr>
+          <w:rFonts w:hint="default" w:ascii="Sitka Subheading" w:hAnsi="Sitka Subheading" w:cs="Sitka Subheading"/>
+          <w:b w:val="0"/>
+          <w:bCs w:val="0"/>
+          <w:color w:val="C00000"/>
+          <w:lang w:val="en-IN"/>
+        </w:rPr>
+        <w:br w:type="textWrapping"/>
+      </w:r>
+      <w:r>
+        <w:rPr>
+          <w:rFonts w:hint="default" w:ascii="Sitka Subheading" w:hAnsi="Sitka Subheading" w:cs="Sitka Subheading"/>
+          <w:b/>
+          <w:bCs/>
+          <w:color w:val="C00000"/>
+          <w:lang w:val="en-IN"/>
+        </w:rPr>
+        <w:t>--docker-username=&lt;</w:t>
+      </w:r>
+      <w:r>
+        <w:rPr>
+          <w:rFonts w:hint="default" w:ascii="Sitka Subheading" w:hAnsi="Sitka Subheading" w:cs="Sitka Subheading"/>
+          <w:b w:val="0"/>
+          <w:bCs w:val="0"/>
+          <w:color w:val="C00000"/>
+          <w:lang w:val="en-IN"/>
+        </w:rPr>
+        <w:t>docker registry username</w:t>
+      </w:r>
+      <w:r>
+        <w:rPr>
+          <w:rFonts w:hint="default" w:ascii="Sitka Subheading" w:hAnsi="Sitka Subheading" w:cs="Sitka Subheading"/>
+          <w:b/>
+          <w:bCs/>
+          <w:color w:val="C00000"/>
+          <w:lang w:val="en-IN"/>
+        </w:rPr>
+        <w:t>&gt;</w:t>
+      </w:r>
+      <w:r>
+        <w:rPr>
+          <w:rFonts w:hint="default" w:ascii="Sitka Subheading" w:hAnsi="Sitka Subheading" w:cs="Sitka Subheading"/>
+          <w:b w:val="0"/>
+          <w:bCs w:val="0"/>
+          <w:color w:val="C00000"/>
+          <w:lang w:val="en-IN"/>
+        </w:rPr>
+        <w:t xml:space="preserve">   \</w:t>
+      </w:r>
+      <w:r>
+        <w:rPr>
+          <w:rFonts w:hint="default" w:ascii="Sitka Subheading" w:hAnsi="Sitka Subheading" w:cs="Sitka Subheading"/>
+          <w:b/>
+          <w:bCs/>
+          <w:color w:val="C00000"/>
+          <w:lang w:val="en-IN"/>
+        </w:rPr>
+        <w:br w:type="textWrapping"/>
+      </w:r>
+      <w:r>
+        <w:rPr>
+          <w:rFonts w:hint="default" w:ascii="Sitka Subheading" w:hAnsi="Sitka Subheading" w:cs="Sitka Subheading"/>
+          <w:b/>
+          <w:bCs/>
+          <w:color w:val="C00000"/>
+          <w:lang w:val="en-IN"/>
+        </w:rPr>
+        <w:t>--docker-password=&lt;</w:t>
+      </w:r>
+      <w:r>
+        <w:rPr>
+          <w:rFonts w:hint="default" w:ascii="Sitka Subheading" w:hAnsi="Sitka Subheading" w:cs="Sitka Subheading"/>
+          <w:b w:val="0"/>
+          <w:bCs w:val="0"/>
+          <w:color w:val="C00000"/>
+          <w:lang w:val="en-IN"/>
+        </w:rPr>
+        <w:t>docker registry password</w:t>
+      </w:r>
+      <w:r>
+        <w:rPr>
+          <w:rFonts w:hint="default" w:ascii="Sitka Subheading" w:hAnsi="Sitka Subheading" w:cs="Sitka Subheading"/>
+          <w:b/>
+          <w:bCs/>
+          <w:color w:val="C00000"/>
+          <w:lang w:val="en-IN"/>
+        </w:rPr>
+        <w:t>&gt;</w:t>
+      </w:r>
+      <w:r>
+        <w:rPr>
+          <w:rFonts w:hint="default" w:ascii="Sitka Subheading" w:hAnsi="Sitka Subheading" w:cs="Sitka Subheading"/>
+          <w:b w:val="0"/>
+          <w:bCs w:val="0"/>
+          <w:color w:val="C00000"/>
+          <w:lang w:val="en-IN"/>
+        </w:rPr>
+        <w:t xml:space="preserve">   \</w:t>
+      </w:r>
+      <w:r>
+        <w:rPr>
+          <w:rFonts w:hint="default" w:ascii="Sitka Subheading" w:hAnsi="Sitka Subheading" w:cs="Sitka Subheading"/>
+          <w:b/>
+          <w:bCs/>
+          <w:color w:val="C00000"/>
+          <w:lang w:val="en-IN"/>
+        </w:rPr>
+        <w:br w:type="textWrapping"/>
+      </w:r>
+      <w:r>
+        <w:rPr>
+          <w:rFonts w:hint="default" w:ascii="Sitka Subheading" w:hAnsi="Sitka Subheading" w:cs="Sitka Subheading"/>
+          <w:b/>
+          <w:bCs/>
+          <w:color w:val="C00000"/>
+          <w:lang w:val="en-IN"/>
+        </w:rPr>
+        <w:t>--docker-email=&lt;</w:t>
+      </w:r>
+      <w:r>
+        <w:rPr>
+          <w:rFonts w:hint="default" w:ascii="Sitka Subheading" w:hAnsi="Sitka Subheading" w:cs="Sitka Subheading"/>
+          <w:b w:val="0"/>
+          <w:bCs w:val="0"/>
+          <w:color w:val="C00000"/>
+          <w:lang w:val="en-IN"/>
+        </w:rPr>
+        <w:t>docker registry email</w:t>
+      </w:r>
+      <w:r>
+        <w:rPr>
+          <w:rFonts w:hint="default" w:ascii="Sitka Subheading" w:hAnsi="Sitka Subheading" w:cs="Sitka Subheading"/>
+          <w:b/>
+          <w:bCs/>
+          <w:color w:val="C00000"/>
+          <w:lang w:val="en-IN"/>
+        </w:rPr>
+        <w:t>&gt;</w:t>
+      </w:r>
+      <w:r>
+        <w:rPr>
+          <w:rFonts w:hint="default" w:ascii="Sitka Subheading" w:hAnsi="Sitka Subheading" w:cs="Sitka Subheading"/>
+          <w:b w:val="0"/>
+          <w:bCs w:val="0"/>
+          <w:lang w:val="en-IN"/>
+        </w:rPr>
+        <w:t xml:space="preserve">   </w:t>
+      </w:r>
+    </w:p>
+    <w:p>
+      <w:pPr>
+        <w:numPr>
+          <w:ilvl w:val="2"/>
+          <w:numId w:val="11"/>
+        </w:numPr>
+        <w:spacing w:line="360" w:lineRule="auto"/>
+        <w:ind w:left="1260" w:leftChars="0" w:hanging="420" w:firstLineChars="0"/>
+        <w:rPr>
+          <w:rFonts w:hint="default" w:ascii="Sitka Subheading" w:hAnsi="Sitka Subheading" w:cs="Sitka Subheading"/>
+        </w:rPr>
+      </w:pPr>
+      <w:r>
+        <w:rPr>
+          <w:rFonts w:hint="default" w:ascii="Sitka Subheading" w:hAnsi="Sitka Subheading" w:cs="Sitka Subheading"/>
+        </w:rPr>
+        <w:t xml:space="preserve">docker-registry </w:t>
+      </w:r>
+      <w:r>
+        <w:rPr>
+          <w:rFonts w:hint="default" w:ascii="Sitka Subheading" w:hAnsi="Sitka Subheading" w:cs="Sitka Subheading"/>
+          <w:lang w:val="en-IN"/>
+        </w:rPr>
+        <w:t>=&gt;</w:t>
+      </w:r>
+      <w:r>
+        <w:rPr>
+          <w:rFonts w:hint="default" w:ascii="Sitka Subheading" w:hAnsi="Sitka Subheading" w:cs="Sitka Subheading"/>
+        </w:rPr>
+        <w:t xml:space="preserve"> Create a secret for use with a Docker registry</w:t>
+      </w:r>
+    </w:p>
+    <w:p>
+      <w:pPr>
+        <w:numPr>
+          <w:ilvl w:val="1"/>
+          <w:numId w:val="11"/>
+        </w:numPr>
+        <w:spacing w:line="360" w:lineRule="auto"/>
+        <w:ind w:left="840" w:leftChars="0" w:hanging="420" w:firstLineChars="0"/>
+        <w:rPr>
+          <w:rFonts w:hint="default" w:ascii="Sitka Subheading" w:hAnsi="Sitka Subheading" w:cs="Sitka Subheading"/>
+        </w:rPr>
+      </w:pPr>
+      <w:r>
+        <w:rPr>
+          <w:rFonts w:hint="default" w:ascii="Sitka Subheading" w:hAnsi="Sitka Subheading" w:cs="Sitka Subheading"/>
+        </w:rPr>
+        <w:drawing>
+          <wp:inline distT="0" distB="0" distL="114300" distR="114300">
+            <wp:extent cx="2115820" cy="660400"/>
+            <wp:effectExtent l="0" t="0" r="5080" b="0"/>
+            <wp:docPr id="8" name="Picture 1"/>
+            <wp:cNvGraphicFramePr>
+              <a:graphicFrameLocks xmlns:a="http://schemas.openxmlformats.org/drawingml/2006/main" noChangeAspect="1"/>
+            </wp:cNvGraphicFramePr>
+            <a:graphic xmlns:a="http://schemas.openxmlformats.org/drawingml/2006/main">
+              <a:graphicData uri="http://schemas.openxmlformats.org/drawingml/2006/picture">
+                <pic:pic xmlns:pic="http://schemas.openxmlformats.org/drawingml/2006/picture">
+                  <pic:nvPicPr>
+                    <pic:cNvPr id="8" name="Picture 1"/>
+                    <pic:cNvPicPr>
+                      <a:picLocks noChangeAspect="1"/>
+                    </pic:cNvPicPr>
+                  </pic:nvPicPr>
+                  <pic:blipFill>
+                    <a:blip r:embed="rId41"/>
+                    <a:stretch>
+                      <a:fillRect/>
+                    </a:stretch>
+                  </pic:blipFill>
+                  <pic:spPr>
+                    <a:xfrm>
+                      <a:off x="0" y="0"/>
+                      <a:ext cx="2115820" cy="660400"/>
+                    </a:xfrm>
+                    <a:prstGeom prst="rect">
+                      <a:avLst/>
+                    </a:prstGeom>
+                    <a:noFill/>
+                    <a:ln>
+                      <a:noFill/>
+                    </a:ln>
+                  </pic:spPr>
+                </pic:pic>
+              </a:graphicData>
+            </a:graphic>
+          </wp:inline>
+        </w:drawing>
+      </w:r>
+      <w:r>
+        <w:rPr>
+          <w:rFonts w:hint="default" w:ascii="Sitka Subheading" w:hAnsi="Sitka Subheading" w:cs="Sitka Subheading"/>
+        </w:rPr>
+        <w:br w:type="textWrapping"/>
+      </w:r>
+      <w:r>
+        <w:rPr>
+          <w:rFonts w:hint="default" w:ascii="Sitka Subheading" w:hAnsi="Sitka Subheading" w:cs="Sitka Subheading"/>
+          <w:i/>
+          <w:iCs/>
+          <w:color w:val="18605A" w:themeColor="accent5" w:themeShade="80"/>
+          <w:u w:val="single"/>
+          <w:lang w:val="en-IN"/>
+        </w:rPr>
+        <w:t>pod.spec.</w:t>
+      </w:r>
+      <w:r>
+        <w:rPr>
+          <w:rFonts w:hint="default" w:ascii="Sitka Subheading" w:hAnsi="Sitka Subheading" w:cs="Sitka Subheading"/>
+          <w:b/>
+          <w:bCs/>
+          <w:i/>
+          <w:iCs/>
+          <w:color w:val="18605A" w:themeColor="accent5" w:themeShade="80"/>
+          <w:u w:val="single"/>
+          <w:lang w:val="en-IN"/>
+        </w:rPr>
+        <w:t>imagePullSecrets</w:t>
+      </w:r>
+      <w:r>
+        <w:rPr>
+          <w:rFonts w:hint="default" w:ascii="Sitka Subheading" w:hAnsi="Sitka Subheading" w:cs="Sitka Subheading"/>
+          <w:b/>
+          <w:bCs/>
+          <w:lang w:val="en-IN"/>
+        </w:rPr>
+        <w:t xml:space="preserve"> </w:t>
+      </w:r>
+      <w:r>
+        <w:rPr>
+          <w:rFonts w:hint="default" w:ascii="Sitka Subheading" w:hAnsi="Sitka Subheading" w:cs="Sitka Subheading"/>
+          <w:lang w:val="en-IN"/>
+        </w:rPr>
+        <w:t>is a list; it’ll try one by one until it finds the required image.</w:t>
+      </w:r>
+      <w:r>
+        <w:rPr>
+          <w:rFonts w:hint="default" w:ascii="Sitka Subheading" w:hAnsi="Sitka Subheading" w:cs="Sitka Subheading"/>
+          <w:lang w:val="en-IN"/>
+        </w:rPr>
+        <w:br w:type="textWrapping"/>
+      </w:r>
+      <w:r>
+        <w:rPr>
+          <w:rFonts w:hint="default" w:ascii="Sitka Subheading" w:hAnsi="Sitka Subheading" w:cs="Sitka Subheading"/>
+          <w:lang w:val="en-IN"/>
+        </w:rPr>
+        <w:t xml:space="preserve">[ containers and imagePullSecrets: both are </w:t>
+      </w:r>
+      <w:r>
+        <w:rPr>
+          <w:rFonts w:hint="default" w:ascii="Sitka Subheading" w:hAnsi="Sitka Subheading" w:cs="Sitka Subheading"/>
+          <w:u w:val="single"/>
+          <w:lang w:val="en-IN"/>
+        </w:rPr>
+        <w:t>siblings</w:t>
+      </w:r>
+      <w:r>
+        <w:rPr>
+          <w:rFonts w:hint="default" w:ascii="Sitka Subheading" w:hAnsi="Sitka Subheading" w:cs="Sitka Subheading"/>
+          <w:lang w:val="en-IN"/>
+        </w:rPr>
+        <w:t xml:space="preserve"> ]</w:t>
+      </w:r>
+    </w:p>
+    <w:p>
+      <w:pPr>
+        <w:numPr>
+          <w:ilvl w:val="1"/>
+          <w:numId w:val="11"/>
+        </w:numPr>
+        <w:spacing w:line="360" w:lineRule="auto"/>
+        <w:ind w:left="840" w:leftChars="0" w:hanging="420" w:firstLineChars="0"/>
+        <w:rPr>
+          <w:rFonts w:hint="default" w:ascii="Sitka Subheading" w:hAnsi="Sitka Subheading" w:cs="Sitka Subheading"/>
+        </w:rPr>
+      </w:pPr>
+      <w:r>
+        <w:rPr>
+          <w:rFonts w:hint="default" w:ascii="Sitka Subheading" w:hAnsi="Sitka Subheading" w:cs="Sitka Subheading"/>
+          <w:lang w:val="en-IN"/>
+        </w:rPr>
+        <w:t xml:space="preserve">Create </w:t>
+      </w:r>
+      <w:r>
+        <w:rPr>
+          <w:rFonts w:hint="default" w:ascii="Sitka Subheading" w:hAnsi="Sitka Subheading" w:cs="Sitka Subheading"/>
+          <w:b/>
+          <w:bCs/>
+          <w:lang w:val="en-IN"/>
+        </w:rPr>
+        <w:t>secret</w:t>
+      </w:r>
+      <w:r>
+        <w:rPr>
+          <w:rFonts w:hint="default" w:ascii="Sitka Subheading" w:hAnsi="Sitka Subheading" w:cs="Sitka Subheading"/>
+          <w:b w:val="0"/>
+          <w:bCs w:val="0"/>
+          <w:lang w:val="en-IN"/>
+        </w:rPr>
+        <w:t xml:space="preserve"> from yaml</w:t>
+      </w:r>
+      <w:r>
+        <w:rPr>
+          <w:rFonts w:hint="default" w:ascii="Sitka Subheading" w:hAnsi="Sitka Subheading" w:cs="Sitka Subheading"/>
+          <w:b w:val="0"/>
+          <w:bCs w:val="0"/>
+          <w:lang w:val="en-IN"/>
+        </w:rPr>
+        <w:br w:type="textWrapping"/>
+      </w:r>
+      <w:r>
+        <w:rPr>
+          <w:rFonts w:hint="default" w:ascii="Sitka Subheading" w:hAnsi="Sitka Subheading" w:cs="Sitka Subheading"/>
+        </w:rPr>
+        <w:drawing>
+          <wp:inline distT="0" distB="0" distL="114300" distR="114300">
+            <wp:extent cx="2101850" cy="971550"/>
+            <wp:effectExtent l="0" t="0" r="6350" b="6350"/>
+            <wp:docPr id="14" name="Picture 2"/>
+            <wp:cNvGraphicFramePr>
+              <a:graphicFrameLocks xmlns:a="http://schemas.openxmlformats.org/drawingml/2006/main" noChangeAspect="1"/>
+            </wp:cNvGraphicFramePr>
+            <a:graphic xmlns:a="http://schemas.openxmlformats.org/drawingml/2006/main">
+              <a:graphicData uri="http://schemas.openxmlformats.org/drawingml/2006/picture">
+                <pic:pic xmlns:pic="http://schemas.openxmlformats.org/drawingml/2006/picture">
+                  <pic:nvPicPr>
+                    <pic:cNvPr id="14" name="Picture 2"/>
+                    <pic:cNvPicPr>
+                      <a:picLocks noChangeAspect="1"/>
+                    </pic:cNvPicPr>
+                  </pic:nvPicPr>
+                  <pic:blipFill>
+                    <a:blip r:embed="rId42"/>
+                    <a:stretch>
+                      <a:fillRect/>
+                    </a:stretch>
+                  </pic:blipFill>
+                  <pic:spPr>
+                    <a:xfrm>
+                      <a:off x="0" y="0"/>
+                      <a:ext cx="2101850" cy="971550"/>
+                    </a:xfrm>
+                    <a:prstGeom prst="rect">
+                      <a:avLst/>
+                    </a:prstGeom>
+                    <a:noFill/>
+                    <a:ln>
+                      <a:noFill/>
+                    </a:ln>
+                  </pic:spPr>
+                </pic:pic>
+              </a:graphicData>
+            </a:graphic>
+          </wp:inline>
+        </w:drawing>
+      </w:r>
+      <w:r>
+        <w:rPr>
+          <w:rFonts w:hint="default" w:ascii="Sitka Subheading" w:hAnsi="Sitka Subheading" w:cs="Sitka Subheading"/>
+          <w:lang w:val="en-IN"/>
+        </w:rPr>
+        <w:t xml:space="preserve">  [ yaml file looks something like this ]</w:t>
+      </w:r>
+    </w:p>
+    <w:p>
+      <w:pPr>
+        <w:numPr>
+          <w:ilvl w:val="2"/>
+          <w:numId w:val="11"/>
+        </w:numPr>
+        <w:spacing w:line="360" w:lineRule="auto"/>
+        <w:ind w:left="1260" w:leftChars="0" w:hanging="420" w:firstLineChars="0"/>
+        <w:rPr>
+          <w:rFonts w:hint="default" w:ascii="Sitka Subheading" w:hAnsi="Sitka Subheading" w:cs="Sitka Subheading"/>
+        </w:rPr>
+      </w:pPr>
+      <w:r>
+        <w:rPr>
+          <w:rFonts w:hint="default" w:ascii="Sitka Subheading" w:hAnsi="Sitka Subheading" w:cs="Sitka Subheading"/>
+          <w:i/>
+          <w:iCs/>
+          <w:color w:val="18605A" w:themeColor="accent5" w:themeShade="80"/>
+          <w:u w:val="single"/>
+          <w:lang w:val="en-IN"/>
+        </w:rPr>
+        <w:t>secret.data.</w:t>
+      </w:r>
+      <w:r>
+        <w:rPr>
+          <w:rFonts w:hint="default" w:ascii="Sitka Subheading" w:hAnsi="Sitka Subheading" w:cs="Sitka Subheading"/>
+          <w:b/>
+          <w:bCs/>
+          <w:i/>
+          <w:iCs/>
+          <w:color w:val="18605A" w:themeColor="accent5" w:themeShade="80"/>
+          <w:u w:val="single"/>
+          <w:shd w:val="clear" w:color="FFFFFF" w:fill="D9D9D9"/>
+          <w:lang w:val="en-IN"/>
+        </w:rPr>
+        <w:t>\.</w:t>
+      </w:r>
+      <w:r>
+        <w:rPr>
+          <w:rFonts w:hint="default" w:ascii="Sitka Subheading" w:hAnsi="Sitka Subheading" w:cs="Sitka Subheading"/>
+          <w:i/>
+          <w:iCs/>
+          <w:color w:val="18605A" w:themeColor="accent5" w:themeShade="80"/>
+          <w:u w:val="single"/>
+          <w:lang w:val="en-IN"/>
+        </w:rPr>
+        <w:t>dockerconfigjson</w:t>
+      </w:r>
+      <w:r>
+        <w:rPr>
+          <w:rFonts w:hint="default" w:ascii="Sitka Subheading" w:hAnsi="Sitka Subheading" w:cs="Sitka Subheading"/>
+          <w:i w:val="0"/>
+          <w:iCs w:val="0"/>
+          <w:lang w:val="en-IN"/>
+        </w:rPr>
+        <w:t xml:space="preserve">   (</w:t>
+      </w:r>
+      <w:r>
+        <w:rPr>
+          <w:rFonts w:hint="default" w:ascii="Sitka Subheading" w:hAnsi="Sitka Subheading" w:cs="Sitka Subheading"/>
+          <w:b/>
+          <w:bCs/>
+          <w:i w:val="0"/>
+          <w:iCs w:val="0"/>
+          <w:shd w:val="clear" w:color="FFFFFF" w:fill="D9D9D9"/>
+          <w:lang w:val="en-IN"/>
+        </w:rPr>
+        <w:t>\.</w:t>
+      </w:r>
+      <w:r>
+        <w:rPr>
+          <w:rFonts w:hint="default" w:ascii="Sitka Subheading" w:hAnsi="Sitka Subheading" w:cs="Sitka Subheading"/>
+          <w:i w:val="0"/>
+          <w:iCs w:val="0"/>
+          <w:lang w:val="en-IN"/>
+        </w:rPr>
+        <w:t xml:space="preserve"> means to keep </w:t>
+      </w:r>
+      <w:r>
+        <w:rPr>
+          <w:rFonts w:hint="default" w:ascii="Sitka Subheading" w:hAnsi="Sitka Subheading" w:cs="Sitka Subheading"/>
+          <w:b/>
+          <w:bCs/>
+          <w:i w:val="0"/>
+          <w:iCs w:val="0"/>
+          <w:shd w:val="clear" w:color="FFFFFF" w:fill="D9D9D9"/>
+          <w:lang w:val="en-IN"/>
+        </w:rPr>
+        <w:t>.</w:t>
+      </w:r>
+      <w:r>
+        <w:rPr>
+          <w:rFonts w:hint="default" w:ascii="Sitka Subheading" w:hAnsi="Sitka Subheading" w:cs="Sitka Subheading"/>
+          <w:i w:val="0"/>
+          <w:iCs w:val="0"/>
+          <w:lang w:val="en-IN"/>
+        </w:rPr>
+        <w:t xml:space="preserve"> as a string)</w:t>
+      </w:r>
+    </w:p>
+    <w:p>
+      <w:pPr>
+        <w:numPr>
+          <w:ilvl w:val="2"/>
+          <w:numId w:val="11"/>
+        </w:numPr>
+        <w:spacing w:line="360" w:lineRule="auto"/>
+        <w:ind w:left="1260" w:leftChars="0" w:hanging="420" w:firstLineChars="0"/>
+        <w:rPr>
+          <w:rFonts w:hint="default" w:ascii="Sitka Subheading" w:hAnsi="Sitka Subheading" w:cs="Sitka Subheading"/>
+        </w:rPr>
+      </w:pPr>
+      <w:r>
+        <w:rPr>
+          <w:rFonts w:hint="default" w:ascii="Sitka Subheading" w:hAnsi="Sitka Subheading" w:cs="Sitka Subheading"/>
+          <w:i w:val="0"/>
+          <w:iCs w:val="0"/>
+          <w:lang w:val="en-IN"/>
+        </w:rPr>
+        <w:t xml:space="preserve">That is </w:t>
+      </w:r>
+      <w:r>
+        <w:rPr>
+          <w:rFonts w:hint="default" w:ascii="Sitka Subheading" w:hAnsi="Sitka Subheading" w:cs="Sitka Subheading"/>
+          <w:b/>
+          <w:bCs/>
+          <w:i w:val="0"/>
+          <w:iCs w:val="0"/>
+          <w:lang w:val="en-IN"/>
+        </w:rPr>
+        <w:t>base64</w:t>
+      </w:r>
+      <w:r>
+        <w:rPr>
+          <w:rFonts w:hint="default" w:ascii="Sitka Subheading" w:hAnsi="Sitka Subheading" w:cs="Sitka Subheading"/>
+          <w:b w:val="0"/>
+          <w:bCs w:val="0"/>
+          <w:i w:val="0"/>
+          <w:iCs w:val="0"/>
+          <w:lang w:val="en-IN"/>
+        </w:rPr>
+        <w:t xml:space="preserve"> encoded.</w:t>
+      </w:r>
+      <w:r>
+        <w:rPr>
+          <w:rFonts w:hint="default" w:ascii="Sitka Subheading" w:hAnsi="Sitka Subheading" w:cs="Sitka Subheading"/>
+          <w:b w:val="0"/>
+          <w:bCs w:val="0"/>
+          <w:i w:val="0"/>
+          <w:iCs w:val="0"/>
+          <w:lang w:val="en-IN"/>
+        </w:rPr>
+        <w:br w:type="textWrapping"/>
+      </w:r>
+      <w:r>
+        <w:rPr>
+          <w:rFonts w:hint="default" w:ascii="Sitka Subheading" w:hAnsi="Sitka Subheading" w:cs="Sitka Subheading"/>
+          <w:b w:val="0"/>
+          <w:bCs w:val="0"/>
+          <w:i w:val="0"/>
+          <w:iCs w:val="0"/>
+          <w:lang w:val="en-IN"/>
+        </w:rPr>
+        <w:t>On decoding that:</w:t>
+      </w:r>
+      <w:r>
+        <w:rPr>
+          <w:rFonts w:hint="default" w:ascii="Sitka Subheading" w:hAnsi="Sitka Subheading" w:cs="Sitka Subheading"/>
+          <w:b w:val="0"/>
+          <w:bCs w:val="0"/>
+          <w:i w:val="0"/>
+          <w:iCs w:val="0"/>
+          <w:lang w:val="en-IN"/>
+        </w:rPr>
+        <w:br w:type="textWrapping"/>
+      </w:r>
+      <w:r>
+        <w:rPr>
+          <w:rFonts w:hint="default" w:ascii="Sitka Subheading" w:hAnsi="Sitka Subheading" w:cs="Sitka Subheading"/>
+        </w:rPr>
+        <w:drawing>
+          <wp:inline distT="0" distB="0" distL="114300" distR="114300">
+            <wp:extent cx="3187700" cy="1511300"/>
+            <wp:effectExtent l="0" t="0" r="0" b="0"/>
+            <wp:docPr id="17" name="Picture 3"/>
+            <wp:cNvGraphicFramePr>
+              <a:graphicFrameLocks xmlns:a="http://schemas.openxmlformats.org/drawingml/2006/main" noChangeAspect="1"/>
+            </wp:cNvGraphicFramePr>
+            <a:graphic xmlns:a="http://schemas.openxmlformats.org/drawingml/2006/main">
+              <a:graphicData uri="http://schemas.openxmlformats.org/drawingml/2006/picture">
+                <pic:pic xmlns:pic="http://schemas.openxmlformats.org/drawingml/2006/picture">
+                  <pic:nvPicPr>
+                    <pic:cNvPr id="17" name="Picture 3"/>
+                    <pic:cNvPicPr>
+                      <a:picLocks noChangeAspect="1"/>
+                    </pic:cNvPicPr>
+                  </pic:nvPicPr>
+                  <pic:blipFill>
+                    <a:blip r:embed="rId43"/>
+                    <a:stretch>
+                      <a:fillRect/>
+                    </a:stretch>
+                  </pic:blipFill>
+                  <pic:spPr>
+                    <a:xfrm>
+                      <a:off x="0" y="0"/>
+                      <a:ext cx="3187700" cy="1511300"/>
+                    </a:xfrm>
+                    <a:prstGeom prst="rect">
+                      <a:avLst/>
+                    </a:prstGeom>
+                    <a:noFill/>
+                    <a:ln>
+                      <a:noFill/>
+                    </a:ln>
+                  </pic:spPr>
+                </pic:pic>
+              </a:graphicData>
+            </a:graphic>
+          </wp:inline>
+        </w:drawing>
+      </w:r>
+      <w:r>
+        <w:rPr>
+          <w:rFonts w:hint="default" w:ascii="Sitka Subheading" w:hAnsi="Sitka Subheading" w:cs="Sitka Subheading"/>
+          <w:lang w:val="en-IN"/>
+        </w:rPr>
+        <w:t xml:space="preserve"> [ something like this will come ]</w:t>
+      </w:r>
+    </w:p>
+    <w:p>
+      <w:pPr>
+        <w:numPr>
+          <w:ilvl w:val="1"/>
+          <w:numId w:val="11"/>
+        </w:numPr>
+        <w:spacing w:line="360" w:lineRule="auto"/>
+        <w:ind w:left="840" w:leftChars="0" w:hanging="420" w:firstLineChars="0"/>
+        <w:rPr>
+          <w:rFonts w:hint="default" w:ascii="Sitka Subheading" w:hAnsi="Sitka Subheading" w:cs="Sitka Subheading"/>
+        </w:rPr>
+      </w:pPr>
+      <w:r>
+        <w:rPr>
+          <w:rFonts w:hint="default" w:ascii="Sitka Subheading" w:hAnsi="Sitka Subheading" w:cs="Sitka Subheading"/>
+        </w:rPr>
+        <w:fldChar w:fldCharType="begin"/>
+      </w:r>
+      <w:r>
+        <w:rPr>
+          <w:rFonts w:hint="default" w:ascii="Sitka Subheading" w:hAnsi="Sitka Subheading" w:cs="Sitka Subheading"/>
+        </w:rPr>
+        <w:instrText xml:space="preserve"> HYPERLINK "https://kubernetes.io/docs/tasks/configure-pod-container/pull-image-private-registry/" \l "registry-secret-existing-credentials" </w:instrText>
+      </w:r>
+      <w:r>
+        <w:rPr>
+          <w:rFonts w:hint="default" w:ascii="Sitka Subheading" w:hAnsi="Sitka Subheading" w:cs="Sitka Subheading"/>
+        </w:rPr>
+        <w:fldChar w:fldCharType="separate"/>
+      </w:r>
+      <w:r>
+        <w:rPr>
+          <w:rStyle w:val="51"/>
+          <w:rFonts w:hint="default" w:ascii="Sitka Subheading" w:hAnsi="Sitka Subheading" w:cs="Sitka Subheading"/>
+        </w:rPr>
+        <w:t>official docs</w:t>
+      </w:r>
+      <w:r>
+        <w:rPr>
+          <w:rFonts w:hint="default" w:ascii="Sitka Subheading" w:hAnsi="Sitka Subheading" w:cs="Sitka Subheading"/>
+        </w:rPr>
+        <w:fldChar w:fldCharType="end"/>
+      </w:r>
     </w:p>
     <w:p>
       <w:pPr>
@@ -20362,16 +21528,540 @@
           <w:numId w:val="11"/>
         </w:numPr>
         <w:spacing w:line="360" w:lineRule="auto"/>
-        <w:rPr>
-          <w:rFonts w:hint="default" w:ascii="Sitka Subheading" w:hAnsi="Sitka Subheading" w:cs="Sitka Subheading"/>
-        </w:rPr>
-      </w:pPr>
-      <w:r>
-        <w:rPr>
-          <w:rFonts w:hint="default" w:ascii="Sitka Subheading" w:hAnsi="Sitka Subheading" w:cs="Sitka Subheading"/>
-          <w:lang w:val="en-IN"/>
-        </w:rPr>
-        <w:t>F</w:t>
+        <w:ind w:left="420" w:leftChars="0" w:hanging="420" w:firstLineChars="0"/>
+        <w:rPr>
+          <w:rFonts w:hint="default" w:ascii="Sitka Subheading" w:hAnsi="Sitka Subheading" w:cs="Sitka Subheading"/>
+        </w:rPr>
+      </w:pPr>
+      <w:r>
+        <w:rPr>
+          <w:rFonts w:hint="default" w:ascii="Sitka Subheading" w:hAnsi="Sitka Subheading" w:cs="Sitka Subheading"/>
+          <w:lang w:val="en-IN"/>
+        </w:rPr>
+        <w:t>Security Context</w:t>
+      </w:r>
+    </w:p>
+    <w:p>
+      <w:pPr>
+        <w:numPr>
+          <w:ilvl w:val="1"/>
+          <w:numId w:val="11"/>
+        </w:numPr>
+        <w:spacing w:line="360" w:lineRule="auto"/>
+        <w:ind w:left="840" w:leftChars="0" w:hanging="420" w:firstLineChars="0"/>
+        <w:rPr>
+          <w:rFonts w:hint="default" w:ascii="Sitka Subheading" w:hAnsi="Sitka Subheading" w:cs="Sitka Subheading"/>
+        </w:rPr>
+      </w:pPr>
+      <w:r>
+        <w:rPr>
+          <w:rFonts w:hint="default" w:ascii="Sitka Subheading" w:hAnsi="Sitka Subheading" w:cs="Sitka Subheading"/>
+          <w:lang w:val="en-IN"/>
+        </w:rPr>
+        <w:t xml:space="preserve">Docker containers default user: </w:t>
+      </w:r>
+      <w:r>
+        <w:rPr>
+          <w:rFonts w:hint="default" w:ascii="Sitka Subheading" w:hAnsi="Sitka Subheading" w:cs="Sitka Subheading"/>
+          <w:b/>
+          <w:bCs/>
+          <w:lang w:val="en-IN"/>
+        </w:rPr>
+        <w:t>root</w:t>
+      </w:r>
+      <w:r>
+        <w:rPr>
+          <w:rFonts w:hint="default" w:ascii="Sitka Subheading" w:hAnsi="Sitka Subheading" w:cs="Sitka Subheading"/>
+          <w:b w:val="0"/>
+          <w:bCs w:val="0"/>
+          <w:lang w:val="en-IN"/>
+        </w:rPr>
+        <w:t xml:space="preserve">  [root’s user ID: 0 ]</w:t>
+      </w:r>
+      <w:r>
+        <w:rPr>
+          <w:rFonts w:hint="default" w:ascii="Sitka Subheading" w:hAnsi="Sitka Subheading" w:cs="Sitka Subheading"/>
+          <w:b w:val="0"/>
+          <w:bCs w:val="0"/>
+          <w:lang w:val="en-IN"/>
+        </w:rPr>
+        <w:br w:type="textWrapping"/>
+      </w:r>
+      <w:r>
+        <w:rPr>
+          <w:rFonts w:hint="default" w:ascii="Sitka Subheading" w:hAnsi="Sitka Subheading" w:cs="Sitka Subheading"/>
+          <w:b w:val="0"/>
+          <w:bCs w:val="0"/>
+          <w:lang w:val="en-IN"/>
+        </w:rPr>
+        <w:t xml:space="preserve">even </w:t>
+      </w:r>
+      <w:r>
+        <w:rPr>
+          <w:rFonts w:hint="default" w:ascii="Sitka Subheading" w:hAnsi="Sitka Subheading" w:cs="Sitka Subheading"/>
+          <w:b w:val="0"/>
+          <w:bCs w:val="0"/>
+          <w:i/>
+          <w:iCs/>
+          <w:lang w:val="en-IN"/>
+        </w:rPr>
+        <w:t>root</w:t>
+      </w:r>
+      <w:r>
+        <w:rPr>
+          <w:rFonts w:hint="default" w:ascii="Sitka Subheading" w:hAnsi="Sitka Subheading" w:cs="Sitka Subheading"/>
+          <w:b w:val="0"/>
+          <w:bCs w:val="0"/>
+          <w:i w:val="0"/>
+          <w:iCs w:val="0"/>
+          <w:lang w:val="en-IN"/>
+        </w:rPr>
+        <w:t xml:space="preserve"> user doesn’t have all capabilities. You need to specifically add.</w:t>
+      </w:r>
+    </w:p>
+    <w:p>
+      <w:pPr>
+        <w:numPr>
+          <w:ilvl w:val="1"/>
+          <w:numId w:val="11"/>
+        </w:numPr>
+        <w:spacing w:line="360" w:lineRule="auto"/>
+        <w:ind w:left="840" w:leftChars="0" w:hanging="420" w:firstLineChars="0"/>
+        <w:rPr>
+          <w:rFonts w:hint="default" w:ascii="Sitka Subheading" w:hAnsi="Sitka Subheading" w:cs="Sitka Subheading"/>
+        </w:rPr>
+      </w:pPr>
+      <w:r>
+        <w:rPr>
+          <w:rFonts w:hint="default" w:ascii="Sitka Subheading" w:hAnsi="Sitka Subheading" w:cs="Sitka Subheading"/>
+          <w:b/>
+          <w:bCs/>
+          <w:color w:val="851321" w:themeColor="accent6" w:themeShade="80"/>
+          <w:lang w:val="en-IN"/>
+        </w:rPr>
+        <w:t>docker run --user=&lt;</w:t>
+      </w:r>
+      <w:r>
+        <w:rPr>
+          <w:rFonts w:hint="default" w:ascii="Sitka Subheading" w:hAnsi="Sitka Subheading" w:cs="Sitka Subheading"/>
+          <w:b w:val="0"/>
+          <w:bCs w:val="0"/>
+          <w:color w:val="851321" w:themeColor="accent6" w:themeShade="80"/>
+          <w:lang w:val="en-IN"/>
+        </w:rPr>
+        <w:t>user id</w:t>
+      </w:r>
+      <w:r>
+        <w:rPr>
+          <w:rFonts w:hint="default" w:ascii="Sitka Subheading" w:hAnsi="Sitka Subheading" w:cs="Sitka Subheading"/>
+          <w:b/>
+          <w:bCs/>
+          <w:color w:val="851321" w:themeColor="accent6" w:themeShade="80"/>
+          <w:lang w:val="en-IN"/>
+        </w:rPr>
+        <w:t>&gt; &lt;</w:t>
+      </w:r>
+      <w:r>
+        <w:rPr>
+          <w:rFonts w:hint="default" w:ascii="Sitka Subheading" w:hAnsi="Sitka Subheading" w:cs="Sitka Subheading"/>
+          <w:b w:val="0"/>
+          <w:bCs w:val="0"/>
+          <w:color w:val="851321" w:themeColor="accent6" w:themeShade="80"/>
+          <w:lang w:val="en-IN"/>
+        </w:rPr>
+        <w:t>image name</w:t>
+      </w:r>
+      <w:r>
+        <w:rPr>
+          <w:rFonts w:hint="default" w:ascii="Sitka Subheading" w:hAnsi="Sitka Subheading" w:cs="Sitka Subheading"/>
+          <w:b/>
+          <w:bCs/>
+          <w:color w:val="851321" w:themeColor="accent6" w:themeShade="80"/>
+          <w:lang w:val="en-IN"/>
+        </w:rPr>
+        <w:t>&gt;</w:t>
+      </w:r>
+      <w:r>
+        <w:rPr>
+          <w:rFonts w:hint="default" w:ascii="Sitka Subheading" w:hAnsi="Sitka Subheading" w:cs="Sitka Subheading"/>
+          <w:b w:val="0"/>
+          <w:bCs w:val="0"/>
+          <w:lang w:val="en-IN"/>
+        </w:rPr>
+        <w:t xml:space="preserve">  [ user ID will be given ]</w:t>
+      </w:r>
+      <w:r>
+        <w:rPr>
+          <w:rFonts w:hint="default" w:ascii="Sitka Subheading" w:hAnsi="Sitka Subheading" w:cs="Sitka Subheading"/>
+          <w:b w:val="0"/>
+          <w:bCs w:val="0"/>
+          <w:lang w:val="en-IN"/>
+        </w:rPr>
+        <w:br w:type="textWrapping"/>
+      </w:r>
+      <w:r>
+        <w:rPr>
+          <w:rFonts w:hint="default" w:ascii="Sitka Subheading" w:hAnsi="Sitka Subheading" w:cs="Sitka Subheading"/>
+          <w:b/>
+          <w:bCs/>
+          <w:color w:val="851321" w:themeColor="accent6" w:themeShade="80"/>
+          <w:lang w:val="en-IN"/>
+        </w:rPr>
+        <w:t>docker run --cap-add &lt;</w:t>
+      </w:r>
+      <w:r>
+        <w:rPr>
+          <w:rFonts w:hint="default" w:ascii="Sitka Subheading" w:hAnsi="Sitka Subheading" w:cs="Sitka Subheading"/>
+          <w:b w:val="0"/>
+          <w:bCs w:val="0"/>
+          <w:color w:val="851321" w:themeColor="accent6" w:themeShade="80"/>
+          <w:lang w:val="en-IN"/>
+        </w:rPr>
+        <w:t>capability name</w:t>
+      </w:r>
+      <w:r>
+        <w:rPr>
+          <w:rFonts w:hint="default" w:ascii="Sitka Subheading" w:hAnsi="Sitka Subheading" w:cs="Sitka Subheading"/>
+          <w:b/>
+          <w:bCs/>
+          <w:color w:val="851321" w:themeColor="accent6" w:themeShade="80"/>
+          <w:lang w:val="en-IN"/>
+        </w:rPr>
+        <w:t>&gt; &lt;</w:t>
+      </w:r>
+      <w:r>
+        <w:rPr>
+          <w:rFonts w:hint="default" w:ascii="Sitka Subheading" w:hAnsi="Sitka Subheading" w:cs="Sitka Subheading"/>
+          <w:b w:val="0"/>
+          <w:bCs w:val="0"/>
+          <w:color w:val="851321" w:themeColor="accent6" w:themeShade="80"/>
+          <w:lang w:val="en-IN"/>
+        </w:rPr>
+        <w:t>image name</w:t>
+      </w:r>
+      <w:r>
+        <w:rPr>
+          <w:rFonts w:hint="default" w:ascii="Sitka Subheading" w:hAnsi="Sitka Subheading" w:cs="Sitka Subheading"/>
+          <w:b/>
+          <w:bCs/>
+          <w:color w:val="851321" w:themeColor="accent6" w:themeShade="80"/>
+          <w:lang w:val="en-IN"/>
+        </w:rPr>
+        <w:t xml:space="preserve">&gt; </w:t>
+      </w:r>
+      <w:r>
+        <w:rPr>
+          <w:rFonts w:hint="default" w:ascii="Sitka Subheading" w:hAnsi="Sitka Subheading" w:cs="Sitka Subheading"/>
+          <w:b w:val="0"/>
+          <w:bCs w:val="0"/>
+          <w:lang w:val="en-IN"/>
+        </w:rPr>
+        <w:t>[add capability]</w:t>
+      </w:r>
+    </w:p>
+    <w:p>
+      <w:pPr>
+        <w:numPr>
+          <w:ilvl w:val="2"/>
+          <w:numId w:val="11"/>
+        </w:numPr>
+        <w:spacing w:line="360" w:lineRule="auto"/>
+        <w:ind w:left="1260" w:leftChars="0" w:hanging="420" w:firstLineChars="0"/>
+        <w:rPr>
+          <w:rFonts w:hint="default" w:ascii="Sitka Subheading" w:hAnsi="Sitka Subheading" w:cs="Sitka Subheading"/>
+        </w:rPr>
+      </w:pPr>
+      <w:r>
+        <w:rPr>
+          <w:rFonts w:hint="default" w:ascii="Sitka Subheading" w:hAnsi="Sitka Subheading" w:cs="Sitka Subheading"/>
+        </w:rPr>
+        <w:drawing>
+          <wp:inline distT="0" distB="0" distL="114300" distR="114300">
+            <wp:extent cx="1938020" cy="760730"/>
+            <wp:effectExtent l="0" t="0" r="5080" b="1270"/>
+            <wp:docPr id="206" name="Picture 39"/>
+            <wp:cNvGraphicFramePr>
+              <a:graphicFrameLocks xmlns:a="http://schemas.openxmlformats.org/drawingml/2006/main" noChangeAspect="1"/>
+            </wp:cNvGraphicFramePr>
+            <a:graphic xmlns:a="http://schemas.openxmlformats.org/drawingml/2006/main">
+              <a:graphicData uri="http://schemas.openxmlformats.org/drawingml/2006/picture">
+                <pic:pic xmlns:pic="http://schemas.openxmlformats.org/drawingml/2006/picture">
+                  <pic:nvPicPr>
+                    <pic:cNvPr id="206" name="Picture 39"/>
+                    <pic:cNvPicPr>
+                      <a:picLocks noChangeAspect="1"/>
+                    </pic:cNvPicPr>
+                  </pic:nvPicPr>
+                  <pic:blipFill>
+                    <a:blip r:embed="rId44"/>
+                    <a:stretch>
+                      <a:fillRect/>
+                    </a:stretch>
+                  </pic:blipFill>
+                  <pic:spPr>
+                    <a:xfrm>
+                      <a:off x="0" y="0"/>
+                      <a:ext cx="1938020" cy="760730"/>
+                    </a:xfrm>
+                    <a:prstGeom prst="rect">
+                      <a:avLst/>
+                    </a:prstGeom>
+                    <a:noFill/>
+                    <a:ln>
+                      <a:noFill/>
+                    </a:ln>
+                  </pic:spPr>
+                </pic:pic>
+              </a:graphicData>
+            </a:graphic>
+          </wp:inline>
+        </w:drawing>
+      </w:r>
+    </w:p>
+    <w:p>
+      <w:pPr>
+        <w:numPr>
+          <w:ilvl w:val="1"/>
+          <w:numId w:val="11"/>
+        </w:numPr>
+        <w:spacing w:line="360" w:lineRule="auto"/>
+        <w:ind w:left="840" w:leftChars="0" w:hanging="420" w:firstLineChars="0"/>
+        <w:rPr>
+          <w:rFonts w:hint="default" w:ascii="Sitka Subheading" w:hAnsi="Sitka Subheading" w:cs="Sitka Subheading"/>
+        </w:rPr>
+      </w:pPr>
+      <w:r>
+        <w:rPr>
+          <w:rFonts w:hint="default" w:ascii="Sitka Subheading" w:hAnsi="Sitka Subheading" w:cs="Sitka Subheading"/>
+          <w:lang w:val="en-IN"/>
+        </w:rPr>
+        <w:t xml:space="preserve">In kubernetes, either you can define these in </w:t>
+      </w:r>
+      <w:r>
+        <w:rPr>
+          <w:rFonts w:hint="default" w:ascii="Sitka Subheading" w:hAnsi="Sitka Subheading" w:cs="Sitka Subheading"/>
+          <w:b/>
+          <w:bCs/>
+          <w:i/>
+          <w:iCs/>
+          <w:lang w:val="en-IN"/>
+        </w:rPr>
+        <w:t>pod level</w:t>
+      </w:r>
+      <w:r>
+        <w:rPr>
+          <w:rFonts w:hint="default" w:ascii="Sitka Subheading" w:hAnsi="Sitka Subheading" w:cs="Sitka Subheading"/>
+          <w:b w:val="0"/>
+          <w:bCs w:val="0"/>
+          <w:i w:val="0"/>
+          <w:iCs w:val="0"/>
+          <w:lang w:val="en-IN"/>
+        </w:rPr>
+        <w:t xml:space="preserve"> or </w:t>
+      </w:r>
+      <w:r>
+        <w:rPr>
+          <w:rFonts w:hint="default" w:ascii="Sitka Subheading" w:hAnsi="Sitka Subheading" w:cs="Sitka Subheading"/>
+          <w:b/>
+          <w:bCs/>
+          <w:i/>
+          <w:iCs/>
+          <w:lang w:val="en-IN"/>
+        </w:rPr>
+        <w:t>container level</w:t>
+      </w:r>
+      <w:r>
+        <w:rPr>
+          <w:rFonts w:hint="default" w:ascii="Sitka Subheading" w:hAnsi="Sitka Subheading" w:cs="Sitka Subheading"/>
+          <w:b w:val="0"/>
+          <w:bCs w:val="0"/>
+          <w:i w:val="0"/>
+          <w:iCs w:val="0"/>
+          <w:lang w:val="en-IN"/>
+        </w:rPr>
+        <w:t>.</w:t>
+      </w:r>
+      <w:r>
+        <w:rPr>
+          <w:rFonts w:hint="default" w:ascii="Sitka Subheading" w:hAnsi="Sitka Subheading" w:cs="Sitka Subheading"/>
+          <w:b w:val="0"/>
+          <w:bCs w:val="0"/>
+          <w:i w:val="0"/>
+          <w:iCs w:val="0"/>
+          <w:lang w:val="en-IN"/>
+        </w:rPr>
+        <w:br w:type="textWrapping"/>
+      </w:r>
+      <w:r>
+        <w:rPr>
+          <w:rFonts w:hint="default" w:ascii="Sitka Subheading" w:hAnsi="Sitka Subheading" w:cs="Sitka Subheading"/>
+          <w:b w:val="0"/>
+          <w:bCs w:val="0"/>
+          <w:i w:val="0"/>
+          <w:iCs w:val="0"/>
+          <w:lang w:val="en-IN"/>
+        </w:rPr>
+        <w:t xml:space="preserve">Pod level: </w:t>
+      </w:r>
+      <w:r>
+        <w:rPr>
+          <w:rFonts w:hint="default" w:ascii="Sitka Subheading" w:hAnsi="Sitka Subheading" w:cs="Sitka Subheading"/>
+          <w:b w:val="0"/>
+          <w:bCs w:val="0"/>
+          <w:i/>
+          <w:iCs/>
+          <w:color w:val="18605A" w:themeColor="accent5" w:themeShade="80"/>
+          <w:u w:val="single"/>
+          <w:lang w:val="en-IN"/>
+        </w:rPr>
+        <w:t>pod.spec.</w:t>
+      </w:r>
+      <w:r>
+        <w:rPr>
+          <w:rFonts w:hint="default" w:ascii="Sitka Subheading" w:hAnsi="Sitka Subheading" w:cs="Sitka Subheading"/>
+          <w:b/>
+          <w:bCs/>
+          <w:i/>
+          <w:iCs/>
+          <w:color w:val="18605A" w:themeColor="accent5" w:themeShade="80"/>
+          <w:u w:val="single"/>
+          <w:lang w:val="en-IN"/>
+        </w:rPr>
+        <w:t>securityContext</w:t>
+      </w:r>
+      <w:r>
+        <w:rPr>
+          <w:rFonts w:hint="default" w:ascii="Sitka Subheading" w:hAnsi="Sitka Subheading" w:cs="Sitka Subheading"/>
+          <w:b w:val="0"/>
+          <w:bCs w:val="0"/>
+          <w:i w:val="0"/>
+          <w:iCs w:val="0"/>
+          <w:u w:val="none"/>
+          <w:lang w:val="en-IN"/>
+        </w:rPr>
+        <w:t xml:space="preserve">  [ write the configuration here ]</w:t>
+      </w:r>
+      <w:r>
+        <w:rPr>
+          <w:rFonts w:hint="default" w:ascii="Sitka Subheading" w:hAnsi="Sitka Subheading" w:cs="Sitka Subheading"/>
+          <w:b w:val="0"/>
+          <w:bCs w:val="0"/>
+          <w:i w:val="0"/>
+          <w:iCs w:val="0"/>
+          <w:u w:val="none"/>
+          <w:lang w:val="en-IN"/>
+        </w:rPr>
+        <w:br w:type="textWrapping"/>
+      </w:r>
+      <w:r>
+        <w:rPr>
+          <w:rFonts w:hint="default" w:ascii="Sitka Subheading" w:hAnsi="Sitka Subheading" w:cs="Sitka Subheading"/>
+          <w:b w:val="0"/>
+          <w:bCs w:val="0"/>
+          <w:i w:val="0"/>
+          <w:iCs w:val="0"/>
+          <w:u w:val="none"/>
+          <w:lang w:val="en-IN"/>
+        </w:rPr>
+        <w:t xml:space="preserve">Container level: </w:t>
+      </w:r>
+      <w:r>
+        <w:rPr>
+          <w:rFonts w:hint="default" w:ascii="Sitka Subheading" w:hAnsi="Sitka Subheading" w:cs="Sitka Subheading"/>
+          <w:b w:val="0"/>
+          <w:bCs w:val="0"/>
+          <w:i/>
+          <w:iCs/>
+          <w:color w:val="18605A" w:themeColor="accent5" w:themeShade="80"/>
+          <w:u w:val="single"/>
+          <w:lang w:val="en-IN"/>
+        </w:rPr>
+        <w:t>pod.spec.containers[*].</w:t>
+      </w:r>
+      <w:r>
+        <w:rPr>
+          <w:rFonts w:hint="default" w:ascii="Sitka Subheading" w:hAnsi="Sitka Subheading" w:cs="Sitka Subheading"/>
+          <w:b/>
+          <w:bCs/>
+          <w:i/>
+          <w:iCs/>
+          <w:color w:val="18605A" w:themeColor="accent5" w:themeShade="80"/>
+          <w:u w:val="single"/>
+          <w:lang w:val="en-IN"/>
+        </w:rPr>
+        <w:t>securityContext</w:t>
+      </w:r>
+      <w:r>
+        <w:rPr>
+          <w:rFonts w:hint="default" w:ascii="Sitka Subheading" w:hAnsi="Sitka Subheading" w:cs="Sitka Subheading"/>
+          <w:b w:val="0"/>
+          <w:bCs w:val="0"/>
+          <w:i w:val="0"/>
+          <w:iCs w:val="0"/>
+          <w:u w:val="none"/>
+          <w:lang w:val="en-IN"/>
+        </w:rPr>
+        <w:t xml:space="preserve"> </w:t>
+      </w:r>
+    </w:p>
+    <w:p>
+      <w:pPr>
+        <w:numPr>
+          <w:ilvl w:val="1"/>
+          <w:numId w:val="11"/>
+        </w:numPr>
+        <w:spacing w:line="360" w:lineRule="auto"/>
+        <w:ind w:left="840" w:leftChars="0" w:hanging="420" w:firstLineChars="0"/>
+        <w:rPr>
+          <w:rFonts w:hint="default" w:ascii="Sitka Subheading" w:hAnsi="Sitka Subheading" w:cs="Sitka Subheading"/>
+        </w:rPr>
+      </w:pPr>
+      <w:r>
+        <w:rPr>
+          <w:rFonts w:hint="default" w:ascii="Sitka Subheading" w:hAnsi="Sitka Subheading" w:cs="Sitka Subheading"/>
+        </w:rPr>
+        <w:drawing>
+          <wp:inline distT="0" distB="0" distL="114300" distR="114300">
+            <wp:extent cx="2096770" cy="719455"/>
+            <wp:effectExtent l="0" t="0" r="11430" b="4445"/>
+            <wp:docPr id="207" name="Picture 40"/>
+            <wp:cNvGraphicFramePr>
+              <a:graphicFrameLocks xmlns:a="http://schemas.openxmlformats.org/drawingml/2006/main" noChangeAspect="1"/>
+            </wp:cNvGraphicFramePr>
+            <a:graphic xmlns:a="http://schemas.openxmlformats.org/drawingml/2006/main">
+              <a:graphicData uri="http://schemas.openxmlformats.org/drawingml/2006/picture">
+                <pic:pic xmlns:pic="http://schemas.openxmlformats.org/drawingml/2006/picture">
+                  <pic:nvPicPr>
+                    <pic:cNvPr id="207" name="Picture 40"/>
+                    <pic:cNvPicPr>
+                      <a:picLocks noChangeAspect="1"/>
+                    </pic:cNvPicPr>
+                  </pic:nvPicPr>
+                  <pic:blipFill>
+                    <a:blip r:embed="rId45"/>
+                    <a:srcRect t="69349"/>
+                    <a:stretch>
+                      <a:fillRect/>
+                    </a:stretch>
+                  </pic:blipFill>
+                  <pic:spPr>
+                    <a:xfrm>
+                      <a:off x="0" y="0"/>
+                      <a:ext cx="2096770" cy="719455"/>
+                    </a:xfrm>
+                    <a:prstGeom prst="rect">
+                      <a:avLst/>
+                    </a:prstGeom>
+                    <a:noFill/>
+                    <a:ln>
+                      <a:noFill/>
+                    </a:ln>
+                  </pic:spPr>
+                </pic:pic>
+              </a:graphicData>
+            </a:graphic>
+          </wp:inline>
+        </w:drawing>
       </w:r>
     </w:p>
     <w:p>
@@ -20388,10 +22078,1021 @@
       <w:r>
         <w:rPr>
           <w:rFonts w:hint="default" w:ascii="Sitka Subheading" w:hAnsi="Sitka Subheading" w:cs="Sitka Subheading"/>
-          <w:lang w:val="en-IN"/>
-        </w:rPr>
-        <w:t>Ff</w:t>
-      </w:r>
+          <w:b/>
+          <w:bCs/>
+          <w:lang w:val="en-IN"/>
+        </w:rPr>
+        <w:t>NetworkPolicy</w:t>
+      </w:r>
+      <w:r>
+        <w:rPr>
+          <w:rFonts w:hint="default" w:ascii="Sitka Subheading" w:hAnsi="Sitka Subheading" w:cs="Sitka Subheading"/>
+          <w:lang w:val="en-IN"/>
+        </w:rPr>
+        <w:t xml:space="preserve"> (</w:t>
+      </w:r>
+      <w:r>
+        <w:rPr>
+          <w:rFonts w:hint="default" w:ascii="Sitka Subheading" w:hAnsi="Sitka Subheading" w:cs="Sitka Subheading"/>
+          <w:i/>
+          <w:iCs/>
+          <w:color w:val="18605A" w:themeColor="accent5" w:themeShade="80"/>
+          <w:u w:val="single"/>
+          <w:lang w:val="en-IN"/>
+        </w:rPr>
+        <w:t>apiVersion</w:t>
+      </w:r>
+      <w:r>
+        <w:rPr>
+          <w:rFonts w:hint="default" w:ascii="Sitka Subheading" w:hAnsi="Sitka Subheading" w:cs="Sitka Subheading"/>
+          <w:i/>
+          <w:iCs/>
+          <w:u w:val="none"/>
+          <w:lang w:val="en-IN"/>
+        </w:rPr>
+        <w:t xml:space="preserve">: </w:t>
+      </w:r>
+      <w:r>
+        <w:rPr>
+          <w:rFonts w:hint="default" w:ascii="Sitka Subheading" w:hAnsi="Sitka Subheading" w:cs="Sitka Subheading"/>
+          <w:i/>
+          <w:iCs/>
+          <w:u w:val="single"/>
+          <w:lang w:val="en-IN"/>
+        </w:rPr>
+        <w:t>networking.k8s.io/v1</w:t>
+      </w:r>
+      <w:r>
+        <w:rPr>
+          <w:rFonts w:hint="default" w:ascii="Sitka Subheading" w:hAnsi="Sitka Subheading" w:cs="Sitka Subheading"/>
+          <w:lang w:val="en-IN"/>
+        </w:rPr>
+        <w:t>)</w:t>
+      </w:r>
+    </w:p>
+    <w:p>
+      <w:pPr>
+        <w:numPr>
+          <w:ilvl w:val="1"/>
+          <w:numId w:val="11"/>
+        </w:numPr>
+        <w:spacing w:line="360" w:lineRule="auto"/>
+        <w:ind w:left="840" w:leftChars="0" w:hanging="420" w:firstLineChars="0"/>
+        <w:rPr>
+          <w:rFonts w:hint="default" w:ascii="Sitka Subheading" w:hAnsi="Sitka Subheading" w:cs="Sitka Subheading"/>
+        </w:rPr>
+      </w:pPr>
+      <w:r>
+        <w:rPr>
+          <w:rFonts w:hint="default" w:ascii="Sitka Subheading" w:hAnsi="Sitka Subheading" w:cs="Sitka Subheading"/>
+          <w:lang w:val="en-IN"/>
+        </w:rPr>
+        <w:t xml:space="preserve">It is </w:t>
+      </w:r>
+      <w:r>
+        <w:rPr>
+          <w:rFonts w:hint="default" w:ascii="Sitka Subheading" w:hAnsi="Sitka Subheading" w:cs="Sitka Subheading"/>
+          <w:b/>
+          <w:bCs/>
+          <w:shd w:val="clear" w:color="FFFFFF" w:fill="D9D9D9"/>
+          <w:lang w:val="en-IN"/>
+        </w:rPr>
+        <w:t>namespace scoped</w:t>
+      </w:r>
+      <w:r>
+        <w:rPr>
+          <w:rFonts w:hint="default" w:ascii="Sitka Subheading" w:hAnsi="Sitka Subheading" w:cs="Sitka Subheading"/>
+          <w:b w:val="0"/>
+          <w:bCs w:val="0"/>
+          <w:lang w:val="en-IN"/>
+        </w:rPr>
+        <w:t>.</w:t>
+      </w:r>
+    </w:p>
+    <w:p>
+      <w:pPr>
+        <w:numPr>
+          <w:ilvl w:val="1"/>
+          <w:numId w:val="11"/>
+        </w:numPr>
+        <w:spacing w:line="360" w:lineRule="auto"/>
+        <w:ind w:left="840" w:leftChars="0" w:hanging="420" w:firstLineChars="0"/>
+        <w:rPr>
+          <w:rFonts w:hint="default" w:ascii="Sitka Subheading" w:hAnsi="Sitka Subheading" w:cs="Sitka Subheading"/>
+        </w:rPr>
+      </w:pPr>
+      <w:r>
+        <w:rPr>
+          <w:rFonts w:hint="default" w:ascii="Sitka Subheading" w:hAnsi="Sitka Subheading" w:cs="Sitka Subheading"/>
+          <w:lang w:val="en-IN"/>
+        </w:rPr>
+        <w:t>Default behaviour: any pod can communicate with any other pod.</w:t>
+      </w:r>
+      <w:r>
+        <w:rPr>
+          <w:rFonts w:hint="default" w:ascii="Sitka Subheading" w:hAnsi="Sitka Subheading" w:cs="Sitka Subheading"/>
+          <w:lang w:val="en-IN"/>
+        </w:rPr>
+        <w:br w:type="textWrapping"/>
+      </w:r>
+      <w:r>
+        <w:rPr>
+          <w:rFonts w:hint="default" w:ascii="Sitka Subheading" w:hAnsi="Sitka Subheading" w:cs="Sitka Subheading"/>
+          <w:lang w:val="en-IN"/>
+        </w:rPr>
+        <w:t>Network Policies: restrict those behaviour.</w:t>
+      </w:r>
+    </w:p>
+    <w:p>
+      <w:pPr>
+        <w:numPr>
+          <w:ilvl w:val="1"/>
+          <w:numId w:val="11"/>
+        </w:numPr>
+        <w:spacing w:line="360" w:lineRule="auto"/>
+        <w:ind w:left="840" w:leftChars="0" w:hanging="420" w:firstLineChars="0"/>
+        <w:rPr>
+          <w:rFonts w:hint="default" w:ascii="Sitka Subheading" w:hAnsi="Sitka Subheading" w:cs="Sitka Subheading"/>
+        </w:rPr>
+      </w:pPr>
+      <w:r>
+        <w:rPr>
+          <w:rFonts w:hint="default" w:ascii="Sitka Subheading" w:hAnsi="Sitka Subheading" w:cs="Sitka Subheading"/>
+          <w:lang w:val="en-IN"/>
+        </w:rPr>
+        <w:t>Example: only backend should talk to database; not frontend;</w:t>
+      </w:r>
+    </w:p>
+    <w:p>
+      <w:pPr>
+        <w:numPr>
+          <w:ilvl w:val="1"/>
+          <w:numId w:val="11"/>
+        </w:numPr>
+        <w:spacing w:line="360" w:lineRule="auto"/>
+        <w:ind w:left="840" w:leftChars="0" w:hanging="420" w:firstLineChars="0"/>
+        <w:rPr>
+          <w:rFonts w:hint="default" w:ascii="Sitka Subheading" w:hAnsi="Sitka Subheading" w:cs="Sitka Subheading"/>
+        </w:rPr>
+      </w:pPr>
+      <w:r>
+        <w:rPr>
+          <w:rFonts w:hint="default" w:ascii="Sitka Subheading" w:hAnsi="Sitka Subheading" w:cs="Sitka Subheading"/>
+          <w:lang w:val="en-IN"/>
+        </w:rPr>
+        <w:t>Ingress: incoming traffic</w:t>
+      </w:r>
+      <w:r>
+        <w:rPr>
+          <w:rFonts w:hint="default" w:ascii="Sitka Subheading" w:hAnsi="Sitka Subheading" w:cs="Sitka Subheading"/>
+          <w:lang w:val="en-IN"/>
+        </w:rPr>
+        <w:br w:type="textWrapping"/>
+      </w:r>
+      <w:r>
+        <w:rPr>
+          <w:rFonts w:hint="default" w:ascii="Sitka Subheading" w:hAnsi="Sitka Subheading" w:cs="Sitka Subheading"/>
+          <w:lang w:val="en-IN"/>
+        </w:rPr>
+        <w:t>egress: outgoing traffic</w:t>
+      </w:r>
+    </w:p>
+    <w:p>
+      <w:pPr>
+        <w:numPr>
+          <w:ilvl w:val="1"/>
+          <w:numId w:val="11"/>
+        </w:numPr>
+        <w:spacing w:line="360" w:lineRule="auto"/>
+        <w:ind w:left="840" w:leftChars="0" w:hanging="420" w:firstLineChars="0"/>
+        <w:rPr>
+          <w:rFonts w:hint="default" w:ascii="Sitka Subheading" w:hAnsi="Sitka Subheading" w:cs="Sitka Subheading"/>
+        </w:rPr>
+      </w:pPr>
+      <w:r>
+        <w:rPr>
+          <w:rFonts w:hint="default" w:ascii="Sitka Subheading" w:hAnsi="Sitka Subheading" w:cs="Sitka Subheading"/>
+          <w:lang w:val="en-IN"/>
+        </w:rPr>
+        <w:t>Traffic restriction will work only to the pods where NetworkPolicy is applied.</w:t>
+      </w:r>
+      <w:r>
+        <w:rPr>
+          <w:rFonts w:hint="default" w:ascii="Sitka Subheading" w:hAnsi="Sitka Subheading" w:cs="Sitka Subheading"/>
+          <w:lang w:val="en-IN"/>
+        </w:rPr>
+        <w:br w:type="textWrapping"/>
+      </w:r>
+      <w:r>
+        <w:rPr>
+          <w:rFonts w:hint="default" w:ascii="Sitka Subheading" w:hAnsi="Sitka Subheading" w:cs="Sitka Subheading"/>
+          <w:lang w:val="en-IN"/>
+        </w:rPr>
+        <w:t xml:space="preserve">To link pods, </w:t>
+      </w:r>
+      <w:r>
+        <w:rPr>
+          <w:rFonts w:hint="default" w:ascii="Sitka Subheading" w:hAnsi="Sitka Subheading" w:cs="Sitka Subheading"/>
+          <w:b/>
+          <w:bCs/>
+          <w:i/>
+          <w:iCs/>
+          <w:lang w:val="en-IN"/>
+        </w:rPr>
+        <w:t>selector</w:t>
+      </w:r>
+      <w:r>
+        <w:rPr>
+          <w:rFonts w:hint="default" w:ascii="Sitka Subheading" w:hAnsi="Sitka Subheading" w:cs="Sitka Subheading"/>
+          <w:b w:val="0"/>
+          <w:bCs w:val="0"/>
+          <w:i w:val="0"/>
+          <w:iCs w:val="0"/>
+          <w:lang w:val="en-IN"/>
+        </w:rPr>
+        <w:t xml:space="preserve"> and </w:t>
+      </w:r>
+      <w:r>
+        <w:rPr>
+          <w:rFonts w:hint="default" w:ascii="Sitka Subheading" w:hAnsi="Sitka Subheading" w:cs="Sitka Subheading"/>
+          <w:b/>
+          <w:bCs/>
+          <w:i/>
+          <w:iCs/>
+          <w:lang w:val="en-IN"/>
+        </w:rPr>
+        <w:t xml:space="preserve">labels </w:t>
+      </w:r>
+      <w:r>
+        <w:rPr>
+          <w:rFonts w:hint="default" w:ascii="Sitka Subheading" w:hAnsi="Sitka Subheading" w:cs="Sitka Subheading"/>
+          <w:b w:val="0"/>
+          <w:bCs w:val="0"/>
+          <w:i w:val="0"/>
+          <w:iCs w:val="0"/>
+          <w:lang w:val="en-IN"/>
+        </w:rPr>
+        <w:t>method only is used here as well.</w:t>
+      </w:r>
+    </w:p>
+    <w:p>
+      <w:pPr>
+        <w:numPr>
+          <w:ilvl w:val="1"/>
+          <w:numId w:val="11"/>
+        </w:numPr>
+        <w:spacing w:line="360" w:lineRule="auto"/>
+        <w:ind w:left="840" w:leftChars="0" w:hanging="420" w:firstLineChars="0"/>
+        <w:rPr>
+          <w:rFonts w:hint="default" w:ascii="Sitka Subheading" w:hAnsi="Sitka Subheading" w:cs="Sitka Subheading"/>
+        </w:rPr>
+      </w:pPr>
+      <w:r>
+        <w:rPr>
+          <w:rFonts w:hint="default" w:ascii="Sitka Subheading" w:hAnsi="Sitka Subheading" w:cs="Sitka Subheading"/>
+          <w:b w:val="0"/>
+          <w:bCs w:val="0"/>
+          <w:i/>
+          <w:iCs/>
+          <w:color w:val="18605A" w:themeColor="accent5" w:themeShade="80"/>
+          <w:u w:val="single"/>
+          <w:lang w:val="en-IN"/>
+        </w:rPr>
+        <w:t>networkpolicy.spec.</w:t>
+      </w:r>
+      <w:r>
+        <w:rPr>
+          <w:rFonts w:hint="default" w:ascii="Sitka Subheading" w:hAnsi="Sitka Subheading" w:cs="Sitka Subheading"/>
+          <w:b/>
+          <w:bCs/>
+          <w:i/>
+          <w:iCs/>
+          <w:color w:val="18605A" w:themeColor="accent5" w:themeShade="80"/>
+          <w:u w:val="single"/>
+          <w:lang w:val="en-IN"/>
+        </w:rPr>
+        <w:t>podSelector</w:t>
+      </w:r>
+      <w:r>
+        <w:rPr>
+          <w:rFonts w:hint="default" w:ascii="Sitka Subheading" w:hAnsi="Sitka Subheading" w:cs="Sitka Subheading"/>
+          <w:b w:val="0"/>
+          <w:bCs w:val="0"/>
+          <w:i w:val="0"/>
+          <w:iCs w:val="0"/>
+          <w:lang w:val="en-IN"/>
+        </w:rPr>
+        <w:br w:type="textWrapping"/>
+      </w:r>
+      <w:r>
+        <w:rPr>
+          <w:rFonts w:hint="default" w:ascii="Sitka Subheading" w:hAnsi="Sitka Subheading" w:cs="Sitka Subheading"/>
+          <w:b w:val="0"/>
+          <w:bCs w:val="0"/>
+          <w:i w:val="0"/>
+          <w:iCs w:val="0"/>
+          <w:lang w:val="en-IN"/>
+        </w:rPr>
+        <w:t>select the pod on which NetworkPolicy has to be applied i.e. on which ingress and egress traffic restriction will be applied.</w:t>
+      </w:r>
+    </w:p>
+    <w:p>
+      <w:pPr>
+        <w:numPr>
+          <w:ilvl w:val="1"/>
+          <w:numId w:val="11"/>
+        </w:numPr>
+        <w:spacing w:line="360" w:lineRule="auto"/>
+        <w:ind w:left="840" w:leftChars="0" w:hanging="420" w:firstLineChars="0"/>
+        <w:rPr>
+          <w:rFonts w:hint="default" w:ascii="Sitka Subheading" w:hAnsi="Sitka Subheading" w:cs="Sitka Subheading"/>
+        </w:rPr>
+      </w:pPr>
+      <w:r>
+        <w:rPr>
+          <w:rFonts w:hint="default" w:ascii="Sitka Subheading" w:hAnsi="Sitka Subheading" w:cs="Sitka Subheading"/>
+          <w:b w:val="0"/>
+          <w:bCs w:val="0"/>
+          <w:i/>
+          <w:iCs/>
+          <w:color w:val="18605A" w:themeColor="accent5" w:themeShade="80"/>
+          <w:u w:val="single"/>
+          <w:lang w:val="en-IN"/>
+        </w:rPr>
+        <w:t>networkpolicy.spec.</w:t>
+      </w:r>
+      <w:r>
+        <w:rPr>
+          <w:rFonts w:hint="default" w:ascii="Sitka Subheading" w:hAnsi="Sitka Subheading" w:cs="Sitka Subheading"/>
+          <w:b/>
+          <w:bCs/>
+          <w:i/>
+          <w:iCs/>
+          <w:color w:val="18605A" w:themeColor="accent5" w:themeShade="80"/>
+          <w:u w:val="single"/>
+          <w:lang w:val="en-IN"/>
+        </w:rPr>
+        <w:t>ingress</w:t>
+      </w:r>
+      <w:r>
+        <w:rPr>
+          <w:rFonts w:hint="default" w:ascii="Sitka Subheading" w:hAnsi="Sitka Subheading" w:cs="Sitka Subheading"/>
+          <w:b w:val="0"/>
+          <w:bCs w:val="0"/>
+          <w:i/>
+          <w:iCs/>
+          <w:lang w:val="en-IN"/>
+        </w:rPr>
+        <w:br w:type="textWrapping"/>
+      </w:r>
+      <w:r>
+        <w:rPr>
+          <w:rFonts w:hint="default" w:ascii="Sitka Subheading" w:hAnsi="Sitka Subheading" w:cs="Sitka Subheading"/>
+          <w:b w:val="0"/>
+          <w:bCs w:val="0"/>
+          <w:i w:val="0"/>
+          <w:iCs w:val="0"/>
+          <w:lang w:val="en-IN"/>
+        </w:rPr>
+        <w:t>rules for allowed ingress traffic to the pod. (target pod’s selector, ports)</w:t>
+      </w:r>
+    </w:p>
+    <w:p>
+      <w:pPr>
+        <w:numPr>
+          <w:ilvl w:val="1"/>
+          <w:numId w:val="11"/>
+        </w:numPr>
+        <w:spacing w:line="360" w:lineRule="auto"/>
+        <w:ind w:left="840" w:leftChars="0" w:hanging="420" w:firstLineChars="0"/>
+        <w:rPr>
+          <w:rFonts w:hint="default" w:ascii="Sitka Subheading" w:hAnsi="Sitka Subheading" w:cs="Sitka Subheading"/>
+        </w:rPr>
+      </w:pPr>
+      <w:r>
+        <w:rPr>
+          <w:rFonts w:hint="default" w:ascii="Sitka Subheading" w:hAnsi="Sitka Subheading" w:cs="Sitka Subheading"/>
+          <w:b w:val="0"/>
+          <w:bCs w:val="0"/>
+          <w:i/>
+          <w:iCs/>
+          <w:color w:val="18605A" w:themeColor="accent5" w:themeShade="80"/>
+          <w:u w:val="single"/>
+          <w:lang w:val="en-IN"/>
+        </w:rPr>
+        <w:t>networkpolicy.spec.</w:t>
+      </w:r>
+      <w:r>
+        <w:rPr>
+          <w:rFonts w:hint="default" w:ascii="Sitka Subheading" w:hAnsi="Sitka Subheading" w:cs="Sitka Subheading"/>
+          <w:b/>
+          <w:bCs/>
+          <w:i/>
+          <w:iCs/>
+          <w:color w:val="18605A" w:themeColor="accent5" w:themeShade="80"/>
+          <w:u w:val="single"/>
+          <w:lang w:val="en-IN"/>
+        </w:rPr>
+        <w:t>egress</w:t>
+      </w:r>
+      <w:r>
+        <w:rPr>
+          <w:rFonts w:hint="default" w:ascii="Sitka Subheading" w:hAnsi="Sitka Subheading" w:cs="Sitka Subheading"/>
+          <w:b w:val="0"/>
+          <w:bCs w:val="0"/>
+          <w:i w:val="0"/>
+          <w:iCs w:val="0"/>
+          <w:lang w:val="en-IN"/>
+        </w:rPr>
+        <w:br w:type="textWrapping"/>
+      </w:r>
+      <w:r>
+        <w:rPr>
+          <w:rFonts w:hint="default" w:ascii="Sitka Subheading" w:hAnsi="Sitka Subheading" w:cs="Sitka Subheading"/>
+          <w:b w:val="0"/>
+          <w:bCs w:val="0"/>
+          <w:i w:val="0"/>
+          <w:iCs w:val="0"/>
+          <w:lang w:val="en-IN"/>
+        </w:rPr>
+        <w:t>rules for allowed egress traffic</w:t>
+      </w:r>
+    </w:p>
+    <w:p>
+      <w:pPr>
+        <w:numPr>
+          <w:ilvl w:val="1"/>
+          <w:numId w:val="11"/>
+        </w:numPr>
+        <w:spacing w:line="360" w:lineRule="auto"/>
+        <w:ind w:left="840" w:leftChars="0" w:hanging="420" w:firstLineChars="0"/>
+        <w:rPr>
+          <w:rFonts w:hint="default" w:ascii="Sitka Subheading" w:hAnsi="Sitka Subheading" w:cs="Sitka Subheading"/>
+        </w:rPr>
+      </w:pPr>
+      <w:r>
+        <w:rPr>
+          <w:rFonts w:hint="default" w:ascii="Sitka Subheading" w:hAnsi="Sitka Subheading" w:cs="Sitka Subheading"/>
+          <w:b w:val="0"/>
+          <w:bCs w:val="0"/>
+          <w:i/>
+          <w:iCs/>
+          <w:color w:val="18605A" w:themeColor="accent5" w:themeShade="80"/>
+          <w:u w:val="single"/>
+          <w:lang w:val="en-IN"/>
+        </w:rPr>
+        <w:t>networkpolicy.spec.</w:t>
+      </w:r>
+      <w:r>
+        <w:rPr>
+          <w:rFonts w:hint="default" w:ascii="Sitka Subheading" w:hAnsi="Sitka Subheading" w:cs="Sitka Subheading"/>
+          <w:b/>
+          <w:bCs/>
+          <w:i/>
+          <w:iCs/>
+          <w:color w:val="18605A" w:themeColor="accent5" w:themeShade="80"/>
+          <w:u w:val="single"/>
+          <w:lang w:val="en-IN"/>
+        </w:rPr>
+        <w:t>policyTypes</w:t>
+      </w:r>
+      <w:r>
+        <w:rPr>
+          <w:rFonts w:hint="default" w:ascii="Sitka Subheading" w:hAnsi="Sitka Subheading" w:cs="Sitka Subheading"/>
+          <w:b w:val="0"/>
+          <w:bCs w:val="0"/>
+          <w:i w:val="0"/>
+          <w:iCs w:val="0"/>
+          <w:lang w:val="en-IN"/>
+        </w:rPr>
+        <w:t xml:space="preserve"> </w:t>
+      </w:r>
+      <w:r>
+        <w:rPr>
+          <w:rFonts w:hint="default" w:ascii="Sitka Subheading" w:hAnsi="Sitka Subheading" w:cs="Sitka Subheading"/>
+          <w:b w:val="0"/>
+          <w:bCs w:val="0"/>
+          <w:i w:val="0"/>
+          <w:iCs w:val="0"/>
+          <w:lang w:val="en-IN"/>
+        </w:rPr>
+        <w:br w:type="textWrapping"/>
+      </w:r>
+      <w:r>
+        <w:rPr>
+          <w:rFonts w:hint="default" w:ascii="Sitka Subheading" w:hAnsi="Sitka Subheading" w:cs="Sitka Subheading"/>
+          <w:b w:val="0"/>
+          <w:bCs w:val="0"/>
+          <w:i w:val="0"/>
+          <w:iCs w:val="0"/>
+          <w:lang w:val="en-IN"/>
+        </w:rPr>
+        <w:t>it enforces the ingress and egress rules.</w:t>
+      </w:r>
+    </w:p>
+    <w:p>
+      <w:pPr>
+        <w:numPr>
+          <w:ilvl w:val="2"/>
+          <w:numId w:val="11"/>
+        </w:numPr>
+        <w:spacing w:line="360" w:lineRule="auto"/>
+        <w:ind w:left="1260" w:leftChars="0" w:hanging="420" w:firstLineChars="0"/>
+        <w:rPr>
+          <w:rFonts w:hint="default" w:ascii="Sitka Subheading" w:hAnsi="Sitka Subheading" w:cs="Sitka Subheading"/>
+        </w:rPr>
+      </w:pPr>
+      <w:r>
+        <w:rPr>
+          <w:rFonts w:hint="default" w:ascii="Sitka Subheading" w:hAnsi="Sitka Subheading" w:cs="Sitka Subheading"/>
+          <w:lang w:val="en-IN"/>
+        </w:rPr>
+        <w:t xml:space="preserve">If </w:t>
+      </w:r>
+      <w:r>
+        <w:rPr>
+          <w:rFonts w:hint="default" w:ascii="Sitka Subheading" w:hAnsi="Sitka Subheading" w:cs="Sitka Subheading"/>
+          <w:i/>
+          <w:iCs/>
+          <w:lang w:val="en-IN"/>
+        </w:rPr>
+        <w:t>policyTypes</w:t>
+      </w:r>
+      <w:r>
+        <w:rPr>
+          <w:rFonts w:hint="default" w:ascii="Sitka Subheading" w:hAnsi="Sitka Subheading" w:cs="Sitka Subheading"/>
+          <w:i w:val="0"/>
+          <w:iCs w:val="0"/>
+          <w:lang w:val="en-IN"/>
+        </w:rPr>
+        <w:t xml:space="preserve"> field is not there, Kubernetes will add the values (Ingress, Egress) based on presence of </w:t>
+      </w:r>
+      <w:r>
+        <w:rPr>
+          <w:rFonts w:hint="default" w:ascii="Sitka Subheading" w:hAnsi="Sitka Subheading" w:cs="Sitka Subheading"/>
+          <w:i/>
+          <w:iCs/>
+          <w:color w:val="18605A" w:themeColor="accent5" w:themeShade="80"/>
+          <w:u w:val="single"/>
+          <w:lang w:val="en-IN"/>
+        </w:rPr>
+        <w:t>networkpolicy.spec.ingress</w:t>
+      </w:r>
+      <w:r>
+        <w:rPr>
+          <w:rFonts w:hint="default" w:ascii="Sitka Subheading" w:hAnsi="Sitka Subheading" w:cs="Sitka Subheading"/>
+          <w:i w:val="0"/>
+          <w:iCs w:val="0"/>
+          <w:lang w:val="en-IN"/>
+        </w:rPr>
+        <w:t xml:space="preserve"> and </w:t>
+      </w:r>
+      <w:r>
+        <w:rPr>
+          <w:rFonts w:hint="default" w:ascii="Sitka Subheading" w:hAnsi="Sitka Subheading" w:cs="Sitka Subheading"/>
+          <w:i/>
+          <w:iCs/>
+          <w:color w:val="18605A" w:themeColor="accent5" w:themeShade="80"/>
+          <w:u w:val="single"/>
+          <w:lang w:val="en-IN"/>
+        </w:rPr>
+        <w:t>networkpolicy.spec.egress</w:t>
+      </w:r>
+      <w:r>
+        <w:rPr>
+          <w:rFonts w:hint="default" w:ascii="Sitka Subheading" w:hAnsi="Sitka Subheading" w:cs="Sitka Subheading"/>
+          <w:i w:val="0"/>
+          <w:iCs w:val="0"/>
+          <w:lang w:val="en-IN"/>
+        </w:rPr>
+        <w:t xml:space="preserve"> fields.</w:t>
+      </w:r>
+      <w:r>
+        <w:rPr>
+          <w:rFonts w:hint="default" w:ascii="Sitka Subheading" w:hAnsi="Sitka Subheading" w:cs="Sitka Subheading"/>
+          <w:i w:val="0"/>
+          <w:iCs w:val="0"/>
+          <w:lang w:val="en-IN"/>
+        </w:rPr>
+        <w:br w:type="textWrapping"/>
+      </w:r>
+      <w:r>
+        <w:rPr>
+          <w:rFonts w:hint="default" w:ascii="Sitka Subheading" w:hAnsi="Sitka Subheading" w:cs="Sitka Subheading"/>
+          <w:i w:val="0"/>
+          <w:iCs w:val="0"/>
+          <w:color w:val="795D01" w:themeColor="accent3" w:themeShade="80"/>
+          <w:lang w:val="en-IN"/>
+        </w:rPr>
+        <w:t>If only ingress is present, it becomes Ingress; if only egress is present, it becomes Egress; if both are present, it becomes both Ingress and Egress.</w:t>
+      </w:r>
+      <w:r>
+        <w:rPr>
+          <w:rFonts w:hint="default" w:ascii="Sitka Subheading" w:hAnsi="Sitka Subheading" w:cs="Sitka Subheading"/>
+          <w:i w:val="0"/>
+          <w:iCs w:val="0"/>
+          <w:lang w:val="en-IN"/>
+        </w:rPr>
+        <w:br w:type="textWrapping"/>
+      </w:r>
+      <w:r>
+        <w:rPr>
+          <w:rFonts w:hint="default" w:ascii="Sitka Subheading" w:hAnsi="Sitka Subheading" w:cs="Sitka Subheading"/>
+          <w:i w:val="0"/>
+          <w:iCs w:val="0"/>
+          <w:lang w:val="en-IN"/>
+        </w:rPr>
+        <w:t>In the live configuration (</w:t>
+      </w:r>
+      <w:r>
+        <w:rPr>
+          <w:rFonts w:hint="default" w:ascii="Sitka Subheading" w:hAnsi="Sitka Subheading" w:cs="Sitka Subheading"/>
+          <w:b/>
+          <w:bCs/>
+          <w:i w:val="0"/>
+          <w:iCs w:val="0"/>
+          <w:color w:val="851321" w:themeColor="accent6" w:themeShade="80"/>
+          <w:lang w:val="en-IN"/>
+        </w:rPr>
+        <w:t>kubectl get networkpolicy &lt;</w:t>
+      </w:r>
+      <w:r>
+        <w:rPr>
+          <w:rFonts w:hint="default" w:ascii="Sitka Subheading" w:hAnsi="Sitka Subheading" w:cs="Sitka Subheading"/>
+          <w:b w:val="0"/>
+          <w:bCs w:val="0"/>
+          <w:i w:val="0"/>
+          <w:iCs w:val="0"/>
+          <w:color w:val="851321" w:themeColor="accent6" w:themeShade="80"/>
+          <w:lang w:val="en-IN"/>
+        </w:rPr>
+        <w:t>name</w:t>
+      </w:r>
+      <w:r>
+        <w:rPr>
+          <w:rFonts w:hint="default" w:ascii="Sitka Subheading" w:hAnsi="Sitka Subheading" w:cs="Sitka Subheading"/>
+          <w:b/>
+          <w:bCs/>
+          <w:i w:val="0"/>
+          <w:iCs w:val="0"/>
+          <w:color w:val="851321" w:themeColor="accent6" w:themeShade="80"/>
+          <w:lang w:val="en-IN"/>
+        </w:rPr>
+        <w:t>&gt; -o yaml</w:t>
+      </w:r>
+      <w:r>
+        <w:rPr>
+          <w:rFonts w:hint="default" w:ascii="Sitka Subheading" w:hAnsi="Sitka Subheading" w:cs="Sitka Subheading"/>
+          <w:i w:val="0"/>
+          <w:iCs w:val="0"/>
+          <w:lang w:val="en-IN"/>
+        </w:rPr>
+        <w:t xml:space="preserve">), the </w:t>
+      </w:r>
+      <w:r>
+        <w:rPr>
+          <w:rFonts w:hint="default" w:ascii="Sitka Subheading" w:hAnsi="Sitka Subheading" w:cs="Sitka Subheading"/>
+          <w:i/>
+          <w:iCs/>
+          <w:color w:val="18605A" w:themeColor="accent5" w:themeShade="80"/>
+          <w:u w:val="single"/>
+          <w:lang w:val="en-IN"/>
+        </w:rPr>
+        <w:t>policyTypes</w:t>
+      </w:r>
+      <w:r>
+        <w:rPr>
+          <w:rFonts w:hint="default" w:ascii="Sitka Subheading" w:hAnsi="Sitka Subheading" w:cs="Sitka Subheading"/>
+          <w:i w:val="0"/>
+          <w:iCs w:val="0"/>
+          <w:lang w:val="en-IN"/>
+        </w:rPr>
+        <w:t xml:space="preserve"> field will always be present, either defined by the user or added by Kubernetes.</w:t>
+      </w:r>
+    </w:p>
+    <w:p>
+      <w:pPr>
+        <w:numPr>
+          <w:ilvl w:val="2"/>
+          <w:numId w:val="11"/>
+        </w:numPr>
+        <w:spacing w:line="360" w:lineRule="auto"/>
+        <w:ind w:left="1260" w:leftChars="0" w:hanging="420" w:firstLineChars="0"/>
+        <w:rPr>
+          <w:rFonts w:hint="default" w:ascii="Sitka Subheading" w:hAnsi="Sitka Subheading" w:cs="Sitka Subheading"/>
+        </w:rPr>
+      </w:pPr>
+      <w:r>
+        <w:rPr>
+          <w:rFonts w:hint="default" w:ascii="Sitka Subheading" w:hAnsi="Sitka Subheading" w:cs="Sitka Subheading"/>
+          <w:lang w:val="en-IN"/>
+        </w:rPr>
+        <w:t xml:space="preserve">In the live config, whatever values are there [ Ingress or Egress or both ] inside </w:t>
+      </w:r>
+      <w:r>
+        <w:rPr>
+          <w:rFonts w:hint="default" w:ascii="Sitka Subheading" w:hAnsi="Sitka Subheading" w:cs="Sitka Subheading"/>
+          <w:i/>
+          <w:iCs/>
+          <w:lang w:val="en-IN"/>
+        </w:rPr>
+        <w:t>networkpolicy.spec.policyTypes</w:t>
+      </w:r>
+      <w:r>
+        <w:rPr>
+          <w:rFonts w:hint="default" w:ascii="Sitka Subheading" w:hAnsi="Sitka Subheading" w:cs="Sitka Subheading"/>
+          <w:i w:val="0"/>
+          <w:iCs w:val="0"/>
+          <w:lang w:val="en-IN"/>
+        </w:rPr>
+        <w:t>, only those will be enforced.</w:t>
+      </w:r>
+      <w:r>
+        <w:rPr>
+          <w:rFonts w:hint="default" w:ascii="Sitka Subheading" w:hAnsi="Sitka Subheading" w:cs="Sitka Subheading"/>
+          <w:i w:val="0"/>
+          <w:iCs w:val="0"/>
+          <w:lang w:val="en-IN"/>
+        </w:rPr>
+        <w:br w:type="textWrapping"/>
+      </w:r>
+      <w:r>
+        <w:rPr>
+          <w:rFonts w:hint="default" w:ascii="Sitka Subheading" w:hAnsi="Sitka Subheading" w:cs="Sitka Subheading"/>
+          <w:i w:val="0"/>
+          <w:iCs w:val="0"/>
+          <w:lang w:val="en-IN"/>
+        </w:rPr>
+        <w:t xml:space="preserve">If a direction [Ingress or Egress] is listed in policyTypes but no corresponding rules are defined, then that direction becomes </w:t>
+      </w:r>
+      <w:r>
+        <w:rPr>
+          <w:rFonts w:hint="default" w:ascii="Sitka Subheading" w:hAnsi="Sitka Subheading" w:cs="Sitka Subheading"/>
+          <w:i w:val="0"/>
+          <w:iCs w:val="0"/>
+          <w:color w:val="795D01" w:themeColor="accent3" w:themeShade="80"/>
+          <w:lang w:val="en-IN"/>
+        </w:rPr>
+        <w:t>completely blocked</w:t>
+      </w:r>
+      <w:r>
+        <w:rPr>
+          <w:rFonts w:hint="default" w:ascii="Sitka Subheading" w:hAnsi="Sitka Subheading" w:cs="Sitka Subheading"/>
+          <w:i w:val="0"/>
+          <w:iCs w:val="0"/>
+          <w:lang w:val="en-IN"/>
+        </w:rPr>
+        <w:t xml:space="preserve"> (</w:t>
+      </w:r>
+      <w:r>
+        <w:rPr>
+          <w:rFonts w:hint="default" w:ascii="Sitka Subheading" w:hAnsi="Sitka Subheading" w:cs="Sitka Subheading"/>
+          <w:b/>
+          <w:bCs/>
+          <w:i w:val="0"/>
+          <w:iCs w:val="0"/>
+          <w:color w:val="795D01" w:themeColor="accent3" w:themeShade="80"/>
+          <w:lang w:val="en-IN"/>
+        </w:rPr>
+        <w:t>default deny</w:t>
+      </w:r>
+      <w:r>
+        <w:rPr>
+          <w:rFonts w:hint="default" w:ascii="Sitka Subheading" w:hAnsi="Sitka Subheading" w:cs="Sitka Subheading"/>
+          <w:i w:val="0"/>
+          <w:iCs w:val="0"/>
+          <w:lang w:val="en-IN"/>
+        </w:rPr>
+        <w:t>).</w:t>
+      </w:r>
+      <w:r>
+        <w:rPr>
+          <w:rFonts w:hint="default" w:ascii="Sitka Subheading" w:hAnsi="Sitka Subheading" w:cs="Sitka Subheading"/>
+          <w:i w:val="0"/>
+          <w:iCs w:val="0"/>
+          <w:lang w:val="en-IN"/>
+        </w:rPr>
+        <w:br w:type="textWrapping"/>
+      </w:r>
+      <w:r>
+        <w:rPr>
+          <w:rFonts w:hint="default" w:ascii="Sitka Subheading" w:hAnsi="Sitka Subheading" w:cs="Sitka Subheading"/>
+          <w:i w:val="0"/>
+          <w:iCs w:val="0"/>
+          <w:lang w:val="en-IN"/>
+        </w:rPr>
+        <w:t>For example, if policyTypes contains Ingress but no ingress rules are defined, then all incoming traffic is blocked.</w:t>
+      </w:r>
+    </w:p>
+    <w:p>
+      <w:pPr>
+        <w:numPr>
+          <w:ilvl w:val="1"/>
+          <w:numId w:val="11"/>
+        </w:numPr>
+        <w:spacing w:line="360" w:lineRule="auto"/>
+        <w:ind w:left="840" w:leftChars="0" w:hanging="420" w:firstLineChars="0"/>
+        <w:rPr>
+          <w:rFonts w:hint="default" w:ascii="Sitka Subheading" w:hAnsi="Sitka Subheading" w:cs="Sitka Subheading"/>
+        </w:rPr>
+      </w:pPr>
+      <w:r>
+        <w:drawing>
+          <wp:inline distT="0" distB="0" distL="114300" distR="114300">
+            <wp:extent cx="2235200" cy="2649220"/>
+            <wp:effectExtent l="0" t="0" r="0" b="5080"/>
+            <wp:docPr id="216" name="Picture 4"/>
+            <wp:cNvGraphicFramePr>
+              <a:graphicFrameLocks xmlns:a="http://schemas.openxmlformats.org/drawingml/2006/main" noChangeAspect="1"/>
+            </wp:cNvGraphicFramePr>
+            <a:graphic xmlns:a="http://schemas.openxmlformats.org/drawingml/2006/main">
+              <a:graphicData uri="http://schemas.openxmlformats.org/drawingml/2006/picture">
+                <pic:pic xmlns:pic="http://schemas.openxmlformats.org/drawingml/2006/picture">
+                  <pic:nvPicPr>
+                    <pic:cNvPr id="216" name="Picture 4"/>
+                    <pic:cNvPicPr>
+                      <a:picLocks noChangeAspect="1"/>
+                    </pic:cNvPicPr>
+                  </pic:nvPicPr>
+                  <pic:blipFill>
+                    <a:blip r:embed="rId46"/>
+                    <a:srcRect b="32273"/>
+                    <a:stretch>
+                      <a:fillRect/>
+                    </a:stretch>
+                  </pic:blipFill>
+                  <pic:spPr>
+                    <a:xfrm>
+                      <a:off x="0" y="0"/>
+                      <a:ext cx="2235200" cy="2649220"/>
+                    </a:xfrm>
+                    <a:prstGeom prst="rect">
+                      <a:avLst/>
+                    </a:prstGeom>
+                    <a:noFill/>
+                    <a:ln>
+                      <a:noFill/>
+                    </a:ln>
+                  </pic:spPr>
+                </pic:pic>
+              </a:graphicData>
+            </a:graphic>
+          </wp:inline>
+        </w:drawing>
+      </w:r>
+      <w:r>
+        <w:drawing>
+          <wp:inline distT="0" distB="0" distL="114300" distR="114300">
+            <wp:extent cx="2193290" cy="4742180"/>
+            <wp:effectExtent l="0" t="0" r="3810" b="7620"/>
+            <wp:docPr id="217" name="Picture 5"/>
+            <wp:cNvGraphicFramePr>
+              <a:graphicFrameLocks xmlns:a="http://schemas.openxmlformats.org/drawingml/2006/main" noChangeAspect="1"/>
+            </wp:cNvGraphicFramePr>
+            <a:graphic xmlns:a="http://schemas.openxmlformats.org/drawingml/2006/main">
+              <a:graphicData uri="http://schemas.openxmlformats.org/drawingml/2006/picture">
+                <pic:pic xmlns:pic="http://schemas.openxmlformats.org/drawingml/2006/picture">
+                  <pic:nvPicPr>
+                    <pic:cNvPr id="217" name="Picture 5"/>
+                    <pic:cNvPicPr>
+                      <a:picLocks noChangeAspect="1"/>
+                    </pic:cNvPicPr>
+                  </pic:nvPicPr>
+                  <pic:blipFill>
+                    <a:blip r:embed="rId47"/>
+                    <a:stretch>
+                      <a:fillRect/>
+                    </a:stretch>
+                  </pic:blipFill>
+                  <pic:spPr>
+                    <a:xfrm>
+                      <a:off x="0" y="0"/>
+                      <a:ext cx="2193290" cy="4742180"/>
+                    </a:xfrm>
+                    <a:prstGeom prst="rect">
+                      <a:avLst/>
+                    </a:prstGeom>
+                    <a:noFill/>
+                    <a:ln>
+                      <a:noFill/>
+                    </a:ln>
+                  </pic:spPr>
+                </pic:pic>
+              </a:graphicData>
+            </a:graphic>
+          </wp:inline>
+        </w:drawing>
+      </w:r>
+    </w:p>
+    <w:p>
+      <w:pPr>
+        <w:numPr>
+          <w:ilvl w:val="1"/>
+          <w:numId w:val="11"/>
+        </w:numPr>
+        <w:spacing w:line="360" w:lineRule="auto"/>
+        <w:ind w:left="840" w:leftChars="0" w:hanging="420" w:firstLineChars="0"/>
+        <w:rPr>
+          <w:rFonts w:hint="default" w:ascii="Sitka Subheading" w:hAnsi="Sitka Subheading" w:cs="Sitka Subheading"/>
+        </w:rPr>
+      </w:pPr>
+      <w:r>
+        <w:rPr>
+          <w:rFonts w:hint="default" w:ascii="Sitka Subheading" w:hAnsi="Sitka Subheading" w:cs="Sitka Subheading"/>
+          <w:b w:val="0"/>
+          <w:bCs w:val="0"/>
+          <w:i/>
+          <w:iCs/>
+          <w:color w:val="18605A" w:themeColor="accent5" w:themeShade="80"/>
+          <w:u w:val="single"/>
+          <w:lang w:val="en-IN"/>
+        </w:rPr>
+        <w:t>networkpolicy.spec.ingress.from.</w:t>
+      </w:r>
+      <w:r>
+        <w:rPr>
+          <w:rFonts w:hint="default" w:ascii="Sitka Subheading" w:hAnsi="Sitka Subheading" w:cs="Sitka Subheading"/>
+          <w:b/>
+          <w:bCs/>
+          <w:i/>
+          <w:iCs/>
+          <w:color w:val="18605A" w:themeColor="accent5" w:themeShade="80"/>
+          <w:u w:val="single"/>
+          <w:lang w:val="en-IN"/>
+        </w:rPr>
+        <w:t>namespaceSelector</w:t>
+      </w:r>
+      <w:r>
+        <w:rPr>
+          <w:rFonts w:hint="default" w:ascii="Sitka Subheading" w:hAnsi="Sitka Subheading" w:cs="Sitka Subheading"/>
+          <w:b w:val="0"/>
+          <w:bCs w:val="0"/>
+          <w:lang w:val="en-IN"/>
+        </w:rPr>
+        <w:br w:type="textWrapping"/>
+      </w:r>
+      <w:r>
+        <w:rPr>
+          <w:rFonts w:hint="default" w:ascii="Sitka Subheading" w:hAnsi="Sitka Subheading" w:cs="Sitka Subheading"/>
+          <w:b w:val="0"/>
+          <w:bCs w:val="0"/>
+          <w:lang w:val="en-IN"/>
+        </w:rPr>
+        <w:t>if provided, namespaces with those labels will be selected.</w:t>
+      </w:r>
+      <w:r>
+        <w:rPr>
+          <w:rFonts w:hint="default" w:ascii="Sitka Subheading" w:hAnsi="Sitka Subheading" w:cs="Sitka Subheading"/>
+          <w:b w:val="0"/>
+          <w:bCs w:val="0"/>
+          <w:lang w:val="en-IN"/>
+        </w:rPr>
+        <w:br w:type="textWrapping"/>
+      </w:r>
+      <w:r>
+        <w:rPr>
+          <w:rFonts w:hint="default" w:ascii="Sitka Subheading" w:hAnsi="Sitka Subheading" w:cs="Sitka Subheading"/>
+          <w:b w:val="0"/>
+          <w:bCs w:val="0"/>
+          <w:lang w:val="en-IN"/>
+        </w:rPr>
+        <w:t>If not provided, pods within the same namespace (</w:t>
+      </w:r>
+      <w:bookmarkStart w:id="0" w:name="_GoBack"/>
+      <w:r>
+        <w:rPr>
+          <w:rFonts w:hint="default" w:ascii="Sitka Subheading" w:hAnsi="Sitka Subheading" w:cs="Sitka Subheading"/>
+          <w:b w:val="0"/>
+          <w:bCs w:val="0"/>
+          <w:strike/>
+          <w:dstrike w:val="0"/>
+          <w:lang w:val="en-IN"/>
+        </w:rPr>
+        <w:t>not all namespaces</w:t>
+      </w:r>
+      <w:bookmarkEnd w:id="0"/>
+      <w:r>
+        <w:rPr>
+          <w:rFonts w:hint="default" w:ascii="Sitka Subheading" w:hAnsi="Sitka Subheading" w:cs="Sitka Subheading"/>
+          <w:b w:val="0"/>
+          <w:bCs w:val="0"/>
+          <w:lang w:val="en-IN"/>
+        </w:rPr>
+        <w:t>) will be allowed.</w:t>
+      </w:r>
+    </w:p>
+    <w:p>
+      <w:pPr>
+        <w:numPr>
+          <w:ilvl w:val="1"/>
+          <w:numId w:val="11"/>
+        </w:numPr>
+        <w:spacing w:line="360" w:lineRule="auto"/>
+        <w:ind w:left="840" w:leftChars="0" w:hanging="420" w:firstLineChars="0"/>
+        <w:rPr>
+          <w:rFonts w:hint="default" w:ascii="Sitka Subheading" w:hAnsi="Sitka Subheading" w:cs="Sitka Subheading"/>
+        </w:rPr>
+      </w:pPr>
     </w:p>
     <w:p>
       <w:pPr>
@@ -21048,7 +23749,7 @@
     <w:lsdException w:qFormat="1" w:unhideWhenUsed="0" w:uiPriority="0" w:semiHidden="0" w:name="toc 9"/>
     <w:lsdException w:qFormat="1" w:unhideWhenUsed="0" w:uiPriority="0" w:semiHidden="0" w:name="Normal Indent"/>
     <w:lsdException w:qFormat="1" w:unhideWhenUsed="0" w:uiPriority="0" w:semiHidden="0" w:name="footnote text"/>
-    <w:lsdException w:unhideWhenUsed="0" w:uiPriority="0" w:semiHidden="0" w:name="annotation text"/>
+    <w:lsdException w:qFormat="1" w:unhideWhenUsed="0" w:uiPriority="0" w:semiHidden="0" w:name="annotation text"/>
     <w:lsdException w:qFormat="1" w:unhideWhenUsed="0" w:uiPriority="0" w:semiHidden="0" w:name="header"/>
     <w:lsdException w:qFormat="1" w:unhideWhenUsed="0" w:uiPriority="0" w:semiHidden="0" w:name="footer"/>
     <w:lsdException w:qFormat="1" w:unhideWhenUsed="0" w:uiPriority="0" w:semiHidden="0" w:name="index heading"/>
@@ -21621,6 +24322,7 @@
   <w:style w:type="paragraph" w:styleId="26">
     <w:name w:val="annotation text"/>
     <w:basedOn w:val="1"/>
+    <w:qFormat/>
     <w:uiPriority w:val="0"/>
   </w:style>
   <w:style w:type="paragraph" w:styleId="27">

</xml_diff>

<commit_message>
have to format the commands section in summary file
</commit_message>
<xml_diff>
--- a/docs (kubernetes)/kcna_summary.docx
+++ b/docs (kubernetes)/kcna_summary.docx
@@ -34002,6 +34002,83 @@
     <w:p>
       <w:pPr>
         <w:numPr>
+          <w:ilvl w:val="1"/>
+          <w:numId w:val="11"/>
+        </w:numPr>
+        <w:spacing w:line="360" w:lineRule="auto"/>
+        <w:ind w:left="840" w:leftChars="0" w:hanging="420" w:firstLineChars="0"/>
+        <w:rPr>
+          <w:rFonts w:hint="default" w:ascii="Sitka Subheading" w:hAnsi="Sitka Subheading" w:cs="Sitka Subheading"/>
+          <w:b w:val="0"/>
+          <w:bCs w:val="0"/>
+        </w:rPr>
+      </w:pPr>
+      <w:r>
+        <w:rPr>
+          <w:rFonts w:hint="default" w:ascii="Sitka Subheading" w:hAnsi="Sitka Subheading" w:cs="Sitka Subheading"/>
+          <w:color w:val="795D01" w:themeColor="accent3" w:themeShade="80"/>
+          <w:shd w:val="clear" w:color="FFFFFF" w:fill="D9D9D9"/>
+          <w:lang w:val="en-IN"/>
+        </w:rPr>
+        <w:t xml:space="preserve">In this case, </w:t>
+      </w:r>
+      <w:r>
+        <w:rPr>
+          <w:rFonts w:hint="default" w:ascii="Sitka Subheading" w:hAnsi="Sitka Subheading" w:cs="Sitka Subheading"/>
+          <w:b/>
+          <w:bCs/>
+          <w:color w:val="795D01" w:themeColor="accent3" w:themeShade="80"/>
+          <w:shd w:val="clear" w:color="FFFFFF" w:fill="D9D9D9"/>
+          <w:lang w:val="en-IN"/>
+        </w:rPr>
+        <w:t>vm2</w:t>
+      </w:r>
+      <w:r>
+        <w:rPr>
+          <w:rFonts w:hint="default" w:ascii="Sitka Subheading" w:hAnsi="Sitka Subheading" w:cs="Sitka Subheading"/>
+          <w:b w:val="0"/>
+          <w:bCs w:val="0"/>
+          <w:color w:val="795D01" w:themeColor="accent3" w:themeShade="80"/>
+          <w:shd w:val="clear" w:color="FFFFFF" w:fill="D9D9D9"/>
+          <w:lang w:val="en-IN"/>
+        </w:rPr>
+        <w:t xml:space="preserve"> can directly communicate to </w:t>
+      </w:r>
+      <w:r>
+        <w:rPr>
+          <w:rFonts w:hint="default" w:ascii="Sitka Subheading" w:hAnsi="Sitka Subheading" w:cs="Sitka Subheading"/>
+          <w:b/>
+          <w:bCs/>
+          <w:color w:val="795D01" w:themeColor="accent3" w:themeShade="80"/>
+          <w:shd w:val="clear" w:color="FFFFFF" w:fill="D9D9D9"/>
+          <w:lang w:val="en-IN"/>
+        </w:rPr>
+        <w:t>namespace</w:t>
+      </w:r>
+      <w:r>
+        <w:rPr>
+          <w:rFonts w:hint="default" w:ascii="Sitka Subheading" w:hAnsi="Sitka Subheading" w:cs="Sitka Subheading"/>
+          <w:b w:val="0"/>
+          <w:bCs w:val="0"/>
+          <w:color w:val="795D01" w:themeColor="accent3" w:themeShade="80"/>
+          <w:shd w:val="clear" w:color="FFFFFF" w:fill="D9D9D9"/>
+          <w:lang w:val="en-IN"/>
+        </w:rPr>
+        <w:t xml:space="preserve"> (of vm1)</w:t>
+      </w:r>
+      <w:r>
+        <w:rPr>
+          <w:rFonts w:hint="default" w:ascii="Sitka Subheading" w:hAnsi="Sitka Subheading" w:cs="Sitka Subheading"/>
+          <w:b w:val="0"/>
+          <w:bCs w:val="0"/>
+          <w:lang w:val="en-IN"/>
+        </w:rPr>
+        <w:t>.</w:t>
+      </w:r>
+    </w:p>
+    <w:p>
+      <w:pPr>
+        <w:numPr>
           <w:ilvl w:val="0"/>
           <w:numId w:val="11"/>
         </w:numPr>
@@ -34011,126 +34088,441 @@
           <w:rFonts w:hint="default" w:ascii="Sitka Subheading" w:hAnsi="Sitka Subheading" w:cs="Sitka Subheading"/>
         </w:rPr>
       </w:pPr>
-      <w:bookmarkStart w:id="0" w:name="_GoBack"/>
-      <w:bookmarkEnd w:id="0"/>
-    </w:p>
-    <w:p>
-      <w:pPr>
-        <w:numPr>
-          <w:ilvl w:val="0"/>
-          <w:numId w:val="11"/>
-        </w:numPr>
-        <w:spacing w:line="360" w:lineRule="auto"/>
-        <w:ind w:left="420" w:leftChars="0" w:hanging="420" w:firstLineChars="0"/>
-        <w:rPr>
-          <w:rFonts w:hint="default" w:ascii="Sitka Subheading" w:hAnsi="Sitka Subheading" w:cs="Sitka Subheading"/>
-        </w:rPr>
-      </w:pPr>
-      <w:r>
-        <w:rPr>
-          <w:rFonts w:hint="default" w:ascii="Sitka Subheading" w:hAnsi="Sitka Subheading" w:cs="Sitka Subheading"/>
-          <w:lang w:val="en-IN"/>
-        </w:rPr>
-        <w:t>F</w:t>
-      </w:r>
-    </w:p>
-    <w:p>
-      <w:pPr>
-        <w:numPr>
-          <w:ilvl w:val="0"/>
-          <w:numId w:val="11"/>
-        </w:numPr>
-        <w:spacing w:line="360" w:lineRule="auto"/>
-        <w:ind w:left="420" w:leftChars="0" w:hanging="420" w:firstLineChars="0"/>
-        <w:rPr>
-          <w:rFonts w:hint="default" w:ascii="Sitka Subheading" w:hAnsi="Sitka Subheading" w:cs="Sitka Subheading"/>
-        </w:rPr>
-      </w:pPr>
-      <w:r>
-        <w:rPr>
-          <w:rFonts w:hint="default" w:ascii="Sitka Subheading" w:hAnsi="Sitka Subheading" w:cs="Sitka Subheading"/>
-          <w:lang w:val="en-IN"/>
-        </w:rPr>
-        <w:t>F</w:t>
-      </w:r>
-    </w:p>
-    <w:p>
-      <w:pPr>
-        <w:numPr>
-          <w:ilvl w:val="0"/>
-          <w:numId w:val="11"/>
-        </w:numPr>
-        <w:spacing w:line="360" w:lineRule="auto"/>
-        <w:ind w:left="420" w:leftChars="0" w:hanging="420" w:firstLineChars="0"/>
-        <w:rPr>
-          <w:rFonts w:hint="default" w:ascii="Sitka Subheading" w:hAnsi="Sitka Subheading" w:cs="Sitka Subheading"/>
-        </w:rPr>
-      </w:pPr>
-      <w:r>
-        <w:rPr>
-          <w:rFonts w:hint="default" w:ascii="Sitka Subheading" w:hAnsi="Sitka Subheading" w:cs="Sitka Subheading"/>
-          <w:lang w:val="en-IN"/>
-        </w:rPr>
-        <w:t>F</w:t>
-      </w:r>
-    </w:p>
-    <w:p>
-      <w:pPr>
-        <w:numPr>
-          <w:ilvl w:val="0"/>
-          <w:numId w:val="11"/>
-        </w:numPr>
-        <w:spacing w:line="360" w:lineRule="auto"/>
-        <w:ind w:left="420" w:leftChars="0" w:hanging="420" w:firstLineChars="0"/>
-        <w:rPr>
-          <w:rFonts w:hint="default" w:ascii="Sitka Subheading" w:hAnsi="Sitka Subheading" w:cs="Sitka Subheading"/>
-        </w:rPr>
-      </w:pPr>
-    </w:p>
-    <w:p>
-      <w:pPr>
-        <w:numPr>
-          <w:ilvl w:val="0"/>
-          <w:numId w:val="11"/>
-        </w:numPr>
-        <w:spacing w:line="360" w:lineRule="auto"/>
-        <w:rPr>
-          <w:rFonts w:hint="default" w:ascii="Sitka Subheading" w:hAnsi="Sitka Subheading" w:cs="Sitka Subheading"/>
-        </w:rPr>
-      </w:pPr>
-      <w:r>
-        <w:rPr>
-          <w:rFonts w:hint="default" w:ascii="Sitka Subheading" w:hAnsi="Sitka Subheading" w:cs="Sitka Subheading"/>
-          <w:lang w:val="en-IN"/>
-        </w:rPr>
-        <w:t>To add gateway,</w:t>
-      </w:r>
-      <w:r>
-        <w:rPr>
-          <w:rFonts w:hint="default" w:ascii="Sitka Subheading" w:hAnsi="Sitka Subheading" w:cs="Sitka Subheading"/>
+      <w:r>
+        <w:rPr>
+          <w:rFonts w:hint="default" w:ascii="Sitka Subheading" w:hAnsi="Sitka Subheading" w:cs="Sitka Subheading"/>
+          <w:lang w:val="en-IN"/>
+        </w:rPr>
+        <w:t>Option-2: using NAT</w:t>
+      </w:r>
+    </w:p>
+    <w:p>
+      <w:pPr>
+        <w:numPr>
+          <w:ilvl w:val="1"/>
+          <w:numId w:val="11"/>
+        </w:numPr>
+        <w:spacing w:line="360" w:lineRule="auto"/>
+        <w:ind w:left="840" w:leftChars="0" w:hanging="420" w:firstLineChars="0"/>
+        <w:rPr>
+          <w:rFonts w:hint="default" w:ascii="Sitka Subheading" w:hAnsi="Sitka Subheading" w:cs="Sitka Subheading"/>
+        </w:rPr>
+      </w:pPr>
+      <w:r>
+        <w:rPr>
+          <w:rFonts w:hint="default" w:ascii="Sitka Subheading" w:hAnsi="Sitka Subheading" w:cs="Sitka Subheading"/>
+          <w:lang w:val="en-IN"/>
+        </w:rPr>
+        <w:t>Previous option is not preferable because if multiple systems will be there, in each system we need to set route gateway.</w:t>
+      </w:r>
+    </w:p>
+    <w:p>
+      <w:pPr>
+        <w:numPr>
+          <w:ilvl w:val="1"/>
+          <w:numId w:val="11"/>
+        </w:numPr>
+        <w:spacing w:line="360" w:lineRule="auto"/>
+        <w:ind w:left="840" w:leftChars="0" w:hanging="420" w:firstLineChars="0"/>
+        <w:rPr>
+          <w:rFonts w:hint="default" w:ascii="Sitka Subheading" w:hAnsi="Sitka Subheading" w:cs="Sitka Subheading"/>
+        </w:rPr>
+      </w:pPr>
+      <w:r>
+        <w:rPr>
+          <w:rFonts w:hint="default" w:ascii="Sitka Subheading" w:hAnsi="Sitka Subheading" w:cs="Sitka Subheading"/>
+          <w:lang w:val="en-IN"/>
+        </w:rPr>
+        <w:t xml:space="preserve">If we enable NAT in </w:t>
+      </w:r>
+      <w:r>
+        <w:rPr>
+          <w:rFonts w:hint="default" w:ascii="Sitka Subheading" w:hAnsi="Sitka Subheading" w:cs="Sitka Subheading"/>
+          <w:b/>
+          <w:bCs/>
+          <w:lang w:val="en-IN"/>
+        </w:rPr>
+        <w:t>vm1</w:t>
+      </w:r>
+      <w:r>
+        <w:rPr>
+          <w:rFonts w:hint="default" w:ascii="Sitka Subheading" w:hAnsi="Sitka Subheading" w:cs="Sitka Subheading"/>
+          <w:b w:val="0"/>
+          <w:bCs w:val="0"/>
+          <w:lang w:val="en-IN"/>
+        </w:rPr>
+        <w:t>, it’ll update the source IP before the packet exits.</w:t>
+      </w:r>
+    </w:p>
+    <w:p>
+      <w:pPr>
+        <w:numPr>
+          <w:ilvl w:val="2"/>
+          <w:numId w:val="11"/>
+        </w:numPr>
+        <w:spacing w:line="360" w:lineRule="auto"/>
+        <w:ind w:left="1260" w:leftChars="0" w:hanging="420" w:firstLineChars="0"/>
+        <w:rPr>
+          <w:rFonts w:hint="default" w:ascii="Sitka Subheading" w:hAnsi="Sitka Subheading" w:cs="Sitka Subheading"/>
+        </w:rPr>
+      </w:pPr>
+      <w:r>
+        <w:rPr>
+          <w:rFonts w:hint="default" w:ascii="Sitka Subheading" w:hAnsi="Sitka Subheading" w:cs="Sitka Subheading"/>
+          <w:b w:val="0"/>
+          <w:bCs w:val="0"/>
+          <w:lang w:val="en-IN"/>
+        </w:rPr>
+        <w:t>Packet before NAT:</w:t>
+      </w:r>
+      <w:r>
+        <w:rPr>
+          <w:rFonts w:hint="default" w:ascii="Sitka Subheading" w:hAnsi="Sitka Subheading" w:cs="Sitka Subheading"/>
+          <w:b w:val="0"/>
+          <w:bCs w:val="0"/>
           <w:lang w:val="en-IN"/>
         </w:rPr>
         <w:br w:type="textWrapping"/>
       </w:r>
+      <w:r>
+        <w:rPr>
+          <w:rFonts w:hint="default" w:ascii="Sitka Subheading" w:hAnsi="Sitka Subheading" w:cs="Sitka Subheading"/>
+          <w:b w:val="0"/>
+          <w:bCs w:val="0"/>
+          <w:lang w:val="en-IN"/>
+        </w:rPr>
+        <w:t>src IP: 192.168.15.2 (red namespace)</w:t>
+      </w:r>
+      <w:r>
+        <w:rPr>
+          <w:rFonts w:hint="default" w:ascii="Sitka Subheading" w:hAnsi="Sitka Subheading" w:cs="Sitka Subheading"/>
+          <w:b w:val="0"/>
+          <w:bCs w:val="0"/>
+          <w:lang w:val="en-IN"/>
+        </w:rPr>
+        <w:br w:type="textWrapping"/>
+      </w:r>
+      <w:r>
+        <w:rPr>
+          <w:rFonts w:hint="default" w:ascii="Sitka Subheading" w:hAnsi="Sitka Subheading" w:cs="Sitka Subheading"/>
+          <w:b w:val="0"/>
+          <w:bCs w:val="0"/>
+          <w:lang w:val="en-IN"/>
+        </w:rPr>
+        <w:t>dest IP: 10.10.10.11 (vm2)</w:t>
+      </w:r>
+    </w:p>
+    <w:p>
+      <w:pPr>
+        <w:numPr>
+          <w:ilvl w:val="2"/>
+          <w:numId w:val="11"/>
+        </w:numPr>
+        <w:spacing w:line="360" w:lineRule="auto"/>
+        <w:ind w:left="1260" w:leftChars="0" w:hanging="420" w:firstLineChars="0"/>
+        <w:rPr>
+          <w:rFonts w:hint="default" w:ascii="Sitka Subheading" w:hAnsi="Sitka Subheading" w:cs="Sitka Subheading"/>
+        </w:rPr>
+      </w:pPr>
+      <w:r>
+        <w:rPr>
+          <w:rFonts w:hint="default" w:ascii="Sitka Subheading" w:hAnsi="Sitka Subheading" w:cs="Sitka Subheading"/>
+          <w:b w:val="0"/>
+          <w:bCs w:val="0"/>
+          <w:lang w:val="en-IN"/>
+        </w:rPr>
+        <w:t>Packet after NAT:</w:t>
+      </w:r>
+      <w:r>
+        <w:rPr>
+          <w:rFonts w:hint="default" w:ascii="Sitka Subheading" w:hAnsi="Sitka Subheading" w:cs="Sitka Subheading"/>
+          <w:b w:val="0"/>
+          <w:bCs w:val="0"/>
+          <w:lang w:val="en-IN"/>
+        </w:rPr>
+        <w:br w:type="textWrapping"/>
+      </w:r>
+      <w:r>
+        <w:rPr>
+          <w:rFonts w:hint="default" w:ascii="Sitka Subheading" w:hAnsi="Sitka Subheading" w:cs="Sitka Subheading"/>
+          <w:b w:val="0"/>
+          <w:bCs w:val="0"/>
+          <w:lang w:val="en-IN"/>
+        </w:rPr>
+        <w:t>src IP: 10.10.10.10 (host/vm1 IP)</w:t>
+      </w:r>
+      <w:r>
+        <w:rPr>
+          <w:rFonts w:hint="default" w:ascii="Sitka Subheading" w:hAnsi="Sitka Subheading" w:cs="Sitka Subheading"/>
+          <w:b w:val="0"/>
+          <w:bCs w:val="0"/>
+          <w:lang w:val="en-IN"/>
+        </w:rPr>
+        <w:br w:type="textWrapping"/>
+      </w:r>
+      <w:r>
+        <w:rPr>
+          <w:rFonts w:hint="default" w:ascii="Sitka Subheading" w:hAnsi="Sitka Subheading" w:cs="Sitka Subheading"/>
+          <w:b w:val="0"/>
+          <w:bCs w:val="0"/>
+          <w:lang w:val="en-IN"/>
+        </w:rPr>
+        <w:t>dest IP: 10.10.10.11 (vm2) --&gt; it doesn’t change.</w:t>
+      </w:r>
+    </w:p>
+    <w:p>
+      <w:pPr>
+        <w:numPr>
+          <w:ilvl w:val="1"/>
+          <w:numId w:val="11"/>
+        </w:numPr>
+        <w:spacing w:line="360" w:lineRule="auto"/>
+        <w:ind w:left="840" w:leftChars="0" w:hanging="420" w:firstLineChars="0"/>
+        <w:rPr>
+          <w:rFonts w:hint="default" w:ascii="Sitka Subheading" w:hAnsi="Sitka Subheading" w:cs="Sitka Subheading"/>
+        </w:rPr>
+      </w:pPr>
+      <w:r>
+        <w:rPr>
+          <w:rFonts w:hint="default" w:ascii="Sitka Subheading" w:hAnsi="Sitka Subheading" w:cs="Sitka Subheading"/>
+          <w:b w:val="0"/>
+          <w:bCs w:val="0"/>
+          <w:lang w:val="en-IN"/>
+        </w:rPr>
+        <w:t xml:space="preserve">Now the packet can go to </w:t>
+      </w:r>
+      <w:r>
+        <w:rPr>
+          <w:rFonts w:hint="default" w:ascii="Sitka Subheading" w:hAnsi="Sitka Subheading" w:cs="Sitka Subheading"/>
+          <w:b/>
+          <w:bCs/>
+          <w:lang w:val="en-IN"/>
+        </w:rPr>
+        <w:t>vm2</w:t>
+      </w:r>
+      <w:r>
+        <w:rPr>
+          <w:rFonts w:hint="default" w:ascii="Sitka Subheading" w:hAnsi="Sitka Subheading" w:cs="Sitka Subheading"/>
+          <w:b w:val="0"/>
+          <w:bCs w:val="0"/>
+          <w:lang w:val="en-IN"/>
+        </w:rPr>
+        <w:t xml:space="preserve"> easily, and vm2 as well send back the response.</w:t>
+      </w:r>
+      <w:r>
+        <w:rPr>
+          <w:rFonts w:hint="default" w:ascii="Sitka Subheading" w:hAnsi="Sitka Subheading" w:cs="Sitka Subheading"/>
+          <w:b w:val="0"/>
+          <w:bCs w:val="0"/>
+          <w:lang w:val="en-IN"/>
+        </w:rPr>
+        <w:br w:type="textWrapping"/>
+      </w:r>
+      <w:r>
+        <w:rPr>
+          <w:rFonts w:hint="default" w:ascii="Sitka Subheading" w:hAnsi="Sitka Subheading" w:cs="Sitka Subheading"/>
+          <w:b w:val="0"/>
+          <w:bCs w:val="0"/>
+          <w:lang w:val="en-IN"/>
+        </w:rPr>
+        <w:t>src IP: 10.10.10.11</w:t>
+      </w:r>
+      <w:r>
+        <w:rPr>
+          <w:rFonts w:hint="default" w:ascii="Sitka Subheading" w:hAnsi="Sitka Subheading" w:cs="Sitka Subheading"/>
+          <w:b w:val="0"/>
+          <w:bCs w:val="0"/>
+          <w:lang w:val="en-IN"/>
+        </w:rPr>
+        <w:br w:type="textWrapping"/>
+      </w:r>
+      <w:r>
+        <w:rPr>
+          <w:rFonts w:hint="default" w:ascii="Sitka Subheading" w:hAnsi="Sitka Subheading" w:cs="Sitka Subheading"/>
+          <w:b w:val="0"/>
+          <w:bCs w:val="0"/>
+          <w:lang w:val="en-IN"/>
+        </w:rPr>
+        <w:t>dest IP: 10.10.10.10  (because this was the source IP received at vm2)</w:t>
+      </w:r>
+    </w:p>
+    <w:p>
+      <w:pPr>
+        <w:numPr>
+          <w:ilvl w:val="1"/>
+          <w:numId w:val="11"/>
+        </w:numPr>
+        <w:spacing w:line="360" w:lineRule="auto"/>
+        <w:ind w:left="840" w:leftChars="0" w:hanging="420" w:firstLineChars="0"/>
+        <w:rPr>
+          <w:rFonts w:hint="default" w:ascii="Sitka Subheading" w:hAnsi="Sitka Subheading" w:cs="Sitka Subheading"/>
+        </w:rPr>
+      </w:pPr>
+      <w:r>
+        <w:rPr>
+          <w:rFonts w:hint="default" w:ascii="Sitka Subheading" w:hAnsi="Sitka Subheading" w:cs="Sitka Subheading"/>
+          <w:b w:val="0"/>
+          <w:bCs w:val="0"/>
+          <w:lang w:val="en-IN"/>
+        </w:rPr>
+        <w:t xml:space="preserve">vm1 (host) will receive the packet. And from the NAT table it knows that this packet belong to </w:t>
+      </w:r>
+      <w:r>
+        <w:rPr>
+          <w:rFonts w:hint="default" w:ascii="Sitka Subheading" w:hAnsi="Sitka Subheading" w:cs="Sitka Subheading"/>
+          <w:b w:val="0"/>
+          <w:bCs w:val="0"/>
+          <w:i/>
+          <w:iCs/>
+          <w:lang w:val="en-IN"/>
+        </w:rPr>
+        <w:t>192.168.15.2</w:t>
+      </w:r>
+      <w:r>
+        <w:rPr>
+          <w:rFonts w:hint="default" w:ascii="Sitka Subheading" w:hAnsi="Sitka Subheading" w:cs="Sitka Subheading"/>
+          <w:b w:val="0"/>
+          <w:bCs w:val="0"/>
+          <w:i w:val="0"/>
+          <w:iCs w:val="0"/>
+          <w:lang w:val="en-IN"/>
+        </w:rPr>
+        <w:t xml:space="preserve"> (red namespace).</w:t>
+      </w:r>
+      <w:r>
+        <w:rPr>
+          <w:rFonts w:hint="default" w:ascii="Sitka Subheading" w:hAnsi="Sitka Subheading" w:cs="Sitka Subheading"/>
+          <w:b w:val="0"/>
+          <w:bCs w:val="0"/>
+          <w:i w:val="0"/>
+          <w:iCs w:val="0"/>
+          <w:lang w:val="en-IN"/>
+        </w:rPr>
+        <w:br w:type="textWrapping"/>
+      </w:r>
+      <w:r>
+        <w:rPr>
+          <w:rFonts w:hint="default" w:ascii="Sitka Subheading" w:hAnsi="Sitka Subheading" w:cs="Sitka Subheading"/>
+          <w:b w:val="0"/>
+          <w:bCs w:val="0"/>
+          <w:i w:val="0"/>
+          <w:iCs w:val="0"/>
+          <w:lang w:val="en-IN"/>
+        </w:rPr>
+        <w:t>Now it updates the packet’s dest IP</w:t>
+      </w:r>
+      <w:r>
+        <w:rPr>
+          <w:rFonts w:hint="default" w:ascii="Sitka Subheading" w:hAnsi="Sitka Subheading" w:cs="Sitka Subheading"/>
+          <w:b w:val="0"/>
+          <w:bCs w:val="0"/>
+          <w:i w:val="0"/>
+          <w:iCs w:val="0"/>
+          <w:lang w:val="en-IN"/>
+        </w:rPr>
+        <w:br w:type="textWrapping"/>
+      </w:r>
+      <w:r>
+        <w:rPr>
+          <w:rFonts w:hint="default" w:ascii="Sitka Subheading" w:hAnsi="Sitka Subheading" w:cs="Sitka Subheading"/>
+          <w:b w:val="0"/>
+          <w:bCs w:val="0"/>
+          <w:i w:val="0"/>
+          <w:iCs w:val="0"/>
+          <w:lang w:val="en-IN"/>
+        </w:rPr>
+        <w:t>src IP: 10.10.10.11  (vm2, doesn’t change)</w:t>
+      </w:r>
+      <w:r>
+        <w:rPr>
+          <w:rFonts w:hint="default" w:ascii="Sitka Subheading" w:hAnsi="Sitka Subheading" w:cs="Sitka Subheading"/>
+          <w:b w:val="0"/>
+          <w:bCs w:val="0"/>
+          <w:i w:val="0"/>
+          <w:iCs w:val="0"/>
+          <w:lang w:val="en-IN"/>
+        </w:rPr>
+        <w:br w:type="textWrapping"/>
+      </w:r>
+      <w:r>
+        <w:rPr>
+          <w:rFonts w:hint="default" w:ascii="Sitka Subheading" w:hAnsi="Sitka Subheading" w:cs="Sitka Subheading"/>
+          <w:b w:val="0"/>
+          <w:bCs w:val="0"/>
+          <w:i w:val="0"/>
+          <w:iCs w:val="0"/>
+          <w:lang w:val="en-IN"/>
+        </w:rPr>
+        <w:t>dest IP: 192.158.15.2 (red namespace)</w:t>
+      </w:r>
+    </w:p>
+    <w:p>
+      <w:pPr>
+        <w:numPr>
+          <w:ilvl w:val="1"/>
+          <w:numId w:val="11"/>
+        </w:numPr>
+        <w:spacing w:line="360" w:lineRule="auto"/>
+        <w:ind w:left="840" w:leftChars="0" w:hanging="420" w:firstLineChars="0"/>
+        <w:rPr>
+          <w:rFonts w:hint="default" w:ascii="Sitka Subheading" w:hAnsi="Sitka Subheading" w:cs="Sitka Subheading"/>
+        </w:rPr>
+      </w:pPr>
+      <w:r>
+        <w:rPr>
+          <w:rFonts w:hint="default" w:ascii="Sitka Subheading" w:hAnsi="Sitka Subheading" w:cs="Sitka Subheading"/>
+          <w:b w:val="0"/>
+          <w:bCs w:val="0"/>
+          <w:i w:val="0"/>
+          <w:iCs w:val="0"/>
+          <w:lang w:val="en-IN"/>
+        </w:rPr>
+        <w:t>First delete the created configs (vm2 route gateway).</w:t>
+      </w:r>
+      <w:r>
+        <w:rPr>
+          <w:rFonts w:hint="default" w:ascii="Sitka Subheading" w:hAnsi="Sitka Subheading" w:cs="Sitka Subheading"/>
+          <w:b w:val="0"/>
+          <w:bCs w:val="0"/>
+          <w:i w:val="0"/>
+          <w:iCs w:val="0"/>
+          <w:lang w:val="en-IN"/>
+        </w:rPr>
+        <w:br w:type="textWrapping"/>
+      </w:r>
+      <w:r>
+        <w:rPr>
+          <w:rFonts w:hint="default" w:ascii="Sitka Subheading" w:hAnsi="Sitka Subheading" w:cs="Sitka Subheading"/>
+          <w:b w:val="0"/>
+          <w:bCs w:val="0"/>
+          <w:i w:val="0"/>
+          <w:iCs w:val="0"/>
+          <w:color w:val="795D01" w:themeColor="accent3" w:themeShade="80"/>
+          <w:lang w:val="en-IN"/>
+        </w:rPr>
+        <w:t>Don’t disable IP packet forwarding (/proc/sys/net/ipv4/ip_forward) because NAT requires this.</w:t>
+      </w:r>
+    </w:p>
+    <w:p>
+      <w:pPr>
+        <w:numPr>
+          <w:ilvl w:val="1"/>
+          <w:numId w:val="11"/>
+        </w:numPr>
+        <w:spacing w:line="360" w:lineRule="auto"/>
+        <w:ind w:left="840" w:leftChars="0" w:hanging="420" w:firstLineChars="0"/>
+        <w:rPr>
+          <w:rFonts w:hint="default" w:ascii="Sitka Subheading" w:hAnsi="Sitka Subheading" w:cs="Sitka Subheading"/>
+        </w:rPr>
+      </w:pPr>
       <w:r>
         <w:rPr>
           <w:rFonts w:hint="default" w:ascii="Sitka Subheading" w:hAnsi="Sitka Subheading" w:cs="Sitka Subheading"/>
           <w:b/>
           <w:bCs/>
           <w:color w:val="851321" w:themeColor="accent6" w:themeShade="80"/>
-          <w:lang w:val="en-IN"/>
-        </w:rPr>
-        <w:t>ip route add &lt;</w:t>
-      </w:r>
-      <w:r>
-        <w:rPr>
-          <w:rFonts w:hint="default" w:ascii="Sitka Subheading" w:hAnsi="Sitka Subheading" w:cs="Sitka Subheading"/>
-          <w:b w:val="0"/>
-          <w:bCs w:val="0"/>
-          <w:color w:val="851321" w:themeColor="accent6" w:themeShade="80"/>
-          <w:lang w:val="en-IN"/>
-        </w:rPr>
-        <w:t>network-ip</w:t>
+        </w:rPr>
+        <w:t xml:space="preserve">iptables -t nat -A POSTROUTING -o </w:t>
       </w:r>
       <w:r>
         <w:rPr>
@@ -34140,17 +34532,15 @@
           <w:color w:val="851321" w:themeColor="accent6" w:themeShade="80"/>
           <w:lang w:val="en-IN"/>
         </w:rPr>
-        <w:t>&gt; via &lt;</w:t>
-      </w:r>
-      <w:r>
-        <w:rPr>
-          <w:rFonts w:hint="default" w:ascii="Sitka Subheading" w:hAnsi="Sitka Subheading" w:cs="Sitka Subheading"/>
-          <w:b w:val="0"/>
-          <w:bCs w:val="0"/>
+        <w:t>&lt;</w:t>
+      </w:r>
+      <w:r>
+        <w:rPr>
+          <w:rFonts w:hint="default" w:ascii="Sitka Subheading" w:hAnsi="Sitka Subheading" w:cs="Sitka Subheading"/>
           <w:color w:val="851321" w:themeColor="accent6" w:themeShade="80"/>
           <w:lang w:val="en-IN"/>
         </w:rPr>
-        <w:t>gateway-ip</w:t>
+        <w:t>network interface name</w:t>
       </w:r>
       <w:r>
         <w:rPr>
@@ -34165,10 +34555,249 @@
       <w:r>
         <w:rPr>
           <w:rFonts w:hint="default" w:ascii="Sitka Subheading" w:hAnsi="Sitka Subheading" w:cs="Sitka Subheading"/>
+          <w:b/>
+          <w:bCs/>
+          <w:color w:val="851321" w:themeColor="accent6" w:themeShade="80"/>
+        </w:rPr>
+        <w:t xml:space="preserve"> -j MASQUERADE</w:t>
+      </w:r>
+      <w:r>
+        <w:rPr>
+          <w:rFonts w:hint="default" w:ascii="Sitka Subheading" w:hAnsi="Sitka Subheading" w:cs="Sitka Subheading"/>
+        </w:rPr>
+        <w:br w:type="textWrapping"/>
+      </w:r>
+      <w:r>
+        <w:rPr>
+          <w:rFonts w:hint="default" w:ascii="Sitka Subheading" w:hAnsi="Sitka Subheading" w:cs="Sitka Subheading"/>
+          <w:color w:val="0070C0"/>
+          <w:lang w:val="en-IN"/>
+        </w:rPr>
+        <w:t>-t</w:t>
+      </w:r>
+      <w:r>
+        <w:rPr>
+          <w:rFonts w:hint="default" w:ascii="Sitka Subheading" w:hAnsi="Sitka Subheading" w:cs="Sitka Subheading"/>
+          <w:lang w:val="en-IN"/>
+        </w:rPr>
+        <w:t>: use NAT table</w:t>
+      </w:r>
+      <w:r>
+        <w:rPr>
+          <w:rFonts w:hint="default" w:ascii="Sitka Subheading" w:hAnsi="Sitka Subheading" w:cs="Sitka Subheading"/>
+          <w:lang w:val="en-IN"/>
+        </w:rPr>
+        <w:br w:type="textWrapping"/>
+      </w:r>
+      <w:r>
+        <w:rPr>
+          <w:rFonts w:hint="default" w:ascii="Sitka Subheading" w:hAnsi="Sitka Subheading" w:cs="Sitka Subheading"/>
+          <w:color w:val="0070C0"/>
+          <w:lang w:val="en-IN"/>
+        </w:rPr>
+        <w:t>POSTROUTING</w:t>
+      </w:r>
+      <w:r>
+        <w:rPr>
+          <w:rFonts w:hint="default" w:ascii="Sitka Subheading" w:hAnsi="Sitka Subheading" w:cs="Sitka Subheading"/>
+          <w:lang w:val="en-IN"/>
+        </w:rPr>
+        <w:t>: modify packet before leaving</w:t>
+      </w:r>
+      <w:r>
+        <w:rPr>
+          <w:rFonts w:hint="default" w:ascii="Sitka Subheading" w:hAnsi="Sitka Subheading" w:cs="Sitka Subheading"/>
+          <w:lang w:val="en-IN"/>
+        </w:rPr>
+        <w:br w:type="textWrapping"/>
+      </w:r>
+      <w:r>
+        <w:rPr>
+          <w:rFonts w:hint="default" w:ascii="Sitka Subheading" w:hAnsi="Sitka Subheading" w:cs="Sitka Subheading"/>
+          <w:color w:val="0070C0"/>
+          <w:lang w:val="en-IN"/>
+        </w:rPr>
+        <w:t>&lt;network interface name&gt;</w:t>
+      </w:r>
+      <w:r>
+        <w:rPr>
+          <w:rFonts w:hint="default" w:ascii="Sitka Subheading" w:hAnsi="Sitka Subheading" w:cs="Sitka Subheading"/>
+          <w:lang w:val="en-IN"/>
+        </w:rPr>
+        <w:t>: network interface connected to vm2</w:t>
+      </w:r>
+      <w:r>
+        <w:rPr>
+          <w:rFonts w:hint="default" w:ascii="Sitka Subheading" w:hAnsi="Sitka Subheading" w:cs="Sitka Subheading"/>
+          <w:lang w:val="en-IN"/>
+        </w:rPr>
+        <w:br w:type="textWrapping"/>
+      </w:r>
+      <w:r>
+        <w:rPr>
+          <w:rFonts w:hint="default" w:ascii="Sitka Subheading" w:hAnsi="Sitka Subheading" w:cs="Sitka Subheading"/>
+        </w:rPr>
+        <w:drawing>
+          <wp:inline distT="0" distB="0" distL="114300" distR="114300">
+            <wp:extent cx="2806700" cy="844550"/>
+            <wp:effectExtent l="0" t="0" r="0" b="6350"/>
+            <wp:docPr id="80" name="Picture 52"/>
+            <wp:cNvGraphicFramePr>
+              <a:graphicFrameLocks xmlns:a="http://schemas.openxmlformats.org/drawingml/2006/main" noChangeAspect="1"/>
+            </wp:cNvGraphicFramePr>
+            <a:graphic xmlns:a="http://schemas.openxmlformats.org/drawingml/2006/main">
+              <a:graphicData uri="http://schemas.openxmlformats.org/drawingml/2006/picture">
+                <pic:pic xmlns:pic="http://schemas.openxmlformats.org/drawingml/2006/picture">
+                  <pic:nvPicPr>
+                    <pic:cNvPr id="80" name="Picture 52"/>
+                    <pic:cNvPicPr>
+                      <a:picLocks noChangeAspect="1"/>
+                    </pic:cNvPicPr>
+                  </pic:nvPicPr>
+                  <pic:blipFill>
+                    <a:blip r:embed="rId91"/>
+                    <a:stretch>
+                      <a:fillRect/>
+                    </a:stretch>
+                  </pic:blipFill>
+                  <pic:spPr>
+                    <a:xfrm>
+                      <a:off x="0" y="0"/>
+                      <a:ext cx="2806700" cy="844550"/>
+                    </a:xfrm>
+                    <a:prstGeom prst="rect">
+                      <a:avLst/>
+                    </a:prstGeom>
+                    <a:noFill/>
+                    <a:ln>
+                      <a:noFill/>
+                    </a:ln>
+                  </pic:spPr>
+                </pic:pic>
+              </a:graphicData>
+            </a:graphic>
+          </wp:inline>
+        </w:drawing>
+      </w:r>
+      <w:r>
+        <w:rPr>
+          <w:rFonts w:hint="default" w:ascii="Sitka Subheading" w:hAnsi="Sitka Subheading" w:cs="Sitka Subheading"/>
+          <w:lang w:val="en-IN"/>
+        </w:rPr>
+        <w:t xml:space="preserve"> [ in my case </w:t>
+      </w:r>
+      <w:r>
+        <w:rPr>
+          <w:rFonts w:hint="default" w:ascii="Sitka Subheading" w:hAnsi="Sitka Subheading" w:cs="Sitka Subheading"/>
+          <w:b/>
+          <w:bCs/>
+          <w:lang w:val="en-IN"/>
+        </w:rPr>
+        <w:t>enp0s8</w:t>
+      </w:r>
+      <w:r>
+        <w:rPr>
+          <w:rFonts w:hint="default" w:ascii="Sitka Subheading" w:hAnsi="Sitka Subheading" w:cs="Sitka Subheading"/>
+          <w:b w:val="0"/>
+          <w:bCs w:val="0"/>
+          <w:lang w:val="en-IN"/>
+        </w:rPr>
+        <w:t xml:space="preserve"> ]</w:t>
+      </w:r>
+      <w:r>
+        <w:rPr>
+          <w:rFonts w:hint="default" w:ascii="Sitka Subheading" w:hAnsi="Sitka Subheading" w:cs="Sitka Subheading"/>
+          <w:b w:val="0"/>
+          <w:bCs w:val="0"/>
+          <w:lang w:val="en-IN"/>
+        </w:rPr>
+        <w:br w:type="textWrapping"/>
+      </w:r>
+      <w:r>
+        <w:rPr>
+          <w:rFonts w:hint="default" w:ascii="Sitka Subheading" w:hAnsi="Sitka Subheading" w:cs="Sitka Subheading"/>
+          <w:b w:val="0"/>
+          <w:bCs w:val="0"/>
+          <w:color w:val="0070C0"/>
+          <w:lang w:val="en-IN"/>
+        </w:rPr>
+        <w:t>MASQUERADE</w:t>
+      </w:r>
+      <w:r>
+        <w:rPr>
+          <w:rFonts w:hint="default" w:ascii="Sitka Subheading" w:hAnsi="Sitka Subheading" w:cs="Sitka Subheading"/>
+          <w:b w:val="0"/>
+          <w:bCs w:val="0"/>
+          <w:lang w:val="en-IN"/>
+        </w:rPr>
+        <w:t>: replace source IP with host/router IP</w:t>
+      </w:r>
+      <w:r>
+        <w:rPr>
+          <w:rFonts w:hint="default" w:ascii="Sitka Subheading" w:hAnsi="Sitka Subheading" w:cs="Sitka Subheading"/>
+          <w:b w:val="0"/>
+          <w:bCs w:val="0"/>
+          <w:lang w:val="en-IN"/>
+        </w:rPr>
+        <w:br w:type="textWrapping"/>
+      </w:r>
+      <w:r>
+        <w:rPr>
+          <w:rFonts w:hint="default" w:ascii="Sitka Subheading" w:hAnsi="Sitka Subheading" w:cs="Sitka Subheading"/>
+          <w:b w:val="0"/>
+          <w:bCs w:val="0"/>
+          <w:lang w:val="en-IN"/>
+        </w:rPr>
+        <w:t>[ for incoming traffic, destination ip will be updated (host IP to namespace’s IP). it looks like DNAT but it is not. Kernel automatically reverse NAT mapping because it remembers previously source IP was changed ]</w:t>
+      </w:r>
+    </w:p>
+    <w:p>
+      <w:pPr>
+        <w:numPr>
+          <w:ilvl w:val="2"/>
+          <w:numId w:val="11"/>
+        </w:numPr>
+        <w:spacing w:line="360" w:lineRule="auto"/>
+        <w:ind w:left="1260" w:leftChars="0" w:hanging="420" w:firstLineChars="0"/>
+        <w:rPr>
+          <w:rFonts w:hint="default" w:ascii="Sitka Subheading" w:hAnsi="Sitka Subheading" w:cs="Sitka Subheading"/>
+        </w:rPr>
+      </w:pPr>
+      <w:r>
+        <w:rPr>
+          <w:rFonts w:hint="default" w:ascii="Sitka Subheading" w:hAnsi="Sitka Subheading" w:cs="Sitka Subheading"/>
+          <w:color w:val="851321" w:themeColor="accent6" w:themeShade="80"/>
+          <w:lang w:val="en-IN"/>
+        </w:rPr>
+        <w:t>iptables -t nat -A POSTROUTING -o enp0s8 -j MASQUERADE</w:t>
+      </w:r>
+      <w:r>
+        <w:rPr>
+          <w:rFonts w:hint="default" w:ascii="Sitka Subheading" w:hAnsi="Sitka Subheading" w:cs="Sitka Subheading"/>
           <w:lang w:val="en-IN"/>
         </w:rPr>
         <w:t xml:space="preserve"> </w:t>
       </w:r>
+    </w:p>
+    <w:p>
+      <w:pPr>
+        <w:numPr>
+          <w:ilvl w:val="1"/>
+          <w:numId w:val="11"/>
+        </w:numPr>
+        <w:spacing w:line="360" w:lineRule="auto"/>
+        <w:ind w:left="840" w:leftChars="0" w:hanging="420" w:firstLineChars="0"/>
+        <w:rPr>
+          <w:rFonts w:hint="default" w:ascii="Sitka Subheading" w:hAnsi="Sitka Subheading" w:cs="Sitka Subheading"/>
+        </w:rPr>
+      </w:pPr>
+      <w:r>
+        <w:rPr>
+          <w:rFonts w:hint="default" w:ascii="Sitka Subheading" w:hAnsi="Sitka Subheading" w:cs="Sitka Subheading"/>
+          <w:lang w:val="en-IN"/>
+        </w:rPr>
+        <w:t>Now, from namespace to vm2 can be easily accessible.</w:t>
+      </w:r>
       <w:r>
         <w:rPr>
           <w:rFonts w:hint="default" w:ascii="Sitka Subheading" w:hAnsi="Sitka Subheading" w:cs="Sitka Subheading"/>
@@ -34179,44 +34808,805 @@
       <w:r>
         <w:rPr>
           <w:rFonts w:hint="default" w:ascii="Sitka Subheading" w:hAnsi="Sitka Subheading" w:cs="Sitka Subheading"/>
-          <w:lang w:val="en-IN"/>
-        </w:rPr>
-        <w:t xml:space="preserve">to connect to </w:t>
-      </w:r>
-      <w:r>
-        <w:rPr>
-          <w:rFonts w:hint="default" w:ascii="Sitka Subheading" w:hAnsi="Sitka Subheading" w:cs="Sitka Subheading"/>
+        </w:rPr>
+        <w:drawing>
+          <wp:inline distT="0" distB="0" distL="114300" distR="114300">
+            <wp:extent cx="3587750" cy="1397000"/>
+            <wp:effectExtent l="0" t="0" r="6350" b="0"/>
+            <wp:docPr id="81" name="Picture 53"/>
+            <wp:cNvGraphicFramePr>
+              <a:graphicFrameLocks xmlns:a="http://schemas.openxmlformats.org/drawingml/2006/main" noChangeAspect="1"/>
+            </wp:cNvGraphicFramePr>
+            <a:graphic xmlns:a="http://schemas.openxmlformats.org/drawingml/2006/main">
+              <a:graphicData uri="http://schemas.openxmlformats.org/drawingml/2006/picture">
+                <pic:pic xmlns:pic="http://schemas.openxmlformats.org/drawingml/2006/picture">
+                  <pic:nvPicPr>
+                    <pic:cNvPr id="81" name="Picture 53"/>
+                    <pic:cNvPicPr>
+                      <a:picLocks noChangeAspect="1"/>
+                    </pic:cNvPicPr>
+                  </pic:nvPicPr>
+                  <pic:blipFill>
+                    <a:blip r:embed="rId92"/>
+                    <a:stretch>
+                      <a:fillRect/>
+                    </a:stretch>
+                  </pic:blipFill>
+                  <pic:spPr>
+                    <a:xfrm>
+                      <a:off x="0" y="0"/>
+                      <a:ext cx="3587750" cy="1397000"/>
+                    </a:xfrm>
+                    <a:prstGeom prst="rect">
+                      <a:avLst/>
+                    </a:prstGeom>
+                    <a:noFill/>
+                    <a:ln>
+                      <a:noFill/>
+                    </a:ln>
+                  </pic:spPr>
+                </pic:pic>
+              </a:graphicData>
+            </a:graphic>
+          </wp:inline>
+        </w:drawing>
+      </w:r>
+      <w:r>
+        <w:rPr>
+          <w:rFonts w:hint="default" w:ascii="Sitka Subheading" w:hAnsi="Sitka Subheading" w:cs="Sitka Subheading"/>
+          <w:lang w:val="en-IN"/>
+        </w:rPr>
+        <w:t xml:space="preserve"> [red to vm2]</w:t>
+      </w:r>
+      <w:r>
+        <w:rPr>
+          <w:rFonts w:hint="default" w:ascii="Sitka Subheading" w:hAnsi="Sitka Subheading" w:cs="Sitka Subheading"/>
+          <w:lang w:val="en-IN"/>
+        </w:rPr>
+        <w:br w:type="textWrapping"/>
+      </w:r>
+      <w:r>
+        <w:rPr>
+          <w:rFonts w:hint="default" w:ascii="Sitka Subheading" w:hAnsi="Sitka Subheading" w:cs="Sitka Subheading"/>
+        </w:rPr>
+        <w:drawing>
+          <wp:inline distT="0" distB="0" distL="114300" distR="114300">
+            <wp:extent cx="3587750" cy="1397000"/>
+            <wp:effectExtent l="0" t="0" r="6350" b="0"/>
+            <wp:docPr id="82" name="Picture 54"/>
+            <wp:cNvGraphicFramePr>
+              <a:graphicFrameLocks xmlns:a="http://schemas.openxmlformats.org/drawingml/2006/main" noChangeAspect="1"/>
+            </wp:cNvGraphicFramePr>
+            <a:graphic xmlns:a="http://schemas.openxmlformats.org/drawingml/2006/main">
+              <a:graphicData uri="http://schemas.openxmlformats.org/drawingml/2006/picture">
+                <pic:pic xmlns:pic="http://schemas.openxmlformats.org/drawingml/2006/picture">
+                  <pic:nvPicPr>
+                    <pic:cNvPr id="82" name="Picture 54"/>
+                    <pic:cNvPicPr>
+                      <a:picLocks noChangeAspect="1"/>
+                    </pic:cNvPicPr>
+                  </pic:nvPicPr>
+                  <pic:blipFill>
+                    <a:blip r:embed="rId93"/>
+                    <a:stretch>
+                      <a:fillRect/>
+                    </a:stretch>
+                  </pic:blipFill>
+                  <pic:spPr>
+                    <a:xfrm>
+                      <a:off x="0" y="0"/>
+                      <a:ext cx="3587750" cy="1397000"/>
+                    </a:xfrm>
+                    <a:prstGeom prst="rect">
+                      <a:avLst/>
+                    </a:prstGeom>
+                    <a:noFill/>
+                    <a:ln>
+                      <a:noFill/>
+                    </a:ln>
+                  </pic:spPr>
+                </pic:pic>
+              </a:graphicData>
+            </a:graphic>
+          </wp:inline>
+        </w:drawing>
+      </w:r>
+      <w:r>
+        <w:rPr>
+          <w:rFonts w:hint="default" w:ascii="Sitka Subheading" w:hAnsi="Sitka Subheading" w:cs="Sitka Subheading"/>
+          <w:lang w:val="en-IN"/>
+        </w:rPr>
+        <w:t xml:space="preserve"> [blue to vm2]</w:t>
+      </w:r>
+    </w:p>
+    <w:p>
+      <w:pPr>
+        <w:numPr>
+          <w:ilvl w:val="1"/>
+          <w:numId w:val="11"/>
+        </w:numPr>
+        <w:spacing w:line="360" w:lineRule="auto"/>
+        <w:ind w:left="840" w:leftChars="0" w:hanging="420" w:firstLineChars="0"/>
+        <w:rPr>
+          <w:rFonts w:hint="default" w:ascii="Sitka Subheading" w:hAnsi="Sitka Subheading" w:cs="Sitka Subheading"/>
+        </w:rPr>
+      </w:pPr>
+      <w:r>
+        <w:rPr>
+          <w:rFonts w:hint="default" w:ascii="Sitka Subheading" w:hAnsi="Sitka Subheading" w:cs="Sitka Subheading"/>
+          <w:lang w:val="en-IN"/>
+        </w:rPr>
+        <w:t xml:space="preserve">But, </w:t>
+      </w:r>
+      <w:r>
+        <w:rPr>
+          <w:rFonts w:hint="default" w:ascii="Sitka Subheading" w:hAnsi="Sitka Subheading" w:cs="Sitka Subheading"/>
+          <w:b/>
+          <w:bCs/>
+          <w:lang w:val="en-IN"/>
+        </w:rPr>
+        <w:t>vm2</w:t>
+      </w:r>
+      <w:r>
+        <w:rPr>
+          <w:rFonts w:hint="default" w:ascii="Sitka Subheading" w:hAnsi="Sitka Subheading" w:cs="Sitka Subheading"/>
+          <w:b w:val="0"/>
+          <w:bCs w:val="0"/>
+          <w:lang w:val="en-IN"/>
+        </w:rPr>
+        <w:t xml:space="preserve"> to </w:t>
+      </w:r>
+      <w:r>
+        <w:rPr>
+          <w:rFonts w:hint="default" w:ascii="Sitka Subheading" w:hAnsi="Sitka Subheading" w:cs="Sitka Subheading"/>
+          <w:b/>
+          <w:bCs/>
+          <w:lang w:val="en-IN"/>
+        </w:rPr>
+        <w:t>namespace</w:t>
+      </w:r>
+      <w:r>
+        <w:rPr>
+          <w:rFonts w:hint="default" w:ascii="Sitka Subheading" w:hAnsi="Sitka Subheading" w:cs="Sitka Subheading"/>
+          <w:b w:val="0"/>
+          <w:bCs w:val="0"/>
+          <w:lang w:val="en-IN"/>
+        </w:rPr>
+        <w:t xml:space="preserve"> will not be accessible.</w:t>
+      </w:r>
+      <w:r>
+        <w:rPr>
+          <w:rFonts w:hint="default" w:ascii="Sitka Subheading" w:hAnsi="Sitka Subheading" w:cs="Sitka Subheading"/>
+          <w:b w:val="0"/>
+          <w:bCs w:val="0"/>
+          <w:lang w:val="en-IN"/>
+        </w:rPr>
+        <w:br w:type="textWrapping"/>
+      </w:r>
+      <w:r>
+        <w:rPr>
+          <w:rFonts w:hint="default" w:ascii="Sitka Subheading" w:hAnsi="Sitka Subheading" w:cs="Sitka Subheading"/>
+          <w:b w:val="0"/>
+          <w:bCs w:val="0"/>
+          <w:lang w:val="en-IN"/>
+        </w:rPr>
+        <w:t xml:space="preserve">Namespace to vm2: </w:t>
+      </w:r>
+      <w:r>
+        <w:rPr>
+          <w:rFonts w:hint="default" w:ascii="Sitka Subheading" w:hAnsi="Sitka Subheading" w:cs="Sitka Subheading"/>
+          <w:b w:val="0"/>
+          <w:bCs w:val="0"/>
+          <w:lang w:val="en-IN"/>
+        </w:rPr>
+        <w:br w:type="textWrapping"/>
+      </w:r>
+      <w:r>
+        <w:rPr>
+          <w:rFonts w:hint="default" w:ascii="Sitka Subheading" w:hAnsi="Sitka Subheading" w:cs="Sitka Subheading"/>
+          <w:b w:val="0"/>
+          <w:bCs w:val="0"/>
+          <w:lang w:val="en-IN"/>
+        </w:rPr>
+        <w:t xml:space="preserve">when vm2 receives the packet, </w:t>
+      </w:r>
+      <w:r>
+        <w:rPr>
+          <w:rFonts w:hint="default" w:ascii="Sitka Subheading" w:hAnsi="Sitka Subheading" w:cs="Sitka Subheading"/>
+          <w:b w:val="0"/>
+          <w:bCs w:val="0"/>
           <w:i/>
           <w:iCs/>
-          <w:lang w:val="en-IN"/>
-        </w:rPr>
-        <w:t>network-ip</w:t>
-      </w:r>
-      <w:r>
-        <w:rPr>
-          <w:rFonts w:hint="default" w:ascii="Sitka Subheading" w:hAnsi="Sitka Subheading" w:cs="Sitka Subheading"/>
-          <w:lang w:val="en-IN"/>
-        </w:rPr>
-        <w:t xml:space="preserve"> first go to </w:t>
-      </w:r>
-      <w:r>
-        <w:rPr>
-          <w:rFonts w:hint="default" w:ascii="Sitka Subheading" w:hAnsi="Sitka Subheading" w:cs="Sitka Subheading"/>
+          <w:color w:val="18605A" w:themeColor="accent5" w:themeShade="80"/>
+          <w:lang w:val="en-IN"/>
+        </w:rPr>
+        <w:t>src ip:</w:t>
+      </w:r>
+      <w:r>
+        <w:rPr>
+          <w:rFonts w:hint="default" w:ascii="Sitka Subheading" w:hAnsi="Sitka Subheading" w:cs="Sitka Subheading"/>
+          <w:b w:val="0"/>
+          <w:bCs w:val="0"/>
           <w:i/>
           <w:iCs/>
           <w:lang w:val="en-IN"/>
         </w:rPr>
-        <w:t>gateway-ip</w:t>
-      </w:r>
-      <w:r>
-        <w:rPr>
-          <w:rFonts w:hint="default" w:ascii="Sitka Subheading" w:hAnsi="Sitka Subheading" w:cs="Sitka Subheading"/>
+        <w:t xml:space="preserve"> vm1’s ip</w:t>
+      </w:r>
+      <w:r>
+        <w:rPr>
+          <w:rFonts w:hint="default" w:ascii="Sitka Subheading" w:hAnsi="Sitka Subheading" w:cs="Sitka Subheading"/>
+          <w:b w:val="0"/>
+          <w:bCs w:val="0"/>
+          <w:lang w:val="en-IN"/>
+        </w:rPr>
+        <w:t xml:space="preserve">, </w:t>
+      </w:r>
+      <w:r>
+        <w:rPr>
+          <w:rFonts w:hint="default" w:ascii="Sitka Subheading" w:hAnsi="Sitka Subheading" w:cs="Sitka Subheading"/>
+          <w:b w:val="0"/>
+          <w:bCs w:val="0"/>
+          <w:i/>
+          <w:iCs/>
+          <w:color w:val="18605A" w:themeColor="accent5" w:themeShade="80"/>
+          <w:lang w:val="en-IN"/>
+        </w:rPr>
+        <w:t>dest ip:</w:t>
+      </w:r>
+      <w:r>
+        <w:rPr>
+          <w:rFonts w:hint="default" w:ascii="Sitka Subheading" w:hAnsi="Sitka Subheading" w:cs="Sitka Subheading"/>
+          <w:b w:val="0"/>
+          <w:bCs w:val="0"/>
+          <w:i/>
+          <w:iCs/>
+          <w:lang w:val="en-IN"/>
+        </w:rPr>
+        <w:t xml:space="preserve"> vm2’s ip</w:t>
+      </w:r>
+      <w:r>
+        <w:rPr>
+          <w:rFonts w:hint="default" w:ascii="Sitka Subheading" w:hAnsi="Sitka Subheading" w:cs="Sitka Subheading"/>
+          <w:b w:val="0"/>
+          <w:bCs w:val="0"/>
+          <w:lang w:val="en-IN"/>
+        </w:rPr>
+        <w:br w:type="textWrapping"/>
+      </w:r>
+      <w:r>
+        <w:rPr>
+          <w:rFonts w:hint="default" w:ascii="Sitka Subheading" w:hAnsi="Sitka Subheading" w:cs="Sitka Subheading"/>
+          <w:b w:val="0"/>
+          <w:bCs w:val="0"/>
+          <w:lang w:val="en-IN"/>
+        </w:rPr>
+        <w:t xml:space="preserve">so, vm2 also sends the packet, </w:t>
+      </w:r>
+      <w:r>
+        <w:rPr>
+          <w:rFonts w:hint="default" w:ascii="Sitka Subheading" w:hAnsi="Sitka Subheading" w:cs="Sitka Subheading"/>
+          <w:b w:val="0"/>
+          <w:bCs w:val="0"/>
+          <w:i/>
+          <w:iCs/>
+          <w:color w:val="18605A" w:themeColor="accent5" w:themeShade="80"/>
+          <w:lang w:val="en-IN"/>
+        </w:rPr>
+        <w:t xml:space="preserve">src ip: </w:t>
+      </w:r>
+      <w:r>
+        <w:rPr>
+          <w:rFonts w:hint="default" w:ascii="Sitka Subheading" w:hAnsi="Sitka Subheading" w:cs="Sitka Subheading"/>
+          <w:b w:val="0"/>
+          <w:bCs w:val="0"/>
+          <w:i/>
+          <w:iCs/>
+          <w:lang w:val="en-IN"/>
+        </w:rPr>
+        <w:t xml:space="preserve">vm2’s ip, </w:t>
+      </w:r>
+      <w:r>
+        <w:rPr>
+          <w:rFonts w:hint="default" w:ascii="Sitka Subheading" w:hAnsi="Sitka Subheading" w:cs="Sitka Subheading"/>
+          <w:b w:val="0"/>
+          <w:bCs w:val="0"/>
+          <w:i/>
+          <w:iCs/>
+          <w:color w:val="18605A" w:themeColor="accent5" w:themeShade="80"/>
+          <w:lang w:val="en-IN"/>
+        </w:rPr>
+        <w:t>dest ip:</w:t>
+      </w:r>
+      <w:r>
+        <w:rPr>
+          <w:rFonts w:hint="default" w:ascii="Sitka Subheading" w:hAnsi="Sitka Subheading" w:cs="Sitka Subheading"/>
+          <w:b w:val="0"/>
+          <w:bCs w:val="0"/>
+          <w:i/>
+          <w:iCs/>
+          <w:lang w:val="en-IN"/>
+        </w:rPr>
+        <w:t xml:space="preserve"> vm1’s ip</w:t>
+      </w:r>
+      <w:r>
+        <w:rPr>
+          <w:rFonts w:hint="default" w:ascii="Sitka Subheading" w:hAnsi="Sitka Subheading" w:cs="Sitka Subheading"/>
+          <w:b w:val="0"/>
+          <w:bCs w:val="0"/>
           <w:i w:val="0"/>
           <w:iCs w:val="0"/>
           <w:lang w:val="en-IN"/>
         </w:rPr>
         <w:t xml:space="preserve"> </w:t>
       </w:r>
+      <w:r>
+        <w:rPr>
+          <w:rFonts w:hint="default" w:ascii="Sitka Subheading" w:hAnsi="Sitka Subheading" w:cs="Sitka Subheading"/>
+          <w:b w:val="0"/>
+          <w:bCs w:val="0"/>
+          <w:i w:val="0"/>
+          <w:iCs w:val="0"/>
+          <w:lang w:val="en-IN"/>
+        </w:rPr>
+        <w:br w:type="textWrapping"/>
+      </w:r>
+      <w:r>
+        <w:rPr>
+          <w:rFonts w:hint="default" w:ascii="Sitka Subheading" w:hAnsi="Sitka Subheading" w:cs="Sitka Subheading"/>
+          <w:b w:val="0"/>
+          <w:bCs w:val="0"/>
+          <w:i w:val="0"/>
+          <w:iCs w:val="0"/>
+          <w:lang w:val="en-IN"/>
+        </w:rPr>
+        <w:t>at the end, vm1 forward the packet to namespace.</w:t>
+      </w:r>
+      <w:r>
+        <w:rPr>
+          <w:rFonts w:hint="default" w:ascii="Sitka Subheading" w:hAnsi="Sitka Subheading" w:cs="Sitka Subheading"/>
+          <w:b w:val="0"/>
+          <w:bCs w:val="0"/>
+          <w:i w:val="0"/>
+          <w:iCs w:val="0"/>
+          <w:lang w:val="en-IN"/>
+        </w:rPr>
+        <w:br w:type="textWrapping"/>
+      </w:r>
+      <w:r>
+        <w:rPr>
+          <w:rFonts w:hint="default" w:ascii="Sitka Subheading" w:hAnsi="Sitka Subheading" w:cs="Sitka Subheading"/>
+          <w:b w:val="0"/>
+          <w:bCs w:val="0"/>
+          <w:i w:val="0"/>
+          <w:iCs w:val="0"/>
+          <w:lang w:val="en-IN"/>
+        </w:rPr>
+        <w:t>[ in this scenario, vm2 is sending packet to vm1 only, not to namespace ]</w:t>
+      </w:r>
+    </w:p>
+    <w:p>
+      <w:pPr>
+        <w:numPr>
+          <w:ilvl w:val="1"/>
+          <w:numId w:val="11"/>
+        </w:numPr>
+        <w:spacing w:line="360" w:lineRule="auto"/>
+        <w:ind w:left="840" w:leftChars="0" w:hanging="420" w:firstLineChars="0"/>
+        <w:rPr>
+          <w:rFonts w:hint="default" w:ascii="Sitka Subheading" w:hAnsi="Sitka Subheading" w:cs="Sitka Subheading"/>
+        </w:rPr>
+      </w:pPr>
+      <w:r>
+        <w:rPr>
+          <w:rFonts w:hint="default" w:ascii="Sitka Subheading" w:hAnsi="Sitka Subheading" w:cs="Sitka Subheading"/>
+          <w:lang w:val="en-IN"/>
+        </w:rPr>
+        <w:t>But, directly if you try to access namespace from vm2 it’ll not work because vm2 doesn’t know about namespace.</w:t>
+      </w:r>
+      <w:r>
+        <w:rPr>
+          <w:rFonts w:hint="default" w:ascii="Sitka Subheading" w:hAnsi="Sitka Subheading" w:cs="Sitka Subheading"/>
+          <w:lang w:val="en-IN"/>
+        </w:rPr>
+        <w:br w:type="textWrapping"/>
+      </w:r>
+      <w:r>
+        <w:rPr>
+          <w:rFonts w:hint="default" w:ascii="Sitka Subheading" w:hAnsi="Sitka Subheading" w:cs="Sitka Subheading"/>
+          <w:color w:val="795D01" w:themeColor="accent3" w:themeShade="80"/>
+          <w:lang w:val="en-IN"/>
+        </w:rPr>
+        <w:t xml:space="preserve">If you want this only, then </w:t>
+      </w:r>
+      <w:r>
+        <w:rPr>
+          <w:rFonts w:hint="default" w:ascii="Sitka Subheading" w:hAnsi="Sitka Subheading" w:cs="Sitka Subheading"/>
+          <w:b/>
+          <w:bCs/>
+          <w:color w:val="795D01" w:themeColor="accent3" w:themeShade="80"/>
+          <w:lang w:val="en-IN"/>
+        </w:rPr>
+        <w:t>route</w:t>
+      </w:r>
+      <w:r>
+        <w:rPr>
+          <w:rFonts w:hint="default" w:ascii="Sitka Subheading" w:hAnsi="Sitka Subheading" w:cs="Sitka Subheading"/>
+          <w:b w:val="0"/>
+          <w:bCs w:val="0"/>
+          <w:color w:val="795D01" w:themeColor="accent3" w:themeShade="80"/>
+          <w:lang w:val="en-IN"/>
+        </w:rPr>
+        <w:t xml:space="preserve"> needs to be added in </w:t>
+      </w:r>
+      <w:r>
+        <w:rPr>
+          <w:rFonts w:hint="default" w:ascii="Sitka Subheading" w:hAnsi="Sitka Subheading" w:cs="Sitka Subheading"/>
+          <w:b/>
+          <w:bCs/>
+          <w:color w:val="795D01" w:themeColor="accent3" w:themeShade="80"/>
+          <w:lang w:val="en-IN"/>
+        </w:rPr>
+        <w:t>vm2</w:t>
+      </w:r>
+      <w:r>
+        <w:rPr>
+          <w:rFonts w:hint="default" w:ascii="Sitka Subheading" w:hAnsi="Sitka Subheading" w:cs="Sitka Subheading"/>
+          <w:b w:val="0"/>
+          <w:bCs w:val="0"/>
+          <w:color w:val="795D01" w:themeColor="accent3" w:themeShade="80"/>
+          <w:lang w:val="en-IN"/>
+        </w:rPr>
+        <w:t xml:space="preserve"> </w:t>
+      </w:r>
+      <w:r>
+        <w:rPr>
+          <w:rFonts w:hint="default" w:ascii="Sitka Subheading" w:hAnsi="Sitka Subheading" w:cs="Sitka Subheading"/>
+          <w:b w:val="0"/>
+          <w:bCs w:val="0"/>
+          <w:lang w:val="en-IN"/>
+        </w:rPr>
+        <w:t>.</w:t>
+      </w:r>
+    </w:p>
+    <w:p>
+      <w:pPr>
+        <w:numPr>
+          <w:ilvl w:val="1"/>
+          <w:numId w:val="11"/>
+        </w:numPr>
+        <w:spacing w:line="360" w:lineRule="auto"/>
+        <w:ind w:left="840" w:leftChars="0" w:hanging="420" w:firstLineChars="0"/>
+        <w:rPr>
+          <w:rFonts w:hint="default" w:ascii="Sitka Subheading" w:hAnsi="Sitka Subheading" w:cs="Sitka Subheading"/>
+        </w:rPr>
+      </w:pPr>
+      <w:r>
+        <w:rPr>
+          <w:rFonts w:hint="default" w:ascii="Sitka Subheading" w:hAnsi="Sitka Subheading" w:cs="Sitka Subheading"/>
+          <w:b/>
+          <w:bCs/>
+          <w:lang w:val="en-IN"/>
+        </w:rPr>
+        <w:t>Port forwarding</w:t>
+      </w:r>
+      <w:r>
+        <w:rPr>
+          <w:rFonts w:hint="default" w:ascii="Sitka Subheading" w:hAnsi="Sitka Subheading" w:cs="Sitka Subheading"/>
+          <w:b w:val="0"/>
+          <w:bCs w:val="0"/>
+          <w:lang w:val="en-IN"/>
+        </w:rPr>
+        <w:t xml:space="preserve"> can be used in this case.</w:t>
+      </w:r>
+      <w:r>
+        <w:rPr>
+          <w:rFonts w:hint="default" w:ascii="Sitka Subheading" w:hAnsi="Sitka Subheading" w:cs="Sitka Subheading"/>
+          <w:b w:val="0"/>
+          <w:bCs w:val="0"/>
+          <w:lang w:val="en-IN"/>
+        </w:rPr>
+        <w:br w:type="textWrapping"/>
+      </w:r>
+      <w:r>
+        <w:rPr>
+          <w:rFonts w:hint="default" w:ascii="Sitka Subheading" w:hAnsi="Sitka Subheading" w:cs="Sitka Subheading"/>
+          <w:b w:val="0"/>
+          <w:bCs w:val="0"/>
+          <w:lang w:val="en-IN"/>
+        </w:rPr>
+        <w:t>Vm2 will send packet to vm1 at a particular port. Vm1 will forward the packet to namespace.</w:t>
+      </w:r>
+      <w:r>
+        <w:rPr>
+          <w:rFonts w:hint="default" w:ascii="Sitka Subheading" w:hAnsi="Sitka Subheading" w:cs="Sitka Subheading"/>
+          <w:b w:val="0"/>
+          <w:bCs w:val="0"/>
+          <w:lang w:val="en-IN"/>
+        </w:rPr>
+        <w:br w:type="textWrapping"/>
+      </w:r>
+      <w:r>
+        <w:rPr>
+          <w:rFonts w:hint="default" w:ascii="Sitka Subheading" w:hAnsi="Sitka Subheading" w:cs="Sitka Subheading"/>
+          <w:b w:val="0"/>
+          <w:bCs w:val="0"/>
+          <w:lang w:val="en-IN"/>
+        </w:rPr>
+        <w:t xml:space="preserve">It is </w:t>
+      </w:r>
+      <w:r>
+        <w:rPr>
+          <w:rFonts w:hint="default" w:ascii="Sitka Subheading" w:hAnsi="Sitka Subheading" w:cs="Sitka Subheading"/>
+          <w:b/>
+          <w:bCs/>
+          <w:lang w:val="en-IN"/>
+        </w:rPr>
+        <w:t>DNAT</w:t>
+      </w:r>
+      <w:r>
+        <w:rPr>
+          <w:rFonts w:hint="default" w:ascii="Sitka Subheading" w:hAnsi="Sitka Subheading" w:cs="Sitka Subheading"/>
+          <w:b w:val="0"/>
+          <w:bCs w:val="0"/>
+          <w:lang w:val="en-IN"/>
+        </w:rPr>
+        <w:t>.</w:t>
+      </w:r>
+    </w:p>
+    <w:p>
+      <w:pPr>
+        <w:numPr>
+          <w:ilvl w:val="1"/>
+          <w:numId w:val="11"/>
+        </w:numPr>
+        <w:spacing w:line="360" w:lineRule="auto"/>
+        <w:ind w:left="840" w:leftChars="0" w:hanging="420" w:firstLineChars="0"/>
+        <w:rPr>
+          <w:rFonts w:hint="default" w:ascii="Sitka Subheading" w:hAnsi="Sitka Subheading" w:cs="Sitka Subheading"/>
+        </w:rPr>
+      </w:pPr>
+      <w:r>
+        <w:rPr>
+          <w:rFonts w:hint="default" w:ascii="Sitka Subheading" w:hAnsi="Sitka Subheading" w:cs="Sitka Subheading"/>
+          <w:b/>
+          <w:bCs/>
+          <w:color w:val="851321" w:themeColor="accent6" w:themeShade="80"/>
+          <w:shd w:val="clear" w:color="auto" w:fill="auto"/>
+        </w:rPr>
+        <w:t xml:space="preserve">iptables -t nat -A PREROUTING -p tcp --dport </w:t>
+      </w:r>
+      <w:r>
+        <w:rPr>
+          <w:rFonts w:hint="default" w:ascii="Sitka Subheading" w:hAnsi="Sitka Subheading" w:cs="Sitka Subheading"/>
+          <w:b w:val="0"/>
+          <w:bCs w:val="0"/>
+          <w:color w:val="851321" w:themeColor="accent6" w:themeShade="80"/>
+          <w:shd w:val="clear" w:color="auto" w:fill="auto"/>
+        </w:rPr>
+        <w:t>8080</w:t>
+      </w:r>
+      <w:r>
+        <w:rPr>
+          <w:rFonts w:hint="default" w:ascii="Sitka Subheading" w:hAnsi="Sitka Subheading" w:cs="Sitka Subheading"/>
+          <w:b/>
+          <w:bCs/>
+          <w:color w:val="851321" w:themeColor="accent6" w:themeShade="80"/>
+          <w:shd w:val="clear" w:color="auto" w:fill="auto"/>
+        </w:rPr>
+        <w:t xml:space="preserve"> -j DNAT --to-destination </w:t>
+      </w:r>
+      <w:r>
+        <w:rPr>
+          <w:rFonts w:hint="default" w:ascii="Sitka Subheading" w:hAnsi="Sitka Subheading" w:cs="Sitka Subheading"/>
+          <w:b w:val="0"/>
+          <w:bCs w:val="0"/>
+          <w:color w:val="851321" w:themeColor="accent6" w:themeShade="80"/>
+          <w:shd w:val="clear" w:color="auto" w:fill="auto"/>
+        </w:rPr>
+        <w:t>192.168.15.2:80</w:t>
+      </w:r>
+      <w:r>
+        <w:rPr>
+          <w:rFonts w:hint="default" w:ascii="Sitka Subheading" w:hAnsi="Sitka Subheading" w:cs="Sitka Subheading"/>
+        </w:rPr>
+        <w:br w:type="textWrapping"/>
+      </w:r>
+      <w:r>
+        <w:rPr>
+          <w:rFonts w:hint="default" w:ascii="Sitka Subheading" w:hAnsi="Sitka Subheading" w:cs="Sitka Subheading"/>
+        </w:rPr>
+        <w:t>Packets arriving on port 8080</w:t>
+      </w:r>
+      <w:r>
+        <w:rPr>
+          <w:rFonts w:hint="default" w:ascii="Sitka Subheading" w:hAnsi="Sitka Subheading" w:cs="Sitka Subheading"/>
+          <w:lang w:val="en-IN"/>
+        </w:rPr>
+        <w:t xml:space="preserve"> </w:t>
+      </w:r>
+      <w:r>
+        <w:rPr>
+          <w:rFonts w:hint="default" w:ascii="Sitka Subheading" w:hAnsi="Sitka Subheading" w:cs="Sitka Subheading"/>
+        </w:rPr>
+        <w:t>should be redirected to namespace 192.168.15.2:80</w:t>
+      </w:r>
+    </w:p>
+    <w:p>
+      <w:pPr>
+        <w:numPr>
+          <w:ilvl w:val="1"/>
+          <w:numId w:val="11"/>
+        </w:numPr>
+        <w:spacing w:line="360" w:lineRule="auto"/>
+        <w:ind w:left="840" w:leftChars="0" w:hanging="420" w:firstLineChars="0"/>
+        <w:rPr>
+          <w:rFonts w:hint="default" w:ascii="Sitka Subheading" w:hAnsi="Sitka Subheading" w:cs="Sitka Subheading"/>
+        </w:rPr>
+      </w:pPr>
+      <w:r>
+        <w:rPr>
+          <w:rFonts w:hint="default" w:ascii="Sitka Subheading" w:hAnsi="Sitka Subheading" w:cs="Sitka Subheading"/>
+          <w:lang w:val="en-IN"/>
+        </w:rPr>
+        <w:t xml:space="preserve">I ran a simple nodejs in namespace </w:t>
+      </w:r>
+      <w:r>
+        <w:rPr>
+          <w:rFonts w:hint="default" w:ascii="Sitka Subheading" w:hAnsi="Sitka Subheading" w:cs="Sitka Subheading"/>
+          <w:i/>
+          <w:iCs/>
+          <w:lang w:val="en-IN"/>
+        </w:rPr>
+        <w:t>red</w:t>
+      </w:r>
+      <w:r>
+        <w:rPr>
+          <w:rFonts w:hint="default" w:ascii="Sitka Subheading" w:hAnsi="Sitka Subheading" w:cs="Sitka Subheading"/>
+          <w:i w:val="0"/>
+          <w:iCs w:val="0"/>
+          <w:lang w:val="en-IN"/>
+        </w:rPr>
+        <w:t xml:space="preserve"> on port 80,</w:t>
+      </w:r>
+      <w:r>
+        <w:rPr>
+          <w:rFonts w:hint="default" w:ascii="Sitka Subheading" w:hAnsi="Sitka Subheading" w:cs="Sitka Subheading"/>
+          <w:i w:val="0"/>
+          <w:iCs w:val="0"/>
+          <w:lang w:val="en-IN"/>
+        </w:rPr>
+        <w:br w:type="textWrapping"/>
+      </w:r>
+      <w:r>
+        <w:rPr>
+          <w:rFonts w:hint="default" w:ascii="Sitka Subheading" w:hAnsi="Sitka Subheading" w:cs="Sitka Subheading"/>
+          <w:i w:val="0"/>
+          <w:iCs w:val="0"/>
+          <w:lang w:val="en-IN"/>
+        </w:rPr>
+        <w:t xml:space="preserve">curl </w:t>
+      </w:r>
+      <w:r>
+        <w:rPr>
+          <w:rFonts w:hint="default" w:ascii="Sitka Subheading" w:hAnsi="Sitka Subheading" w:cs="Sitka Subheading"/>
+          <w:i w:val="0"/>
+          <w:iCs w:val="0"/>
+          <w:lang w:val="en-IN"/>
+        </w:rPr>
+        <w:fldChar w:fldCharType="begin"/>
+      </w:r>
+      <w:r>
+        <w:rPr>
+          <w:rFonts w:hint="default" w:ascii="Sitka Subheading" w:hAnsi="Sitka Subheading" w:cs="Sitka Subheading"/>
+          <w:i w:val="0"/>
+          <w:iCs w:val="0"/>
+          <w:lang w:val="en-IN"/>
+        </w:rPr>
+        <w:instrText xml:space="preserve"> HYPERLINK "http://10.10.10.10:8080" </w:instrText>
+      </w:r>
+      <w:r>
+        <w:rPr>
+          <w:rFonts w:hint="default" w:ascii="Sitka Subheading" w:hAnsi="Sitka Subheading" w:cs="Sitka Subheading"/>
+          <w:i w:val="0"/>
+          <w:iCs w:val="0"/>
+          <w:lang w:val="en-IN"/>
+        </w:rPr>
+        <w:fldChar w:fldCharType="separate"/>
+      </w:r>
+      <w:r>
+        <w:rPr>
+          <w:rStyle w:val="51"/>
+          <w:rFonts w:hint="default" w:ascii="Sitka Subheading" w:hAnsi="Sitka Subheading" w:cs="Sitka Subheading"/>
+          <w:i w:val="0"/>
+          <w:iCs w:val="0"/>
+          <w:lang w:val="en-IN"/>
+        </w:rPr>
+        <w:t>http://10.10.10.10:8080</w:t>
+      </w:r>
+      <w:r>
+        <w:rPr>
+          <w:rFonts w:hint="default" w:ascii="Sitka Subheading" w:hAnsi="Sitka Subheading" w:cs="Sitka Subheading"/>
+          <w:i w:val="0"/>
+          <w:iCs w:val="0"/>
+          <w:lang w:val="en-IN"/>
+        </w:rPr>
+        <w:fldChar w:fldCharType="end"/>
+      </w:r>
+      <w:r>
+        <w:rPr>
+          <w:rFonts w:hint="default" w:ascii="Sitka Subheading" w:hAnsi="Sitka Subheading" w:cs="Sitka Subheading"/>
+          <w:i w:val="0"/>
+          <w:iCs w:val="0"/>
+          <w:lang w:val="en-IN"/>
+        </w:rPr>
+        <w:t xml:space="preserve">   [ from vm2 ]</w:t>
+      </w:r>
+      <w:r>
+        <w:rPr>
+          <w:rFonts w:hint="default" w:ascii="Sitka Subheading" w:hAnsi="Sitka Subheading" w:cs="Sitka Subheading"/>
+          <w:i w:val="0"/>
+          <w:iCs w:val="0"/>
+          <w:lang w:val="en-IN"/>
+        </w:rPr>
+        <w:br w:type="textWrapping"/>
+      </w:r>
+      <w:r>
+        <w:drawing>
+          <wp:inline distT="0" distB="0" distL="114300" distR="114300">
+            <wp:extent cx="2734945" cy="340995"/>
+            <wp:effectExtent l="0" t="0" r="8255" b="1905"/>
+            <wp:docPr id="84" name="Picture 55"/>
+            <wp:cNvGraphicFramePr>
+              <a:graphicFrameLocks xmlns:a="http://schemas.openxmlformats.org/drawingml/2006/main" noChangeAspect="1"/>
+            </wp:cNvGraphicFramePr>
+            <a:graphic xmlns:a="http://schemas.openxmlformats.org/drawingml/2006/main">
+              <a:graphicData uri="http://schemas.openxmlformats.org/drawingml/2006/picture">
+                <pic:pic xmlns:pic="http://schemas.openxmlformats.org/drawingml/2006/picture">
+                  <pic:nvPicPr>
+                    <pic:cNvPr id="84" name="Picture 55"/>
+                    <pic:cNvPicPr>
+                      <a:picLocks noChangeAspect="1"/>
+                    </pic:cNvPicPr>
+                  </pic:nvPicPr>
+                  <pic:blipFill>
+                    <a:blip r:embed="rId94"/>
+                    <a:stretch>
+                      <a:fillRect/>
+                    </a:stretch>
+                  </pic:blipFill>
+                  <pic:spPr>
+                    <a:xfrm>
+                      <a:off x="0" y="0"/>
+                      <a:ext cx="2734945" cy="340995"/>
+                    </a:xfrm>
+                    <a:prstGeom prst="rect">
+                      <a:avLst/>
+                    </a:prstGeom>
+                    <a:noFill/>
+                    <a:ln>
+                      <a:noFill/>
+                    </a:ln>
+                  </pic:spPr>
+                </pic:pic>
+              </a:graphicData>
+            </a:graphic>
+          </wp:inline>
+        </w:drawing>
+      </w:r>
+    </w:p>
+    <w:p>
+      <w:pPr>
+        <w:numPr>
+          <w:ilvl w:val="1"/>
+          <w:numId w:val="11"/>
+        </w:numPr>
+        <w:spacing w:line="360" w:lineRule="auto"/>
+        <w:ind w:left="840" w:leftChars="0" w:hanging="420" w:firstLineChars="0"/>
+        <w:rPr>
+          <w:rFonts w:hint="default" w:ascii="Sitka Subheading" w:hAnsi="Sitka Subheading" w:cs="Sitka Subheading"/>
+        </w:rPr>
+      </w:pPr>
     </w:p>
     <w:p>
       <w:pPr>
@@ -34229,6 +35619,2917 @@
           <w:rFonts w:hint="default" w:ascii="Sitka Subheading" w:hAnsi="Sitka Subheading" w:cs="Sitka Subheading"/>
         </w:rPr>
       </w:pPr>
+      <w:r>
+        <w:rPr>
+          <w:rFonts w:hint="default" w:ascii="Sitka Subheading" w:hAnsi="Sitka Subheading" w:cs="Sitka Subheading"/>
+          <w:lang w:val="en-IN"/>
+        </w:rPr>
+        <w:t>All commands used</w:t>
+      </w:r>
+    </w:p>
+    <w:p>
+      <w:pPr>
+        <w:numPr>
+          <w:ilvl w:val="1"/>
+          <w:numId w:val="11"/>
+        </w:numPr>
+        <w:spacing w:line="360" w:lineRule="auto"/>
+        <w:ind w:left="840" w:leftChars="0" w:hanging="420" w:firstLineChars="0"/>
+        <w:rPr>
+          <w:rFonts w:hint="default" w:ascii="Sitka Subheading" w:hAnsi="Sitka Subheading" w:cs="Sitka Subheading"/>
+        </w:rPr>
+      </w:pPr>
+      <w:r>
+        <w:rPr>
+          <w:rFonts w:hint="default" w:ascii="Sitka Subheading" w:hAnsi="Sitka Subheading" w:cs="Sitka Subheading"/>
+        </w:rPr>
+        <w:t>ip add</w:t>
+      </w:r>
+    </w:p>
+    <w:p>
+      <w:pPr>
+        <w:numPr>
+          <w:ilvl w:val="1"/>
+          <w:numId w:val="11"/>
+        </w:numPr>
+        <w:spacing w:line="360" w:lineRule="auto"/>
+        <w:ind w:left="840" w:leftChars="0" w:hanging="420" w:firstLineChars="0"/>
+        <w:rPr>
+          <w:rFonts w:hint="default" w:ascii="Sitka Subheading" w:hAnsi="Sitka Subheading" w:cs="Sitka Subheading"/>
+        </w:rPr>
+      </w:pPr>
+      <w:r>
+        <w:rPr>
+          <w:rFonts w:hint="default" w:ascii="Sitka Subheading" w:hAnsi="Sitka Subheading" w:cs="Sitka Subheading"/>
+        </w:rPr>
+        <w:t>ip netns add &lt;namespace-name&gt;</w:t>
+      </w:r>
+    </w:p>
+    <w:p>
+      <w:pPr>
+        <w:numPr>
+          <w:ilvl w:val="1"/>
+          <w:numId w:val="11"/>
+        </w:numPr>
+        <w:spacing w:line="360" w:lineRule="auto"/>
+        <w:ind w:left="840" w:leftChars="0" w:hanging="420" w:firstLineChars="0"/>
+        <w:rPr>
+          <w:rFonts w:hint="default" w:ascii="Sitka Subheading" w:hAnsi="Sitka Subheading" w:cs="Sitka Subheading"/>
+        </w:rPr>
+      </w:pPr>
+      <w:r>
+        <w:rPr>
+          <w:rFonts w:hint="default" w:ascii="Sitka Subheading" w:hAnsi="Sitka Subheading" w:cs="Sitka Subheading"/>
+        </w:rPr>
+        <w:t>ip netns list</w:t>
+      </w:r>
+    </w:p>
+    <w:p>
+      <w:pPr>
+        <w:numPr>
+          <w:ilvl w:val="1"/>
+          <w:numId w:val="11"/>
+        </w:numPr>
+        <w:spacing w:line="360" w:lineRule="auto"/>
+        <w:ind w:left="840" w:leftChars="0" w:hanging="420" w:firstLineChars="0"/>
+        <w:rPr>
+          <w:rFonts w:hint="default" w:ascii="Sitka Subheading" w:hAnsi="Sitka Subheading" w:cs="Sitka Subheading"/>
+        </w:rPr>
+      </w:pPr>
+      <w:r>
+        <w:rPr>
+          <w:rFonts w:hint="default" w:ascii="Sitka Subheading" w:hAnsi="Sitka Subheading" w:cs="Sitka Subheading"/>
+        </w:rPr>
+        <w:t>ip netns exec &lt;namespace-name&gt; &lt;command&gt;</w:t>
+      </w:r>
+      <w:r>
+        <w:rPr>
+          <w:rFonts w:hint="default" w:ascii="Sitka Subheading" w:hAnsi="Sitka Subheading" w:cs="Sitka Subheading"/>
+        </w:rPr>
+        <w:br w:type="textWrapping"/>
+      </w:r>
+      <w:r>
+        <w:rPr>
+          <w:rFonts w:hint="default" w:ascii="Sitka Subheading" w:hAnsi="Sitka Subheading" w:cs="Sitka Subheading"/>
+        </w:rPr>
+        <w:t>ip netns exec red ip add</w:t>
+      </w:r>
+    </w:p>
+    <w:p>
+      <w:pPr>
+        <w:numPr>
+          <w:ilvl w:val="1"/>
+          <w:numId w:val="11"/>
+        </w:numPr>
+        <w:spacing w:line="360" w:lineRule="auto"/>
+        <w:ind w:left="840" w:leftChars="0" w:hanging="420" w:firstLineChars="0"/>
+        <w:rPr>
+          <w:rFonts w:hint="default" w:ascii="Sitka Subheading" w:hAnsi="Sitka Subheading" w:cs="Sitka Subheading"/>
+        </w:rPr>
+      </w:pPr>
+      <w:r>
+        <w:rPr>
+          <w:rFonts w:hint="default" w:ascii="Sitka Subheading" w:hAnsi="Sitka Subheading" w:cs="Sitka Subheading"/>
+        </w:rPr>
+        <w:t>ip netns exec &lt;namespace-name&gt; route</w:t>
+      </w:r>
+      <w:r>
+        <w:rPr>
+          <w:rFonts w:hint="default" w:ascii="Sitka Subheading" w:hAnsi="Sitka Subheading" w:cs="Sitka Subheading"/>
+        </w:rPr>
+        <w:br w:type="textWrapping"/>
+      </w:r>
+      <w:r>
+        <w:rPr>
+          <w:rFonts w:hint="default" w:ascii="Sitka Subheading" w:hAnsi="Sitka Subheading" w:cs="Sitka Subheading"/>
+        </w:rPr>
+        <w:t>ip netns exec red route</w:t>
+      </w:r>
+    </w:p>
+    <w:p>
+      <w:pPr>
+        <w:numPr>
+          <w:ilvl w:val="1"/>
+          <w:numId w:val="11"/>
+        </w:numPr>
+        <w:spacing w:line="360" w:lineRule="auto"/>
+        <w:ind w:left="840" w:leftChars="0" w:hanging="420" w:firstLineChars="0"/>
+        <w:rPr>
+          <w:rFonts w:hint="default" w:ascii="Sitka Subheading" w:hAnsi="Sitka Subheading" w:cs="Sitka Subheading"/>
+        </w:rPr>
+      </w:pPr>
+      <w:r>
+        <w:rPr>
+          <w:rFonts w:hint="default" w:ascii="Sitka Subheading" w:hAnsi="Sitka Subheading" w:cs="Sitka Subheading"/>
+        </w:rPr>
+        <w:t>ip link add &lt;veth1&gt; type veth peer name &lt;veth2&gt;</w:t>
+      </w:r>
+      <w:r>
+        <w:rPr>
+          <w:rFonts w:hint="default" w:ascii="Sitka Subheading" w:hAnsi="Sitka Subheading" w:cs="Sitka Subheading"/>
+        </w:rPr>
+        <w:br w:type="textWrapping"/>
+      </w:r>
+      <w:r>
+        <w:rPr>
+          <w:rFonts w:hint="default" w:ascii="Sitka Subheading" w:hAnsi="Sitka Subheading" w:cs="Sitka Subheading"/>
+        </w:rPr>
+        <w:t>ip link add veth-red type veth peer name veth-blue</w:t>
+      </w:r>
+    </w:p>
+    <w:p>
+      <w:pPr>
+        <w:numPr>
+          <w:ilvl w:val="1"/>
+          <w:numId w:val="11"/>
+        </w:numPr>
+        <w:spacing w:line="360" w:lineRule="auto"/>
+        <w:ind w:left="840" w:leftChars="0" w:hanging="420" w:firstLineChars="0"/>
+        <w:rPr>
+          <w:rFonts w:hint="default" w:ascii="Sitka Subheading" w:hAnsi="Sitka Subheading" w:cs="Sitka Subheading"/>
+        </w:rPr>
+      </w:pPr>
+      <w:r>
+        <w:rPr>
+          <w:rFonts w:hint="default" w:ascii="Sitka Subheading" w:hAnsi="Sitka Subheading" w:cs="Sitka Subheading"/>
+        </w:rPr>
+        <w:t>ip link set &lt;veth-name&gt; netns &lt;namespace-name&gt;</w:t>
+      </w:r>
+      <w:r>
+        <w:rPr>
+          <w:rFonts w:hint="default" w:ascii="Sitka Subheading" w:hAnsi="Sitka Subheading" w:cs="Sitka Subheading"/>
+        </w:rPr>
+        <w:br w:type="textWrapping"/>
+      </w:r>
+      <w:r>
+        <w:rPr>
+          <w:rFonts w:hint="default" w:ascii="Sitka Subheading" w:hAnsi="Sitka Subheading" w:cs="Sitka Subheading"/>
+        </w:rPr>
+        <w:t>ip link set veth-red netns red</w:t>
+      </w:r>
+    </w:p>
+    <w:p>
+      <w:pPr>
+        <w:numPr>
+          <w:ilvl w:val="1"/>
+          <w:numId w:val="11"/>
+        </w:numPr>
+        <w:spacing w:line="360" w:lineRule="auto"/>
+        <w:ind w:left="840" w:leftChars="0" w:hanging="420" w:firstLineChars="0"/>
+        <w:rPr>
+          <w:rFonts w:hint="default" w:ascii="Sitka Subheading" w:hAnsi="Sitka Subheading" w:cs="Sitka Subheading"/>
+        </w:rPr>
+      </w:pPr>
+      <w:r>
+        <w:rPr>
+          <w:rFonts w:hint="default" w:ascii="Sitka Subheading" w:hAnsi="Sitka Subheading" w:cs="Sitka Subheading"/>
+        </w:rPr>
+        <w:t>ip netns exec &lt;namespace-name&gt; ip link set &lt;interface-name&gt; up</w:t>
+      </w:r>
+      <w:r>
+        <w:rPr>
+          <w:rFonts w:hint="default" w:ascii="Sitka Subheading" w:hAnsi="Sitka Subheading" w:cs="Sitka Subheading"/>
+        </w:rPr>
+        <w:br w:type="textWrapping"/>
+      </w:r>
+      <w:r>
+        <w:rPr>
+          <w:rFonts w:hint="default" w:ascii="Sitka Subheading" w:hAnsi="Sitka Subheading" w:cs="Sitka Subheading"/>
+        </w:rPr>
+        <w:t>ip netns exec red ip link set lo up</w:t>
+      </w:r>
+      <w:r>
+        <w:rPr>
+          <w:rFonts w:hint="default" w:ascii="Sitka Subheading" w:hAnsi="Sitka Subheading" w:cs="Sitka Subheading"/>
+        </w:rPr>
+        <w:br w:type="textWrapping"/>
+      </w:r>
+      <w:r>
+        <w:rPr>
+          <w:rFonts w:hint="default" w:ascii="Sitka Subheading" w:hAnsi="Sitka Subheading" w:cs="Sitka Subheading"/>
+        </w:rPr>
+        <w:t>ip netns exec red ip link set veth-red up</w:t>
+      </w:r>
+    </w:p>
+    <w:p>
+      <w:pPr>
+        <w:numPr>
+          <w:ilvl w:val="1"/>
+          <w:numId w:val="11"/>
+        </w:numPr>
+        <w:spacing w:line="360" w:lineRule="auto"/>
+        <w:ind w:left="840" w:leftChars="0" w:hanging="420" w:firstLineChars="0"/>
+        <w:rPr>
+          <w:rFonts w:hint="default" w:ascii="Sitka Subheading" w:hAnsi="Sitka Subheading" w:cs="Sitka Subheading"/>
+        </w:rPr>
+      </w:pPr>
+      <w:r>
+        <w:rPr>
+          <w:rFonts w:hint="default" w:ascii="Sitka Subheading" w:hAnsi="Sitka Subheading" w:cs="Sitka Subheading"/>
+        </w:rPr>
+        <w:t>ip netns exec &lt;namespace-name&gt; ip addr add &lt;ip&gt;/&lt;mask&gt; dev &lt;interface-name&gt;</w:t>
+      </w:r>
+      <w:r>
+        <w:rPr>
+          <w:rFonts w:hint="default" w:ascii="Sitka Subheading" w:hAnsi="Sitka Subheading" w:cs="Sitka Subheading"/>
+        </w:rPr>
+        <w:br w:type="textWrapping"/>
+      </w:r>
+      <w:r>
+        <w:rPr>
+          <w:rFonts w:hint="default" w:ascii="Sitka Subheading" w:hAnsi="Sitka Subheading" w:cs="Sitka Subheading"/>
+        </w:rPr>
+        <w:t>ip netns exec red ip addr add 192.168.15.2/24 dev veth-red</w:t>
+      </w:r>
+      <w:r>
+        <w:rPr>
+          <w:rFonts w:hint="default" w:ascii="Sitka Subheading" w:hAnsi="Sitka Subheading" w:cs="Sitka Subheading"/>
+        </w:rPr>
+        <w:br w:type="textWrapping"/>
+      </w:r>
+      <w:r>
+        <w:rPr>
+          <w:rFonts w:hint="default" w:ascii="Sitka Subheading" w:hAnsi="Sitka Subheading" w:cs="Sitka Subheading"/>
+        </w:rPr>
+        <w:t>ip netns exec blue ip addr add 192.168.15.3/24 dev veth-blue</w:t>
+      </w:r>
+    </w:p>
+    <w:p>
+      <w:pPr>
+        <w:numPr>
+          <w:ilvl w:val="1"/>
+          <w:numId w:val="11"/>
+        </w:numPr>
+        <w:spacing w:line="360" w:lineRule="auto"/>
+        <w:ind w:left="840" w:leftChars="0" w:hanging="420" w:firstLineChars="0"/>
+        <w:rPr>
+          <w:rFonts w:hint="default" w:ascii="Sitka Subheading" w:hAnsi="Sitka Subheading" w:cs="Sitka Subheading"/>
+        </w:rPr>
+      </w:pPr>
+      <w:r>
+        <w:rPr>
+          <w:rFonts w:hint="default" w:ascii="Sitka Subheading" w:hAnsi="Sitka Subheading" w:cs="Sitka Subheading"/>
+          <w:lang w:val="en-IN"/>
+        </w:rPr>
+        <w:t>-------------------</w:t>
+      </w:r>
+    </w:p>
+    <w:p>
+      <w:pPr>
+        <w:numPr>
+          <w:ilvl w:val="1"/>
+          <w:numId w:val="11"/>
+        </w:numPr>
+        <w:spacing w:line="360" w:lineRule="auto"/>
+        <w:ind w:left="840" w:leftChars="0" w:hanging="420" w:firstLineChars="0"/>
+        <w:rPr>
+          <w:rFonts w:hint="default" w:ascii="Sitka Subheading" w:hAnsi="Sitka Subheading" w:cs="Sitka Subheading"/>
+        </w:rPr>
+      </w:pPr>
+      <w:r>
+        <w:rPr>
+          <w:rFonts w:hint="default" w:ascii="Sitka Subheading" w:hAnsi="Sitka Subheading" w:cs="Sitka Subheading"/>
+        </w:rPr>
+        <w:t>Show all network interfaces</w:t>
+      </w:r>
+      <w:r>
+        <w:rPr>
+          <w:rFonts w:hint="default" w:ascii="Sitka Subheading" w:hAnsi="Sitka Subheading" w:cs="Sitka Subheading"/>
+        </w:rPr>
+        <w:br w:type="textWrapping"/>
+      </w:r>
+      <w:r>
+        <w:rPr>
+          <w:rFonts w:hint="default" w:ascii="Sitka Subheading" w:hAnsi="Sitka Subheading" w:cs="Sitka Subheading"/>
+        </w:rPr>
+        <w:t>ip add</w:t>
+      </w:r>
+    </w:p>
+    <w:p>
+      <w:pPr>
+        <w:numPr>
+          <w:ilvl w:val="1"/>
+          <w:numId w:val="11"/>
+        </w:numPr>
+        <w:spacing w:line="360" w:lineRule="auto"/>
+        <w:ind w:left="840" w:leftChars="0" w:hanging="420" w:firstLineChars="0"/>
+        <w:rPr>
+          <w:rFonts w:hint="default" w:ascii="Sitka Subheading" w:hAnsi="Sitka Subheading" w:cs="Sitka Subheading"/>
+        </w:rPr>
+      </w:pPr>
+      <w:r>
+        <w:rPr>
+          <w:rFonts w:hint="default" w:ascii="Sitka Subheading" w:hAnsi="Sitka Subheading" w:cs="Sitka Subheading"/>
+        </w:rPr>
+        <w:t>Create a network namespace</w:t>
+      </w:r>
+      <w:r>
+        <w:rPr>
+          <w:rFonts w:hint="default" w:ascii="Sitka Subheading" w:hAnsi="Sitka Subheading" w:cs="Sitka Subheading"/>
+        </w:rPr>
+        <w:br w:type="textWrapping"/>
+      </w:r>
+      <w:r>
+        <w:rPr>
+          <w:rFonts w:hint="default" w:ascii="Sitka Subheading" w:hAnsi="Sitka Subheading" w:cs="Sitka Subheading"/>
+        </w:rPr>
+        <w:t>ip netns add &lt;namespace-name&gt;</w:t>
+      </w:r>
+      <w:r>
+        <w:rPr>
+          <w:rFonts w:hint="default" w:ascii="Sitka Subheading" w:hAnsi="Sitka Subheading" w:cs="Sitka Subheading"/>
+        </w:rPr>
+        <w:br w:type="textWrapping"/>
+      </w:r>
+      <w:r>
+        <w:rPr>
+          <w:rFonts w:hint="default" w:ascii="Sitka Subheading" w:hAnsi="Sitka Subheading" w:cs="Sitka Subheading"/>
+          <w:i/>
+          <w:iCs/>
+          <w:lang w:val="en-IN"/>
+        </w:rPr>
+        <w:t>i</w:t>
+      </w:r>
+      <w:r>
+        <w:rPr>
+          <w:rFonts w:hint="default" w:ascii="Sitka Subheading" w:hAnsi="Sitka Subheading" w:cs="Sitka Subheading"/>
+          <w:i/>
+          <w:iCs/>
+        </w:rPr>
+        <w:t>p netns add red</w:t>
+      </w:r>
+    </w:p>
+    <w:p>
+      <w:pPr>
+        <w:numPr>
+          <w:ilvl w:val="1"/>
+          <w:numId w:val="11"/>
+        </w:numPr>
+        <w:spacing w:line="360" w:lineRule="auto"/>
+        <w:ind w:left="840" w:leftChars="0" w:hanging="420" w:firstLineChars="0"/>
+        <w:rPr>
+          <w:rFonts w:hint="default" w:ascii="Sitka Subheading" w:hAnsi="Sitka Subheading" w:cs="Sitka Subheading"/>
+        </w:rPr>
+      </w:pPr>
+      <w:r>
+        <w:rPr>
+          <w:rFonts w:hint="default" w:ascii="Sitka Subheading" w:hAnsi="Sitka Subheading" w:cs="Sitka Subheading"/>
+        </w:rPr>
+        <w:t>List all namespaces</w:t>
+      </w:r>
+      <w:r>
+        <w:rPr>
+          <w:rFonts w:hint="default" w:ascii="Sitka Subheading" w:hAnsi="Sitka Subheading" w:cs="Sitka Subheading"/>
+        </w:rPr>
+        <w:br w:type="textWrapping"/>
+      </w:r>
+      <w:r>
+        <w:rPr>
+          <w:rFonts w:hint="default" w:ascii="Sitka Subheading" w:hAnsi="Sitka Subheading" w:cs="Sitka Subheading"/>
+        </w:rPr>
+        <w:t>ip netns list</w:t>
+      </w:r>
+    </w:p>
+    <w:p>
+      <w:pPr>
+        <w:numPr>
+          <w:ilvl w:val="1"/>
+          <w:numId w:val="11"/>
+        </w:numPr>
+        <w:spacing w:line="360" w:lineRule="auto"/>
+        <w:ind w:left="840" w:leftChars="0" w:hanging="420" w:firstLineChars="0"/>
+        <w:rPr>
+          <w:rFonts w:hint="default" w:ascii="Sitka Subheading" w:hAnsi="Sitka Subheading" w:cs="Sitka Subheading"/>
+        </w:rPr>
+      </w:pPr>
+      <w:r>
+        <w:rPr>
+          <w:rFonts w:hint="default" w:ascii="Sitka Subheading" w:hAnsi="Sitka Subheading" w:cs="Sitka Subheading"/>
+        </w:rPr>
+        <w:t>Execute command inside namespace</w:t>
+      </w:r>
+      <w:r>
+        <w:rPr>
+          <w:rFonts w:hint="default" w:ascii="Sitka Subheading" w:hAnsi="Sitka Subheading" w:cs="Sitka Subheading"/>
+        </w:rPr>
+        <w:br w:type="textWrapping"/>
+      </w:r>
+      <w:r>
+        <w:rPr>
+          <w:rFonts w:hint="default" w:ascii="Sitka Subheading" w:hAnsi="Sitka Subheading" w:cs="Sitka Subheading"/>
+        </w:rPr>
+        <w:t>ip netns exec &lt;namespace-name&gt; &lt;command&gt;</w:t>
+      </w:r>
+      <w:r>
+        <w:rPr>
+          <w:rFonts w:hint="default" w:ascii="Sitka Subheading" w:hAnsi="Sitka Subheading" w:cs="Sitka Subheading"/>
+        </w:rPr>
+        <w:br w:type="textWrapping"/>
+      </w:r>
+      <w:r>
+        <w:rPr>
+          <w:rFonts w:hint="default" w:ascii="Sitka Subheading" w:hAnsi="Sitka Subheading" w:cs="Sitka Subheading"/>
+          <w:i/>
+          <w:iCs/>
+          <w:lang w:val="en-IN"/>
+        </w:rPr>
+        <w:t>ip</w:t>
+      </w:r>
+      <w:r>
+        <w:rPr>
+          <w:rFonts w:hint="default" w:ascii="Sitka Subheading" w:hAnsi="Sitka Subheading" w:cs="Sitka Subheading"/>
+          <w:i/>
+          <w:iCs/>
+        </w:rPr>
+        <w:t xml:space="preserve"> netns exec red ip add</w:t>
+      </w:r>
+    </w:p>
+    <w:p>
+      <w:pPr>
+        <w:numPr>
+          <w:ilvl w:val="1"/>
+          <w:numId w:val="11"/>
+        </w:numPr>
+        <w:spacing w:line="360" w:lineRule="auto"/>
+        <w:ind w:left="840" w:leftChars="0" w:hanging="420" w:firstLineChars="0"/>
+        <w:rPr>
+          <w:rFonts w:hint="default" w:ascii="Sitka Subheading" w:hAnsi="Sitka Subheading" w:cs="Sitka Subheading"/>
+        </w:rPr>
+      </w:pPr>
+      <w:r>
+        <w:rPr>
+          <w:rFonts w:hint="default" w:ascii="Sitka Subheading" w:hAnsi="Sitka Subheading" w:cs="Sitka Subheading"/>
+        </w:rPr>
+        <w:t>Show routing table inside namespace</w:t>
+      </w:r>
+      <w:r>
+        <w:rPr>
+          <w:rFonts w:hint="default" w:ascii="Sitka Subheading" w:hAnsi="Sitka Subheading" w:cs="Sitka Subheading"/>
+        </w:rPr>
+        <w:br w:type="textWrapping"/>
+      </w:r>
+      <w:r>
+        <w:rPr>
+          <w:rFonts w:hint="default" w:ascii="Sitka Subheading" w:hAnsi="Sitka Subheading" w:cs="Sitka Subheading"/>
+        </w:rPr>
+        <w:t>ip netns exec &lt;namespace-name&gt; route</w:t>
+      </w:r>
+      <w:r>
+        <w:rPr>
+          <w:rFonts w:hint="default" w:ascii="Sitka Subheading" w:hAnsi="Sitka Subheading" w:cs="Sitka Subheading"/>
+        </w:rPr>
+        <w:br w:type="textWrapping"/>
+      </w:r>
+      <w:bookmarkStart w:id="0" w:name="_GoBack"/>
+      <w:r>
+        <w:rPr>
+          <w:rFonts w:hint="default" w:ascii="Sitka Subheading" w:hAnsi="Sitka Subheading" w:cs="Sitka Subheading"/>
+          <w:i/>
+          <w:iCs/>
+        </w:rPr>
+        <w:t>ip netns exec red route</w:t>
+      </w:r>
+      <w:bookmarkEnd w:id="0"/>
+    </w:p>
+    <w:p>
+      <w:pPr>
+        <w:numPr>
+          <w:ilvl w:val="1"/>
+          <w:numId w:val="11"/>
+        </w:numPr>
+        <w:spacing w:line="360" w:lineRule="auto"/>
+        <w:ind w:left="840" w:leftChars="0" w:hanging="420" w:firstLineChars="0"/>
+        <w:rPr>
+          <w:rFonts w:hint="default" w:ascii="Sitka Subheading" w:hAnsi="Sitka Subheading" w:cs="Sitka Subheading"/>
+        </w:rPr>
+      </w:pPr>
+    </w:p>
+    <w:p>
+      <w:pPr>
+        <w:numPr>
+          <w:ilvl w:val="1"/>
+          <w:numId w:val="11"/>
+        </w:numPr>
+        <w:spacing w:line="360" w:lineRule="auto"/>
+        <w:ind w:left="840" w:leftChars="0" w:hanging="420" w:firstLineChars="0"/>
+        <w:rPr>
+          <w:rFonts w:hint="default" w:ascii="Sitka Subheading" w:hAnsi="Sitka Subheading" w:cs="Sitka Subheading"/>
+        </w:rPr>
+      </w:pPr>
+      <w:r>
+        <w:rPr>
+          <w:rFonts w:hint="default" w:ascii="Sitka Subheading" w:hAnsi="Sitka Subheading" w:cs="Sitka Subheading"/>
+        </w:rPr>
+        <w:t>Create veth pair</w:t>
+      </w:r>
+    </w:p>
+    <w:p>
+      <w:pPr>
+        <w:numPr>
+          <w:ilvl w:val="1"/>
+          <w:numId w:val="11"/>
+        </w:numPr>
+        <w:spacing w:line="360" w:lineRule="auto"/>
+        <w:ind w:left="840" w:leftChars="0" w:hanging="420" w:firstLineChars="0"/>
+        <w:rPr>
+          <w:rFonts w:hint="default" w:ascii="Sitka Subheading" w:hAnsi="Sitka Subheading" w:cs="Sitka Subheading"/>
+        </w:rPr>
+      </w:pPr>
+    </w:p>
+    <w:p>
+      <w:pPr>
+        <w:numPr>
+          <w:ilvl w:val="1"/>
+          <w:numId w:val="11"/>
+        </w:numPr>
+        <w:spacing w:line="360" w:lineRule="auto"/>
+        <w:ind w:left="840" w:leftChars="0" w:hanging="420" w:firstLineChars="0"/>
+        <w:rPr>
+          <w:rFonts w:hint="default" w:ascii="Sitka Subheading" w:hAnsi="Sitka Subheading" w:cs="Sitka Subheading"/>
+        </w:rPr>
+      </w:pPr>
+      <w:r>
+        <w:rPr>
+          <w:rFonts w:hint="default" w:ascii="Sitka Subheading" w:hAnsi="Sitka Subheading" w:cs="Sitka Subheading"/>
+        </w:rPr>
+        <w:t>ip link add &lt;veth1&gt; type veth peer name &lt;veth2&gt;</w:t>
+      </w:r>
+    </w:p>
+    <w:p>
+      <w:pPr>
+        <w:numPr>
+          <w:ilvl w:val="1"/>
+          <w:numId w:val="11"/>
+        </w:numPr>
+        <w:spacing w:line="360" w:lineRule="auto"/>
+        <w:ind w:left="840" w:leftChars="0" w:hanging="420" w:firstLineChars="0"/>
+        <w:rPr>
+          <w:rFonts w:hint="default" w:ascii="Sitka Subheading" w:hAnsi="Sitka Subheading" w:cs="Sitka Subheading"/>
+        </w:rPr>
+      </w:pPr>
+    </w:p>
+    <w:p>
+      <w:pPr>
+        <w:numPr>
+          <w:ilvl w:val="1"/>
+          <w:numId w:val="11"/>
+        </w:numPr>
+        <w:spacing w:line="360" w:lineRule="auto"/>
+        <w:ind w:left="840" w:leftChars="0" w:hanging="420" w:firstLineChars="0"/>
+        <w:rPr>
+          <w:rFonts w:hint="default" w:ascii="Sitka Subheading" w:hAnsi="Sitka Subheading" w:cs="Sitka Subheading"/>
+        </w:rPr>
+      </w:pPr>
+      <w:r>
+        <w:rPr>
+          <w:rFonts w:hint="default" w:ascii="Sitka Subheading" w:hAnsi="Sitka Subheading" w:cs="Sitka Subheading"/>
+        </w:rPr>
+        <w:t>Example</w:t>
+      </w:r>
+    </w:p>
+    <w:p>
+      <w:pPr>
+        <w:numPr>
+          <w:ilvl w:val="1"/>
+          <w:numId w:val="11"/>
+        </w:numPr>
+        <w:spacing w:line="360" w:lineRule="auto"/>
+        <w:ind w:left="840" w:leftChars="0" w:hanging="420" w:firstLineChars="0"/>
+        <w:rPr>
+          <w:rFonts w:hint="default" w:ascii="Sitka Subheading" w:hAnsi="Sitka Subheading" w:cs="Sitka Subheading"/>
+        </w:rPr>
+      </w:pPr>
+    </w:p>
+    <w:p>
+      <w:pPr>
+        <w:numPr>
+          <w:ilvl w:val="1"/>
+          <w:numId w:val="11"/>
+        </w:numPr>
+        <w:spacing w:line="360" w:lineRule="auto"/>
+        <w:ind w:left="840" w:leftChars="0" w:hanging="420" w:firstLineChars="0"/>
+        <w:rPr>
+          <w:rFonts w:hint="default" w:ascii="Sitka Subheading" w:hAnsi="Sitka Subheading" w:cs="Sitka Subheading"/>
+        </w:rPr>
+      </w:pPr>
+      <w:r>
+        <w:rPr>
+          <w:rFonts w:hint="default" w:ascii="Sitka Subheading" w:hAnsi="Sitka Subheading" w:cs="Sitka Subheading"/>
+        </w:rPr>
+        <w:t>ip link add veth-red type veth peer name veth-blue</w:t>
+      </w:r>
+    </w:p>
+    <w:p>
+      <w:pPr>
+        <w:numPr>
+          <w:ilvl w:val="1"/>
+          <w:numId w:val="11"/>
+        </w:numPr>
+        <w:spacing w:line="360" w:lineRule="auto"/>
+        <w:ind w:left="840" w:leftChars="0" w:hanging="420" w:firstLineChars="0"/>
+        <w:rPr>
+          <w:rFonts w:hint="default" w:ascii="Sitka Subheading" w:hAnsi="Sitka Subheading" w:cs="Sitka Subheading"/>
+        </w:rPr>
+      </w:pPr>
+    </w:p>
+    <w:p>
+      <w:pPr>
+        <w:numPr>
+          <w:ilvl w:val="1"/>
+          <w:numId w:val="11"/>
+        </w:numPr>
+        <w:spacing w:line="360" w:lineRule="auto"/>
+        <w:ind w:left="840" w:leftChars="0" w:hanging="420" w:firstLineChars="0"/>
+        <w:rPr>
+          <w:rFonts w:hint="default" w:ascii="Sitka Subheading" w:hAnsi="Sitka Subheading" w:cs="Sitka Subheading"/>
+        </w:rPr>
+      </w:pPr>
+      <w:r>
+        <w:rPr>
+          <w:rFonts w:hint="default" w:ascii="Sitka Subheading" w:hAnsi="Sitka Subheading" w:cs="Sitka Subheading"/>
+        </w:rPr>
+        <w:t>Connect veth to namespace</w:t>
+      </w:r>
+    </w:p>
+    <w:p>
+      <w:pPr>
+        <w:numPr>
+          <w:ilvl w:val="1"/>
+          <w:numId w:val="11"/>
+        </w:numPr>
+        <w:spacing w:line="360" w:lineRule="auto"/>
+        <w:ind w:left="840" w:leftChars="0" w:hanging="420" w:firstLineChars="0"/>
+        <w:rPr>
+          <w:rFonts w:hint="default" w:ascii="Sitka Subheading" w:hAnsi="Sitka Subheading" w:cs="Sitka Subheading"/>
+        </w:rPr>
+      </w:pPr>
+    </w:p>
+    <w:p>
+      <w:pPr>
+        <w:numPr>
+          <w:ilvl w:val="1"/>
+          <w:numId w:val="11"/>
+        </w:numPr>
+        <w:spacing w:line="360" w:lineRule="auto"/>
+        <w:ind w:left="840" w:leftChars="0" w:hanging="420" w:firstLineChars="0"/>
+        <w:rPr>
+          <w:rFonts w:hint="default" w:ascii="Sitka Subheading" w:hAnsi="Sitka Subheading" w:cs="Sitka Subheading"/>
+        </w:rPr>
+      </w:pPr>
+      <w:r>
+        <w:rPr>
+          <w:rFonts w:hint="default" w:ascii="Sitka Subheading" w:hAnsi="Sitka Subheading" w:cs="Sitka Subheading"/>
+        </w:rPr>
+        <w:t>ip link set &lt;veth-name&gt; netns &lt;namespace-name&gt;</w:t>
+      </w:r>
+    </w:p>
+    <w:p>
+      <w:pPr>
+        <w:numPr>
+          <w:ilvl w:val="1"/>
+          <w:numId w:val="11"/>
+        </w:numPr>
+        <w:spacing w:line="360" w:lineRule="auto"/>
+        <w:ind w:left="840" w:leftChars="0" w:hanging="420" w:firstLineChars="0"/>
+        <w:rPr>
+          <w:rFonts w:hint="default" w:ascii="Sitka Subheading" w:hAnsi="Sitka Subheading" w:cs="Sitka Subheading"/>
+        </w:rPr>
+      </w:pPr>
+    </w:p>
+    <w:p>
+      <w:pPr>
+        <w:numPr>
+          <w:ilvl w:val="1"/>
+          <w:numId w:val="11"/>
+        </w:numPr>
+        <w:spacing w:line="360" w:lineRule="auto"/>
+        <w:ind w:left="840" w:leftChars="0" w:hanging="420" w:firstLineChars="0"/>
+        <w:rPr>
+          <w:rFonts w:hint="default" w:ascii="Sitka Subheading" w:hAnsi="Sitka Subheading" w:cs="Sitka Subheading"/>
+        </w:rPr>
+      </w:pPr>
+      <w:r>
+        <w:rPr>
+          <w:rFonts w:hint="default" w:ascii="Sitka Subheading" w:hAnsi="Sitka Subheading" w:cs="Sitka Subheading"/>
+        </w:rPr>
+        <w:t>Example</w:t>
+      </w:r>
+    </w:p>
+    <w:p>
+      <w:pPr>
+        <w:numPr>
+          <w:ilvl w:val="1"/>
+          <w:numId w:val="11"/>
+        </w:numPr>
+        <w:spacing w:line="360" w:lineRule="auto"/>
+        <w:ind w:left="840" w:leftChars="0" w:hanging="420" w:firstLineChars="0"/>
+        <w:rPr>
+          <w:rFonts w:hint="default" w:ascii="Sitka Subheading" w:hAnsi="Sitka Subheading" w:cs="Sitka Subheading"/>
+        </w:rPr>
+      </w:pPr>
+    </w:p>
+    <w:p>
+      <w:pPr>
+        <w:numPr>
+          <w:ilvl w:val="1"/>
+          <w:numId w:val="11"/>
+        </w:numPr>
+        <w:spacing w:line="360" w:lineRule="auto"/>
+        <w:ind w:left="840" w:leftChars="0" w:hanging="420" w:firstLineChars="0"/>
+        <w:rPr>
+          <w:rFonts w:hint="default" w:ascii="Sitka Subheading" w:hAnsi="Sitka Subheading" w:cs="Sitka Subheading"/>
+        </w:rPr>
+      </w:pPr>
+      <w:r>
+        <w:rPr>
+          <w:rFonts w:hint="default" w:ascii="Sitka Subheading" w:hAnsi="Sitka Subheading" w:cs="Sitka Subheading"/>
+        </w:rPr>
+        <w:t>ip link set veth-red netns red</w:t>
+      </w:r>
+    </w:p>
+    <w:p>
+      <w:pPr>
+        <w:numPr>
+          <w:ilvl w:val="1"/>
+          <w:numId w:val="11"/>
+        </w:numPr>
+        <w:spacing w:line="360" w:lineRule="auto"/>
+        <w:ind w:left="840" w:leftChars="0" w:hanging="420" w:firstLineChars="0"/>
+        <w:rPr>
+          <w:rFonts w:hint="default" w:ascii="Sitka Subheading" w:hAnsi="Sitka Subheading" w:cs="Sitka Subheading"/>
+        </w:rPr>
+      </w:pPr>
+    </w:p>
+    <w:p>
+      <w:pPr>
+        <w:numPr>
+          <w:ilvl w:val="1"/>
+          <w:numId w:val="11"/>
+        </w:numPr>
+        <w:spacing w:line="360" w:lineRule="auto"/>
+        <w:ind w:left="840" w:leftChars="0" w:hanging="420" w:firstLineChars="0"/>
+        <w:rPr>
+          <w:rFonts w:hint="default" w:ascii="Sitka Subheading" w:hAnsi="Sitka Subheading" w:cs="Sitka Subheading"/>
+        </w:rPr>
+      </w:pPr>
+      <w:r>
+        <w:rPr>
+          <w:rFonts w:hint="default" w:ascii="Sitka Subheading" w:hAnsi="Sitka Subheading" w:cs="Sitka Subheading"/>
+        </w:rPr>
+        <w:t>Bring interface up inside namespace</w:t>
+      </w:r>
+    </w:p>
+    <w:p>
+      <w:pPr>
+        <w:numPr>
+          <w:ilvl w:val="1"/>
+          <w:numId w:val="11"/>
+        </w:numPr>
+        <w:spacing w:line="360" w:lineRule="auto"/>
+        <w:ind w:left="840" w:leftChars="0" w:hanging="420" w:firstLineChars="0"/>
+        <w:rPr>
+          <w:rFonts w:hint="default" w:ascii="Sitka Subheading" w:hAnsi="Sitka Subheading" w:cs="Sitka Subheading"/>
+        </w:rPr>
+      </w:pPr>
+    </w:p>
+    <w:p>
+      <w:pPr>
+        <w:numPr>
+          <w:ilvl w:val="1"/>
+          <w:numId w:val="11"/>
+        </w:numPr>
+        <w:spacing w:line="360" w:lineRule="auto"/>
+        <w:ind w:left="840" w:leftChars="0" w:hanging="420" w:firstLineChars="0"/>
+        <w:rPr>
+          <w:rFonts w:hint="default" w:ascii="Sitka Subheading" w:hAnsi="Sitka Subheading" w:cs="Sitka Subheading"/>
+        </w:rPr>
+      </w:pPr>
+      <w:r>
+        <w:rPr>
+          <w:rFonts w:hint="default" w:ascii="Sitka Subheading" w:hAnsi="Sitka Subheading" w:cs="Sitka Subheading"/>
+        </w:rPr>
+        <w:t>ip netns exec &lt;namespace-name&gt; ip link set &lt;interface-name&gt; up</w:t>
+      </w:r>
+    </w:p>
+    <w:p>
+      <w:pPr>
+        <w:numPr>
+          <w:ilvl w:val="1"/>
+          <w:numId w:val="11"/>
+        </w:numPr>
+        <w:spacing w:line="360" w:lineRule="auto"/>
+        <w:ind w:left="840" w:leftChars="0" w:hanging="420" w:firstLineChars="0"/>
+        <w:rPr>
+          <w:rFonts w:hint="default" w:ascii="Sitka Subheading" w:hAnsi="Sitka Subheading" w:cs="Sitka Subheading"/>
+        </w:rPr>
+      </w:pPr>
+    </w:p>
+    <w:p>
+      <w:pPr>
+        <w:numPr>
+          <w:ilvl w:val="1"/>
+          <w:numId w:val="11"/>
+        </w:numPr>
+        <w:spacing w:line="360" w:lineRule="auto"/>
+        <w:ind w:left="840" w:leftChars="0" w:hanging="420" w:firstLineChars="0"/>
+        <w:rPr>
+          <w:rFonts w:hint="default" w:ascii="Sitka Subheading" w:hAnsi="Sitka Subheading" w:cs="Sitka Subheading"/>
+        </w:rPr>
+      </w:pPr>
+      <w:r>
+        <w:rPr>
+          <w:rFonts w:hint="default" w:ascii="Sitka Subheading" w:hAnsi="Sitka Subheading" w:cs="Sitka Subheading"/>
+        </w:rPr>
+        <w:t>Examples</w:t>
+      </w:r>
+    </w:p>
+    <w:p>
+      <w:pPr>
+        <w:numPr>
+          <w:ilvl w:val="1"/>
+          <w:numId w:val="11"/>
+        </w:numPr>
+        <w:spacing w:line="360" w:lineRule="auto"/>
+        <w:ind w:left="840" w:leftChars="0" w:hanging="420" w:firstLineChars="0"/>
+        <w:rPr>
+          <w:rFonts w:hint="default" w:ascii="Sitka Subheading" w:hAnsi="Sitka Subheading" w:cs="Sitka Subheading"/>
+        </w:rPr>
+      </w:pPr>
+    </w:p>
+    <w:p>
+      <w:pPr>
+        <w:numPr>
+          <w:ilvl w:val="1"/>
+          <w:numId w:val="11"/>
+        </w:numPr>
+        <w:spacing w:line="360" w:lineRule="auto"/>
+        <w:ind w:left="840" w:leftChars="0" w:hanging="420" w:firstLineChars="0"/>
+        <w:rPr>
+          <w:rFonts w:hint="default" w:ascii="Sitka Subheading" w:hAnsi="Sitka Subheading" w:cs="Sitka Subheading"/>
+        </w:rPr>
+      </w:pPr>
+      <w:r>
+        <w:rPr>
+          <w:rFonts w:hint="default" w:ascii="Sitka Subheading" w:hAnsi="Sitka Subheading" w:cs="Sitka Subheading"/>
+        </w:rPr>
+        <w:t>ip netns exec red ip link set lo up</w:t>
+      </w:r>
+    </w:p>
+    <w:p>
+      <w:pPr>
+        <w:numPr>
+          <w:ilvl w:val="1"/>
+          <w:numId w:val="11"/>
+        </w:numPr>
+        <w:spacing w:line="360" w:lineRule="auto"/>
+        <w:ind w:left="840" w:leftChars="0" w:hanging="420" w:firstLineChars="0"/>
+        <w:rPr>
+          <w:rFonts w:hint="default" w:ascii="Sitka Subheading" w:hAnsi="Sitka Subheading" w:cs="Sitka Subheading"/>
+        </w:rPr>
+      </w:pPr>
+    </w:p>
+    <w:p>
+      <w:pPr>
+        <w:numPr>
+          <w:ilvl w:val="1"/>
+          <w:numId w:val="11"/>
+        </w:numPr>
+        <w:spacing w:line="360" w:lineRule="auto"/>
+        <w:ind w:left="840" w:leftChars="0" w:hanging="420" w:firstLineChars="0"/>
+        <w:rPr>
+          <w:rFonts w:hint="default" w:ascii="Sitka Subheading" w:hAnsi="Sitka Subheading" w:cs="Sitka Subheading"/>
+        </w:rPr>
+      </w:pPr>
+      <w:r>
+        <w:rPr>
+          <w:rFonts w:hint="default" w:ascii="Sitka Subheading" w:hAnsi="Sitka Subheading" w:cs="Sitka Subheading"/>
+        </w:rPr>
+        <w:t>ip netns exec red ip link set veth-red up</w:t>
+      </w:r>
+    </w:p>
+    <w:p>
+      <w:pPr>
+        <w:numPr>
+          <w:ilvl w:val="1"/>
+          <w:numId w:val="11"/>
+        </w:numPr>
+        <w:spacing w:line="360" w:lineRule="auto"/>
+        <w:ind w:left="840" w:leftChars="0" w:hanging="420" w:firstLineChars="0"/>
+        <w:rPr>
+          <w:rFonts w:hint="default" w:ascii="Sitka Subheading" w:hAnsi="Sitka Subheading" w:cs="Sitka Subheading"/>
+        </w:rPr>
+      </w:pPr>
+    </w:p>
+    <w:p>
+      <w:pPr>
+        <w:numPr>
+          <w:ilvl w:val="1"/>
+          <w:numId w:val="11"/>
+        </w:numPr>
+        <w:spacing w:line="360" w:lineRule="auto"/>
+        <w:ind w:left="840" w:leftChars="0" w:hanging="420" w:firstLineChars="0"/>
+        <w:rPr>
+          <w:rFonts w:hint="default" w:ascii="Sitka Subheading" w:hAnsi="Sitka Subheading" w:cs="Sitka Subheading"/>
+        </w:rPr>
+      </w:pPr>
+      <w:r>
+        <w:rPr>
+          <w:rFonts w:hint="default" w:ascii="Sitka Subheading" w:hAnsi="Sitka Subheading" w:cs="Sitka Subheading"/>
+        </w:rPr>
+        <w:t>Assign IP inside namespace</w:t>
+      </w:r>
+    </w:p>
+    <w:p>
+      <w:pPr>
+        <w:numPr>
+          <w:ilvl w:val="1"/>
+          <w:numId w:val="11"/>
+        </w:numPr>
+        <w:spacing w:line="360" w:lineRule="auto"/>
+        <w:ind w:left="840" w:leftChars="0" w:hanging="420" w:firstLineChars="0"/>
+        <w:rPr>
+          <w:rFonts w:hint="default" w:ascii="Sitka Subheading" w:hAnsi="Sitka Subheading" w:cs="Sitka Subheading"/>
+        </w:rPr>
+      </w:pPr>
+    </w:p>
+    <w:p>
+      <w:pPr>
+        <w:numPr>
+          <w:ilvl w:val="1"/>
+          <w:numId w:val="11"/>
+        </w:numPr>
+        <w:spacing w:line="360" w:lineRule="auto"/>
+        <w:ind w:left="840" w:leftChars="0" w:hanging="420" w:firstLineChars="0"/>
+        <w:rPr>
+          <w:rFonts w:hint="default" w:ascii="Sitka Subheading" w:hAnsi="Sitka Subheading" w:cs="Sitka Subheading"/>
+        </w:rPr>
+      </w:pPr>
+      <w:r>
+        <w:rPr>
+          <w:rFonts w:hint="default" w:ascii="Sitka Subheading" w:hAnsi="Sitka Subheading" w:cs="Sitka Subheading"/>
+        </w:rPr>
+        <w:t>ip netns exec &lt;namespace-name&gt; ip addr add &lt;ip&gt;/&lt;mask&gt; dev &lt;interface-name&gt;</w:t>
+      </w:r>
+    </w:p>
+    <w:p>
+      <w:pPr>
+        <w:numPr>
+          <w:ilvl w:val="1"/>
+          <w:numId w:val="11"/>
+        </w:numPr>
+        <w:spacing w:line="360" w:lineRule="auto"/>
+        <w:ind w:left="840" w:leftChars="0" w:hanging="420" w:firstLineChars="0"/>
+        <w:rPr>
+          <w:rFonts w:hint="default" w:ascii="Sitka Subheading" w:hAnsi="Sitka Subheading" w:cs="Sitka Subheading"/>
+        </w:rPr>
+      </w:pPr>
+    </w:p>
+    <w:p>
+      <w:pPr>
+        <w:numPr>
+          <w:ilvl w:val="1"/>
+          <w:numId w:val="11"/>
+        </w:numPr>
+        <w:spacing w:line="360" w:lineRule="auto"/>
+        <w:ind w:left="840" w:leftChars="0" w:hanging="420" w:firstLineChars="0"/>
+        <w:rPr>
+          <w:rFonts w:hint="default" w:ascii="Sitka Subheading" w:hAnsi="Sitka Subheading" w:cs="Sitka Subheading"/>
+        </w:rPr>
+      </w:pPr>
+      <w:r>
+        <w:rPr>
+          <w:rFonts w:hint="default" w:ascii="Sitka Subheading" w:hAnsi="Sitka Subheading" w:cs="Sitka Subheading"/>
+        </w:rPr>
+        <w:t>Examples</w:t>
+      </w:r>
+    </w:p>
+    <w:p>
+      <w:pPr>
+        <w:numPr>
+          <w:ilvl w:val="1"/>
+          <w:numId w:val="11"/>
+        </w:numPr>
+        <w:spacing w:line="360" w:lineRule="auto"/>
+        <w:ind w:left="840" w:leftChars="0" w:hanging="420" w:firstLineChars="0"/>
+        <w:rPr>
+          <w:rFonts w:hint="default" w:ascii="Sitka Subheading" w:hAnsi="Sitka Subheading" w:cs="Sitka Subheading"/>
+        </w:rPr>
+      </w:pPr>
+    </w:p>
+    <w:p>
+      <w:pPr>
+        <w:numPr>
+          <w:ilvl w:val="1"/>
+          <w:numId w:val="11"/>
+        </w:numPr>
+        <w:spacing w:line="360" w:lineRule="auto"/>
+        <w:ind w:left="840" w:leftChars="0" w:hanging="420" w:firstLineChars="0"/>
+        <w:rPr>
+          <w:rFonts w:hint="default" w:ascii="Sitka Subheading" w:hAnsi="Sitka Subheading" w:cs="Sitka Subheading"/>
+        </w:rPr>
+      </w:pPr>
+      <w:r>
+        <w:rPr>
+          <w:rFonts w:hint="default" w:ascii="Sitka Subheading" w:hAnsi="Sitka Subheading" w:cs="Sitka Subheading"/>
+        </w:rPr>
+        <w:t>ip netns exec red ip addr add 192.168.15.2/24 dev veth-red</w:t>
+      </w:r>
+    </w:p>
+    <w:p>
+      <w:pPr>
+        <w:numPr>
+          <w:ilvl w:val="1"/>
+          <w:numId w:val="11"/>
+        </w:numPr>
+        <w:spacing w:line="360" w:lineRule="auto"/>
+        <w:ind w:left="840" w:leftChars="0" w:hanging="420" w:firstLineChars="0"/>
+        <w:rPr>
+          <w:rFonts w:hint="default" w:ascii="Sitka Subheading" w:hAnsi="Sitka Subheading" w:cs="Sitka Subheading"/>
+        </w:rPr>
+      </w:pPr>
+    </w:p>
+    <w:p>
+      <w:pPr>
+        <w:numPr>
+          <w:ilvl w:val="1"/>
+          <w:numId w:val="11"/>
+        </w:numPr>
+        <w:spacing w:line="360" w:lineRule="auto"/>
+        <w:ind w:left="840" w:leftChars="0" w:hanging="420" w:firstLineChars="0"/>
+        <w:rPr>
+          <w:rFonts w:hint="default" w:ascii="Sitka Subheading" w:hAnsi="Sitka Subheading" w:cs="Sitka Subheading"/>
+        </w:rPr>
+      </w:pPr>
+      <w:r>
+        <w:rPr>
+          <w:rFonts w:hint="default" w:ascii="Sitka Subheading" w:hAnsi="Sitka Subheading" w:cs="Sitka Subheading"/>
+        </w:rPr>
+        <w:t>ip netns exec blue ip addr add 192.168.15.3/24 dev veth-blue</w:t>
+      </w:r>
+    </w:p>
+    <w:p>
+      <w:pPr>
+        <w:numPr>
+          <w:ilvl w:val="1"/>
+          <w:numId w:val="11"/>
+        </w:numPr>
+        <w:spacing w:line="360" w:lineRule="auto"/>
+        <w:ind w:left="840" w:leftChars="0" w:hanging="420" w:firstLineChars="0"/>
+        <w:rPr>
+          <w:rFonts w:hint="default" w:ascii="Sitka Subheading" w:hAnsi="Sitka Subheading" w:cs="Sitka Subheading"/>
+        </w:rPr>
+      </w:pPr>
+    </w:p>
+    <w:p>
+      <w:pPr>
+        <w:numPr>
+          <w:ilvl w:val="1"/>
+          <w:numId w:val="11"/>
+        </w:numPr>
+        <w:spacing w:line="360" w:lineRule="auto"/>
+        <w:ind w:left="840" w:leftChars="0" w:hanging="420" w:firstLineChars="0"/>
+        <w:rPr>
+          <w:rFonts w:hint="default" w:ascii="Sitka Subheading" w:hAnsi="Sitka Subheading" w:cs="Sitka Subheading"/>
+        </w:rPr>
+      </w:pPr>
+      <w:r>
+        <w:rPr>
+          <w:rFonts w:hint="default" w:ascii="Sitka Subheading" w:hAnsi="Sitka Subheading" w:cs="Sitka Subheading"/>
+        </w:rPr>
+        <w:t>Ping from namespace</w:t>
+      </w:r>
+    </w:p>
+    <w:p>
+      <w:pPr>
+        <w:numPr>
+          <w:ilvl w:val="1"/>
+          <w:numId w:val="11"/>
+        </w:numPr>
+        <w:spacing w:line="360" w:lineRule="auto"/>
+        <w:ind w:left="840" w:leftChars="0" w:hanging="420" w:firstLineChars="0"/>
+        <w:rPr>
+          <w:rFonts w:hint="default" w:ascii="Sitka Subheading" w:hAnsi="Sitka Subheading" w:cs="Sitka Subheading"/>
+        </w:rPr>
+      </w:pPr>
+    </w:p>
+    <w:p>
+      <w:pPr>
+        <w:numPr>
+          <w:ilvl w:val="1"/>
+          <w:numId w:val="11"/>
+        </w:numPr>
+        <w:spacing w:line="360" w:lineRule="auto"/>
+        <w:ind w:left="840" w:leftChars="0" w:hanging="420" w:firstLineChars="0"/>
+        <w:rPr>
+          <w:rFonts w:hint="default" w:ascii="Sitka Subheading" w:hAnsi="Sitka Subheading" w:cs="Sitka Subheading"/>
+        </w:rPr>
+      </w:pPr>
+      <w:r>
+        <w:rPr>
+          <w:rFonts w:hint="default" w:ascii="Sitka Subheading" w:hAnsi="Sitka Subheading" w:cs="Sitka Subheading"/>
+        </w:rPr>
+        <w:t>ip netns exec &lt;namespace-name&gt; ping -c 4 &lt;ip&gt;</w:t>
+      </w:r>
+    </w:p>
+    <w:p>
+      <w:pPr>
+        <w:numPr>
+          <w:ilvl w:val="1"/>
+          <w:numId w:val="11"/>
+        </w:numPr>
+        <w:spacing w:line="360" w:lineRule="auto"/>
+        <w:ind w:left="840" w:leftChars="0" w:hanging="420" w:firstLineChars="0"/>
+        <w:rPr>
+          <w:rFonts w:hint="default" w:ascii="Sitka Subheading" w:hAnsi="Sitka Subheading" w:cs="Sitka Subheading"/>
+        </w:rPr>
+      </w:pPr>
+    </w:p>
+    <w:p>
+      <w:pPr>
+        <w:numPr>
+          <w:ilvl w:val="1"/>
+          <w:numId w:val="11"/>
+        </w:numPr>
+        <w:spacing w:line="360" w:lineRule="auto"/>
+        <w:ind w:left="840" w:leftChars="0" w:hanging="420" w:firstLineChars="0"/>
+        <w:rPr>
+          <w:rFonts w:hint="default" w:ascii="Sitka Subheading" w:hAnsi="Sitka Subheading" w:cs="Sitka Subheading"/>
+        </w:rPr>
+      </w:pPr>
+      <w:r>
+        <w:rPr>
+          <w:rFonts w:hint="default" w:ascii="Sitka Subheading" w:hAnsi="Sitka Subheading" w:cs="Sitka Subheading"/>
+        </w:rPr>
+        <w:t>Examples</w:t>
+      </w:r>
+    </w:p>
+    <w:p>
+      <w:pPr>
+        <w:numPr>
+          <w:ilvl w:val="1"/>
+          <w:numId w:val="11"/>
+        </w:numPr>
+        <w:spacing w:line="360" w:lineRule="auto"/>
+        <w:ind w:left="840" w:leftChars="0" w:hanging="420" w:firstLineChars="0"/>
+        <w:rPr>
+          <w:rFonts w:hint="default" w:ascii="Sitka Subheading" w:hAnsi="Sitka Subheading" w:cs="Sitka Subheading"/>
+        </w:rPr>
+      </w:pPr>
+    </w:p>
+    <w:p>
+      <w:pPr>
+        <w:numPr>
+          <w:ilvl w:val="1"/>
+          <w:numId w:val="11"/>
+        </w:numPr>
+        <w:spacing w:line="360" w:lineRule="auto"/>
+        <w:ind w:left="840" w:leftChars="0" w:hanging="420" w:firstLineChars="0"/>
+        <w:rPr>
+          <w:rFonts w:hint="default" w:ascii="Sitka Subheading" w:hAnsi="Sitka Subheading" w:cs="Sitka Subheading"/>
+        </w:rPr>
+      </w:pPr>
+      <w:r>
+        <w:rPr>
+          <w:rFonts w:hint="default" w:ascii="Sitka Subheading" w:hAnsi="Sitka Subheading" w:cs="Sitka Subheading"/>
+        </w:rPr>
+        <w:t>ip netns exec red ping -c 4 192.168.15.3</w:t>
+      </w:r>
+    </w:p>
+    <w:p>
+      <w:pPr>
+        <w:numPr>
+          <w:ilvl w:val="1"/>
+          <w:numId w:val="11"/>
+        </w:numPr>
+        <w:spacing w:line="360" w:lineRule="auto"/>
+        <w:ind w:left="840" w:leftChars="0" w:hanging="420" w:firstLineChars="0"/>
+        <w:rPr>
+          <w:rFonts w:hint="default" w:ascii="Sitka Subheading" w:hAnsi="Sitka Subheading" w:cs="Sitka Subheading"/>
+        </w:rPr>
+      </w:pPr>
+    </w:p>
+    <w:p>
+      <w:pPr>
+        <w:numPr>
+          <w:ilvl w:val="1"/>
+          <w:numId w:val="11"/>
+        </w:numPr>
+        <w:spacing w:line="360" w:lineRule="auto"/>
+        <w:ind w:left="840" w:leftChars="0" w:hanging="420" w:firstLineChars="0"/>
+        <w:rPr>
+          <w:rFonts w:hint="default" w:ascii="Sitka Subheading" w:hAnsi="Sitka Subheading" w:cs="Sitka Subheading"/>
+        </w:rPr>
+      </w:pPr>
+      <w:r>
+        <w:rPr>
+          <w:rFonts w:hint="default" w:ascii="Sitka Subheading" w:hAnsi="Sitka Subheading" w:cs="Sitka Subheading"/>
+        </w:rPr>
+        <w:t>ip netns exec blue ping -c 4 192.168.15.2</w:t>
+      </w:r>
+    </w:p>
+    <w:p>
+      <w:pPr>
+        <w:numPr>
+          <w:ilvl w:val="1"/>
+          <w:numId w:val="11"/>
+        </w:numPr>
+        <w:spacing w:line="360" w:lineRule="auto"/>
+        <w:ind w:left="840" w:leftChars="0" w:hanging="420" w:firstLineChars="0"/>
+        <w:rPr>
+          <w:rFonts w:hint="default" w:ascii="Sitka Subheading" w:hAnsi="Sitka Subheading" w:cs="Sitka Subheading"/>
+        </w:rPr>
+      </w:pPr>
+    </w:p>
+    <w:p>
+      <w:pPr>
+        <w:numPr>
+          <w:ilvl w:val="1"/>
+          <w:numId w:val="11"/>
+        </w:numPr>
+        <w:spacing w:line="360" w:lineRule="auto"/>
+        <w:ind w:left="840" w:leftChars="0" w:hanging="420" w:firstLineChars="0"/>
+        <w:rPr>
+          <w:rFonts w:hint="default" w:ascii="Sitka Subheading" w:hAnsi="Sitka Subheading" w:cs="Sitka Subheading"/>
+        </w:rPr>
+      </w:pPr>
+      <w:r>
+        <w:rPr>
+          <w:rFonts w:hint="default" w:ascii="Sitka Subheading" w:hAnsi="Sitka Subheading" w:cs="Sitka Subheading"/>
+        </w:rPr>
+        <w:t>Ping from host</w:t>
+      </w:r>
+    </w:p>
+    <w:p>
+      <w:pPr>
+        <w:numPr>
+          <w:ilvl w:val="1"/>
+          <w:numId w:val="11"/>
+        </w:numPr>
+        <w:spacing w:line="360" w:lineRule="auto"/>
+        <w:ind w:left="840" w:leftChars="0" w:hanging="420" w:firstLineChars="0"/>
+        <w:rPr>
+          <w:rFonts w:hint="default" w:ascii="Sitka Subheading" w:hAnsi="Sitka Subheading" w:cs="Sitka Subheading"/>
+        </w:rPr>
+      </w:pPr>
+    </w:p>
+    <w:p>
+      <w:pPr>
+        <w:numPr>
+          <w:ilvl w:val="1"/>
+          <w:numId w:val="11"/>
+        </w:numPr>
+        <w:spacing w:line="360" w:lineRule="auto"/>
+        <w:ind w:left="840" w:leftChars="0" w:hanging="420" w:firstLineChars="0"/>
+        <w:rPr>
+          <w:rFonts w:hint="default" w:ascii="Sitka Subheading" w:hAnsi="Sitka Subheading" w:cs="Sitka Subheading"/>
+        </w:rPr>
+      </w:pPr>
+      <w:r>
+        <w:rPr>
+          <w:rFonts w:hint="default" w:ascii="Sitka Subheading" w:hAnsi="Sitka Subheading" w:cs="Sitka Subheading"/>
+        </w:rPr>
+        <w:t>ping -c 4 &lt;ip&gt;</w:t>
+      </w:r>
+    </w:p>
+    <w:p>
+      <w:pPr>
+        <w:numPr>
+          <w:ilvl w:val="1"/>
+          <w:numId w:val="11"/>
+        </w:numPr>
+        <w:spacing w:line="360" w:lineRule="auto"/>
+        <w:ind w:left="840" w:leftChars="0" w:hanging="420" w:firstLineChars="0"/>
+        <w:rPr>
+          <w:rFonts w:hint="default" w:ascii="Sitka Subheading" w:hAnsi="Sitka Subheading" w:cs="Sitka Subheading"/>
+        </w:rPr>
+      </w:pPr>
+    </w:p>
+    <w:p>
+      <w:pPr>
+        <w:numPr>
+          <w:ilvl w:val="1"/>
+          <w:numId w:val="11"/>
+        </w:numPr>
+        <w:spacing w:line="360" w:lineRule="auto"/>
+        <w:ind w:left="840" w:leftChars="0" w:hanging="420" w:firstLineChars="0"/>
+        <w:rPr>
+          <w:rFonts w:hint="default" w:ascii="Sitka Subheading" w:hAnsi="Sitka Subheading" w:cs="Sitka Subheading"/>
+        </w:rPr>
+      </w:pPr>
+      <w:r>
+        <w:rPr>
+          <w:rFonts w:hint="default" w:ascii="Sitka Subheading" w:hAnsi="Sitka Subheading" w:cs="Sitka Subheading"/>
+        </w:rPr>
+        <w:t>Examples</w:t>
+      </w:r>
+    </w:p>
+    <w:p>
+      <w:pPr>
+        <w:numPr>
+          <w:ilvl w:val="1"/>
+          <w:numId w:val="11"/>
+        </w:numPr>
+        <w:spacing w:line="360" w:lineRule="auto"/>
+        <w:ind w:left="840" w:leftChars="0" w:hanging="420" w:firstLineChars="0"/>
+        <w:rPr>
+          <w:rFonts w:hint="default" w:ascii="Sitka Subheading" w:hAnsi="Sitka Subheading" w:cs="Sitka Subheading"/>
+        </w:rPr>
+      </w:pPr>
+    </w:p>
+    <w:p>
+      <w:pPr>
+        <w:numPr>
+          <w:ilvl w:val="1"/>
+          <w:numId w:val="11"/>
+        </w:numPr>
+        <w:spacing w:line="360" w:lineRule="auto"/>
+        <w:ind w:left="840" w:leftChars="0" w:hanging="420" w:firstLineChars="0"/>
+        <w:rPr>
+          <w:rFonts w:hint="default" w:ascii="Sitka Subheading" w:hAnsi="Sitka Subheading" w:cs="Sitka Subheading"/>
+        </w:rPr>
+      </w:pPr>
+      <w:r>
+        <w:rPr>
+          <w:rFonts w:hint="default" w:ascii="Sitka Subheading" w:hAnsi="Sitka Subheading" w:cs="Sitka Subheading"/>
+        </w:rPr>
+        <w:t>ping -c 4 192.168.15.2</w:t>
+      </w:r>
+    </w:p>
+    <w:p>
+      <w:pPr>
+        <w:numPr>
+          <w:ilvl w:val="1"/>
+          <w:numId w:val="11"/>
+        </w:numPr>
+        <w:spacing w:line="360" w:lineRule="auto"/>
+        <w:ind w:left="840" w:leftChars="0" w:hanging="420" w:firstLineChars="0"/>
+        <w:rPr>
+          <w:rFonts w:hint="default" w:ascii="Sitka Subheading" w:hAnsi="Sitka Subheading" w:cs="Sitka Subheading"/>
+        </w:rPr>
+      </w:pPr>
+    </w:p>
+    <w:p>
+      <w:pPr>
+        <w:numPr>
+          <w:ilvl w:val="1"/>
+          <w:numId w:val="11"/>
+        </w:numPr>
+        <w:spacing w:line="360" w:lineRule="auto"/>
+        <w:ind w:left="840" w:leftChars="0" w:hanging="420" w:firstLineChars="0"/>
+        <w:rPr>
+          <w:rFonts w:hint="default" w:ascii="Sitka Subheading" w:hAnsi="Sitka Subheading" w:cs="Sitka Subheading"/>
+        </w:rPr>
+      </w:pPr>
+      <w:r>
+        <w:rPr>
+          <w:rFonts w:hint="default" w:ascii="Sitka Subheading" w:hAnsi="Sitka Subheading" w:cs="Sitka Subheading"/>
+        </w:rPr>
+        <w:t>ping -c 4 192.168.15.3</w:t>
+      </w:r>
+    </w:p>
+    <w:p>
+      <w:pPr>
+        <w:numPr>
+          <w:ilvl w:val="1"/>
+          <w:numId w:val="11"/>
+        </w:numPr>
+        <w:spacing w:line="360" w:lineRule="auto"/>
+        <w:ind w:left="840" w:leftChars="0" w:hanging="420" w:firstLineChars="0"/>
+        <w:rPr>
+          <w:rFonts w:hint="default" w:ascii="Sitka Subheading" w:hAnsi="Sitka Subheading" w:cs="Sitka Subheading"/>
+        </w:rPr>
+      </w:pPr>
+    </w:p>
+    <w:p>
+      <w:pPr>
+        <w:numPr>
+          <w:ilvl w:val="1"/>
+          <w:numId w:val="11"/>
+        </w:numPr>
+        <w:spacing w:line="360" w:lineRule="auto"/>
+        <w:ind w:left="840" w:leftChars="0" w:hanging="420" w:firstLineChars="0"/>
+        <w:rPr>
+          <w:rFonts w:hint="default" w:ascii="Sitka Subheading" w:hAnsi="Sitka Subheading" w:cs="Sitka Subheading"/>
+        </w:rPr>
+      </w:pPr>
+      <w:r>
+        <w:rPr>
+          <w:rFonts w:hint="default" w:ascii="Sitka Subheading" w:hAnsi="Sitka Subheading" w:cs="Sitka Subheading"/>
+        </w:rPr>
+        <w:t>Add route in host</w:t>
+      </w:r>
+    </w:p>
+    <w:p>
+      <w:pPr>
+        <w:numPr>
+          <w:ilvl w:val="1"/>
+          <w:numId w:val="11"/>
+        </w:numPr>
+        <w:spacing w:line="360" w:lineRule="auto"/>
+        <w:ind w:left="840" w:leftChars="0" w:hanging="420" w:firstLineChars="0"/>
+        <w:rPr>
+          <w:rFonts w:hint="default" w:ascii="Sitka Subheading" w:hAnsi="Sitka Subheading" w:cs="Sitka Subheading"/>
+        </w:rPr>
+      </w:pPr>
+    </w:p>
+    <w:p>
+      <w:pPr>
+        <w:numPr>
+          <w:ilvl w:val="1"/>
+          <w:numId w:val="11"/>
+        </w:numPr>
+        <w:spacing w:line="360" w:lineRule="auto"/>
+        <w:ind w:left="840" w:leftChars="0" w:hanging="420" w:firstLineChars="0"/>
+        <w:rPr>
+          <w:rFonts w:hint="default" w:ascii="Sitka Subheading" w:hAnsi="Sitka Subheading" w:cs="Sitka Subheading"/>
+        </w:rPr>
+      </w:pPr>
+      <w:r>
+        <w:rPr>
+          <w:rFonts w:hint="default" w:ascii="Sitka Subheading" w:hAnsi="Sitka Subheading" w:cs="Sitka Subheading"/>
+        </w:rPr>
+        <w:t>ip route add &lt;network-ip&gt; via &lt;gateway-ip&gt;</w:t>
+      </w:r>
+    </w:p>
+    <w:p>
+      <w:pPr>
+        <w:numPr>
+          <w:ilvl w:val="1"/>
+          <w:numId w:val="11"/>
+        </w:numPr>
+        <w:spacing w:line="360" w:lineRule="auto"/>
+        <w:ind w:left="840" w:leftChars="0" w:hanging="420" w:firstLineChars="0"/>
+        <w:rPr>
+          <w:rFonts w:hint="default" w:ascii="Sitka Subheading" w:hAnsi="Sitka Subheading" w:cs="Sitka Subheading"/>
+        </w:rPr>
+      </w:pPr>
+    </w:p>
+    <w:p>
+      <w:pPr>
+        <w:numPr>
+          <w:ilvl w:val="1"/>
+          <w:numId w:val="11"/>
+        </w:numPr>
+        <w:spacing w:line="360" w:lineRule="auto"/>
+        <w:ind w:left="840" w:leftChars="0" w:hanging="420" w:firstLineChars="0"/>
+        <w:rPr>
+          <w:rFonts w:hint="default" w:ascii="Sitka Subheading" w:hAnsi="Sitka Subheading" w:cs="Sitka Subheading"/>
+        </w:rPr>
+      </w:pPr>
+      <w:r>
+        <w:rPr>
+          <w:rFonts w:hint="default" w:ascii="Sitka Subheading" w:hAnsi="Sitka Subheading" w:cs="Sitka Subheading"/>
+        </w:rPr>
+        <w:t>Example</w:t>
+      </w:r>
+    </w:p>
+    <w:p>
+      <w:pPr>
+        <w:numPr>
+          <w:ilvl w:val="1"/>
+          <w:numId w:val="11"/>
+        </w:numPr>
+        <w:spacing w:line="360" w:lineRule="auto"/>
+        <w:ind w:left="840" w:leftChars="0" w:hanging="420" w:firstLineChars="0"/>
+        <w:rPr>
+          <w:rFonts w:hint="default" w:ascii="Sitka Subheading" w:hAnsi="Sitka Subheading" w:cs="Sitka Subheading"/>
+        </w:rPr>
+      </w:pPr>
+    </w:p>
+    <w:p>
+      <w:pPr>
+        <w:numPr>
+          <w:ilvl w:val="1"/>
+          <w:numId w:val="11"/>
+        </w:numPr>
+        <w:spacing w:line="360" w:lineRule="auto"/>
+        <w:ind w:left="840" w:leftChars="0" w:hanging="420" w:firstLineChars="0"/>
+        <w:rPr>
+          <w:rFonts w:hint="default" w:ascii="Sitka Subheading" w:hAnsi="Sitka Subheading" w:cs="Sitka Subheading"/>
+        </w:rPr>
+      </w:pPr>
+      <w:r>
+        <w:rPr>
+          <w:rFonts w:hint="default" w:ascii="Sitka Subheading" w:hAnsi="Sitka Subheading" w:cs="Sitka Subheading"/>
+        </w:rPr>
+        <w:t>ip route add 192.168.15.0 via 192.168.25.2</w:t>
+      </w:r>
+    </w:p>
+    <w:p>
+      <w:pPr>
+        <w:numPr>
+          <w:ilvl w:val="1"/>
+          <w:numId w:val="11"/>
+        </w:numPr>
+        <w:spacing w:line="360" w:lineRule="auto"/>
+        <w:ind w:left="840" w:leftChars="0" w:hanging="420" w:firstLineChars="0"/>
+        <w:rPr>
+          <w:rFonts w:hint="default" w:ascii="Sitka Subheading" w:hAnsi="Sitka Subheading" w:cs="Sitka Subheading"/>
+        </w:rPr>
+      </w:pPr>
+    </w:p>
+    <w:p>
+      <w:pPr>
+        <w:numPr>
+          <w:ilvl w:val="1"/>
+          <w:numId w:val="11"/>
+        </w:numPr>
+        <w:spacing w:line="360" w:lineRule="auto"/>
+        <w:ind w:left="840" w:leftChars="0" w:hanging="420" w:firstLineChars="0"/>
+        <w:rPr>
+          <w:rFonts w:hint="default" w:ascii="Sitka Subheading" w:hAnsi="Sitka Subheading" w:cs="Sitka Subheading"/>
+        </w:rPr>
+      </w:pPr>
+      <w:r>
+        <w:rPr>
+          <w:rFonts w:hint="default" w:ascii="Sitka Subheading" w:hAnsi="Sitka Subheading" w:cs="Sitka Subheading"/>
+        </w:rPr>
+        <w:t>Delete interface</w:t>
+      </w:r>
+    </w:p>
+    <w:p>
+      <w:pPr>
+        <w:numPr>
+          <w:ilvl w:val="1"/>
+          <w:numId w:val="11"/>
+        </w:numPr>
+        <w:spacing w:line="360" w:lineRule="auto"/>
+        <w:ind w:left="840" w:leftChars="0" w:hanging="420" w:firstLineChars="0"/>
+        <w:rPr>
+          <w:rFonts w:hint="default" w:ascii="Sitka Subheading" w:hAnsi="Sitka Subheading" w:cs="Sitka Subheading"/>
+        </w:rPr>
+      </w:pPr>
+    </w:p>
+    <w:p>
+      <w:pPr>
+        <w:numPr>
+          <w:ilvl w:val="1"/>
+          <w:numId w:val="11"/>
+        </w:numPr>
+        <w:spacing w:line="360" w:lineRule="auto"/>
+        <w:ind w:left="840" w:leftChars="0" w:hanging="420" w:firstLineChars="0"/>
+        <w:rPr>
+          <w:rFonts w:hint="default" w:ascii="Sitka Subheading" w:hAnsi="Sitka Subheading" w:cs="Sitka Subheading"/>
+        </w:rPr>
+      </w:pPr>
+      <w:r>
+        <w:rPr>
+          <w:rFonts w:hint="default" w:ascii="Sitka Subheading" w:hAnsi="Sitka Subheading" w:cs="Sitka Subheading"/>
+        </w:rPr>
+        <w:t>ip link delete &lt;interface-name&gt;</w:t>
+      </w:r>
+    </w:p>
+    <w:p>
+      <w:pPr>
+        <w:numPr>
+          <w:ilvl w:val="1"/>
+          <w:numId w:val="11"/>
+        </w:numPr>
+        <w:spacing w:line="360" w:lineRule="auto"/>
+        <w:ind w:left="840" w:leftChars="0" w:hanging="420" w:firstLineChars="0"/>
+        <w:rPr>
+          <w:rFonts w:hint="default" w:ascii="Sitka Subheading" w:hAnsi="Sitka Subheading" w:cs="Sitka Subheading"/>
+        </w:rPr>
+      </w:pPr>
+    </w:p>
+    <w:p>
+      <w:pPr>
+        <w:numPr>
+          <w:ilvl w:val="1"/>
+          <w:numId w:val="11"/>
+        </w:numPr>
+        <w:spacing w:line="360" w:lineRule="auto"/>
+        <w:ind w:left="840" w:leftChars="0" w:hanging="420" w:firstLineChars="0"/>
+        <w:rPr>
+          <w:rFonts w:hint="default" w:ascii="Sitka Subheading" w:hAnsi="Sitka Subheading" w:cs="Sitka Subheading"/>
+        </w:rPr>
+      </w:pPr>
+      <w:r>
+        <w:rPr>
+          <w:rFonts w:hint="default" w:ascii="Sitka Subheading" w:hAnsi="Sitka Subheading" w:cs="Sitka Subheading"/>
+        </w:rPr>
+        <w:t>Examples</w:t>
+      </w:r>
+    </w:p>
+    <w:p>
+      <w:pPr>
+        <w:numPr>
+          <w:ilvl w:val="1"/>
+          <w:numId w:val="11"/>
+        </w:numPr>
+        <w:spacing w:line="360" w:lineRule="auto"/>
+        <w:ind w:left="840" w:leftChars="0" w:hanging="420" w:firstLineChars="0"/>
+        <w:rPr>
+          <w:rFonts w:hint="default" w:ascii="Sitka Subheading" w:hAnsi="Sitka Subheading" w:cs="Sitka Subheading"/>
+        </w:rPr>
+      </w:pPr>
+    </w:p>
+    <w:p>
+      <w:pPr>
+        <w:numPr>
+          <w:ilvl w:val="1"/>
+          <w:numId w:val="11"/>
+        </w:numPr>
+        <w:spacing w:line="360" w:lineRule="auto"/>
+        <w:ind w:left="840" w:leftChars="0" w:hanging="420" w:firstLineChars="0"/>
+        <w:rPr>
+          <w:rFonts w:hint="default" w:ascii="Sitka Subheading" w:hAnsi="Sitka Subheading" w:cs="Sitka Subheading"/>
+        </w:rPr>
+      </w:pPr>
+      <w:r>
+        <w:rPr>
+          <w:rFonts w:hint="default" w:ascii="Sitka Subheading" w:hAnsi="Sitka Subheading" w:cs="Sitka Subheading"/>
+        </w:rPr>
+        <w:t>ip netns exec red ip link delete veth-red</w:t>
+      </w:r>
+    </w:p>
+    <w:p>
+      <w:pPr>
+        <w:numPr>
+          <w:ilvl w:val="1"/>
+          <w:numId w:val="11"/>
+        </w:numPr>
+        <w:spacing w:line="360" w:lineRule="auto"/>
+        <w:ind w:left="840" w:leftChars="0" w:hanging="420" w:firstLineChars="0"/>
+        <w:rPr>
+          <w:rFonts w:hint="default" w:ascii="Sitka Subheading" w:hAnsi="Sitka Subheading" w:cs="Sitka Subheading"/>
+        </w:rPr>
+      </w:pPr>
+    </w:p>
+    <w:p>
+      <w:pPr>
+        <w:numPr>
+          <w:ilvl w:val="1"/>
+          <w:numId w:val="11"/>
+        </w:numPr>
+        <w:spacing w:line="360" w:lineRule="auto"/>
+        <w:ind w:left="840" w:leftChars="0" w:hanging="420" w:firstLineChars="0"/>
+        <w:rPr>
+          <w:rFonts w:hint="default" w:ascii="Sitka Subheading" w:hAnsi="Sitka Subheading" w:cs="Sitka Subheading"/>
+        </w:rPr>
+      </w:pPr>
+      <w:r>
+        <w:rPr>
+          <w:rFonts w:hint="default" w:ascii="Sitka Subheading" w:hAnsi="Sitka Subheading" w:cs="Sitka Subheading"/>
+        </w:rPr>
+        <w:t>ip link delete veth2-red-host</w:t>
+      </w:r>
+    </w:p>
+    <w:p>
+      <w:pPr>
+        <w:numPr>
+          <w:ilvl w:val="1"/>
+          <w:numId w:val="11"/>
+        </w:numPr>
+        <w:spacing w:line="360" w:lineRule="auto"/>
+        <w:ind w:left="840" w:leftChars="0" w:hanging="420" w:firstLineChars="0"/>
+        <w:rPr>
+          <w:rFonts w:hint="default" w:ascii="Sitka Subheading" w:hAnsi="Sitka Subheading" w:cs="Sitka Subheading"/>
+        </w:rPr>
+      </w:pPr>
+    </w:p>
+    <w:p>
+      <w:pPr>
+        <w:numPr>
+          <w:ilvl w:val="1"/>
+          <w:numId w:val="11"/>
+        </w:numPr>
+        <w:spacing w:line="360" w:lineRule="auto"/>
+        <w:ind w:left="840" w:leftChars="0" w:hanging="420" w:firstLineChars="0"/>
+        <w:rPr>
+          <w:rFonts w:hint="default" w:ascii="Sitka Subheading" w:hAnsi="Sitka Subheading" w:cs="Sitka Subheading"/>
+        </w:rPr>
+      </w:pPr>
+      <w:r>
+        <w:rPr>
+          <w:rFonts w:hint="default" w:ascii="Sitka Subheading" w:hAnsi="Sitka Subheading" w:cs="Sitka Subheading"/>
+        </w:rPr>
+        <w:t>Create bridge</w:t>
+      </w:r>
+    </w:p>
+    <w:p>
+      <w:pPr>
+        <w:numPr>
+          <w:ilvl w:val="1"/>
+          <w:numId w:val="11"/>
+        </w:numPr>
+        <w:spacing w:line="360" w:lineRule="auto"/>
+        <w:ind w:left="840" w:leftChars="0" w:hanging="420" w:firstLineChars="0"/>
+        <w:rPr>
+          <w:rFonts w:hint="default" w:ascii="Sitka Subheading" w:hAnsi="Sitka Subheading" w:cs="Sitka Subheading"/>
+        </w:rPr>
+      </w:pPr>
+    </w:p>
+    <w:p>
+      <w:pPr>
+        <w:numPr>
+          <w:ilvl w:val="1"/>
+          <w:numId w:val="11"/>
+        </w:numPr>
+        <w:spacing w:line="360" w:lineRule="auto"/>
+        <w:ind w:left="840" w:leftChars="0" w:hanging="420" w:firstLineChars="0"/>
+        <w:rPr>
+          <w:rFonts w:hint="default" w:ascii="Sitka Subheading" w:hAnsi="Sitka Subheading" w:cs="Sitka Subheading"/>
+        </w:rPr>
+      </w:pPr>
+      <w:r>
+        <w:rPr>
+          <w:rFonts w:hint="default" w:ascii="Sitka Subheading" w:hAnsi="Sitka Subheading" w:cs="Sitka Subheading"/>
+        </w:rPr>
+        <w:t>ip link add &lt;bridge-name&gt; type bridge</w:t>
+      </w:r>
+    </w:p>
+    <w:p>
+      <w:pPr>
+        <w:numPr>
+          <w:ilvl w:val="1"/>
+          <w:numId w:val="11"/>
+        </w:numPr>
+        <w:spacing w:line="360" w:lineRule="auto"/>
+        <w:ind w:left="840" w:leftChars="0" w:hanging="420" w:firstLineChars="0"/>
+        <w:rPr>
+          <w:rFonts w:hint="default" w:ascii="Sitka Subheading" w:hAnsi="Sitka Subheading" w:cs="Sitka Subheading"/>
+        </w:rPr>
+      </w:pPr>
+    </w:p>
+    <w:p>
+      <w:pPr>
+        <w:numPr>
+          <w:ilvl w:val="1"/>
+          <w:numId w:val="11"/>
+        </w:numPr>
+        <w:spacing w:line="360" w:lineRule="auto"/>
+        <w:ind w:left="840" w:leftChars="0" w:hanging="420" w:firstLineChars="0"/>
+        <w:rPr>
+          <w:rFonts w:hint="default" w:ascii="Sitka Subheading" w:hAnsi="Sitka Subheading" w:cs="Sitka Subheading"/>
+        </w:rPr>
+      </w:pPr>
+      <w:r>
+        <w:rPr>
+          <w:rFonts w:hint="default" w:ascii="Sitka Subheading" w:hAnsi="Sitka Subheading" w:cs="Sitka Subheading"/>
+        </w:rPr>
+        <w:t>Example</w:t>
+      </w:r>
+    </w:p>
+    <w:p>
+      <w:pPr>
+        <w:numPr>
+          <w:ilvl w:val="1"/>
+          <w:numId w:val="11"/>
+        </w:numPr>
+        <w:spacing w:line="360" w:lineRule="auto"/>
+        <w:ind w:left="840" w:leftChars="0" w:hanging="420" w:firstLineChars="0"/>
+        <w:rPr>
+          <w:rFonts w:hint="default" w:ascii="Sitka Subheading" w:hAnsi="Sitka Subheading" w:cs="Sitka Subheading"/>
+        </w:rPr>
+      </w:pPr>
+    </w:p>
+    <w:p>
+      <w:pPr>
+        <w:numPr>
+          <w:ilvl w:val="1"/>
+          <w:numId w:val="11"/>
+        </w:numPr>
+        <w:spacing w:line="360" w:lineRule="auto"/>
+        <w:ind w:left="840" w:leftChars="0" w:hanging="420" w:firstLineChars="0"/>
+        <w:rPr>
+          <w:rFonts w:hint="default" w:ascii="Sitka Subheading" w:hAnsi="Sitka Subheading" w:cs="Sitka Subheading"/>
+        </w:rPr>
+      </w:pPr>
+      <w:r>
+        <w:rPr>
+          <w:rFonts w:hint="default" w:ascii="Sitka Subheading" w:hAnsi="Sitka Subheading" w:cs="Sitka Subheading"/>
+        </w:rPr>
+        <w:t>ip link add v-net-0 type bridge</w:t>
+      </w:r>
+    </w:p>
+    <w:p>
+      <w:pPr>
+        <w:numPr>
+          <w:ilvl w:val="1"/>
+          <w:numId w:val="11"/>
+        </w:numPr>
+        <w:spacing w:line="360" w:lineRule="auto"/>
+        <w:ind w:left="840" w:leftChars="0" w:hanging="420" w:firstLineChars="0"/>
+        <w:rPr>
+          <w:rFonts w:hint="default" w:ascii="Sitka Subheading" w:hAnsi="Sitka Subheading" w:cs="Sitka Subheading"/>
+        </w:rPr>
+      </w:pPr>
+    </w:p>
+    <w:p>
+      <w:pPr>
+        <w:numPr>
+          <w:ilvl w:val="1"/>
+          <w:numId w:val="11"/>
+        </w:numPr>
+        <w:spacing w:line="360" w:lineRule="auto"/>
+        <w:ind w:left="840" w:leftChars="0" w:hanging="420" w:firstLineChars="0"/>
+        <w:rPr>
+          <w:rFonts w:hint="default" w:ascii="Sitka Subheading" w:hAnsi="Sitka Subheading" w:cs="Sitka Subheading"/>
+        </w:rPr>
+      </w:pPr>
+      <w:r>
+        <w:rPr>
+          <w:rFonts w:hint="default" w:ascii="Sitka Subheading" w:hAnsi="Sitka Subheading" w:cs="Sitka Subheading"/>
+        </w:rPr>
+        <w:t>Bring bridge up</w:t>
+      </w:r>
+    </w:p>
+    <w:p>
+      <w:pPr>
+        <w:numPr>
+          <w:ilvl w:val="1"/>
+          <w:numId w:val="11"/>
+        </w:numPr>
+        <w:spacing w:line="360" w:lineRule="auto"/>
+        <w:ind w:left="840" w:leftChars="0" w:hanging="420" w:firstLineChars="0"/>
+        <w:rPr>
+          <w:rFonts w:hint="default" w:ascii="Sitka Subheading" w:hAnsi="Sitka Subheading" w:cs="Sitka Subheading"/>
+        </w:rPr>
+      </w:pPr>
+    </w:p>
+    <w:p>
+      <w:pPr>
+        <w:numPr>
+          <w:ilvl w:val="1"/>
+          <w:numId w:val="11"/>
+        </w:numPr>
+        <w:spacing w:line="360" w:lineRule="auto"/>
+        <w:ind w:left="840" w:leftChars="0" w:hanging="420" w:firstLineChars="0"/>
+        <w:rPr>
+          <w:rFonts w:hint="default" w:ascii="Sitka Subheading" w:hAnsi="Sitka Subheading" w:cs="Sitka Subheading"/>
+        </w:rPr>
+      </w:pPr>
+      <w:r>
+        <w:rPr>
+          <w:rFonts w:hint="default" w:ascii="Sitka Subheading" w:hAnsi="Sitka Subheading" w:cs="Sitka Subheading"/>
+        </w:rPr>
+        <w:t>ip link set &lt;bridge-name&gt; up</w:t>
+      </w:r>
+    </w:p>
+    <w:p>
+      <w:pPr>
+        <w:numPr>
+          <w:ilvl w:val="1"/>
+          <w:numId w:val="11"/>
+        </w:numPr>
+        <w:spacing w:line="360" w:lineRule="auto"/>
+        <w:ind w:left="840" w:leftChars="0" w:hanging="420" w:firstLineChars="0"/>
+        <w:rPr>
+          <w:rFonts w:hint="default" w:ascii="Sitka Subheading" w:hAnsi="Sitka Subheading" w:cs="Sitka Subheading"/>
+        </w:rPr>
+      </w:pPr>
+    </w:p>
+    <w:p>
+      <w:pPr>
+        <w:numPr>
+          <w:ilvl w:val="1"/>
+          <w:numId w:val="11"/>
+        </w:numPr>
+        <w:spacing w:line="360" w:lineRule="auto"/>
+        <w:ind w:left="840" w:leftChars="0" w:hanging="420" w:firstLineChars="0"/>
+        <w:rPr>
+          <w:rFonts w:hint="default" w:ascii="Sitka Subheading" w:hAnsi="Sitka Subheading" w:cs="Sitka Subheading"/>
+        </w:rPr>
+      </w:pPr>
+      <w:r>
+        <w:rPr>
+          <w:rFonts w:hint="default" w:ascii="Sitka Subheading" w:hAnsi="Sitka Subheading" w:cs="Sitka Subheading"/>
+        </w:rPr>
+        <w:t>Example</w:t>
+      </w:r>
+    </w:p>
+    <w:p>
+      <w:pPr>
+        <w:numPr>
+          <w:ilvl w:val="1"/>
+          <w:numId w:val="11"/>
+        </w:numPr>
+        <w:spacing w:line="360" w:lineRule="auto"/>
+        <w:ind w:left="840" w:leftChars="0" w:hanging="420" w:firstLineChars="0"/>
+        <w:rPr>
+          <w:rFonts w:hint="default" w:ascii="Sitka Subheading" w:hAnsi="Sitka Subheading" w:cs="Sitka Subheading"/>
+        </w:rPr>
+      </w:pPr>
+    </w:p>
+    <w:p>
+      <w:pPr>
+        <w:numPr>
+          <w:ilvl w:val="1"/>
+          <w:numId w:val="11"/>
+        </w:numPr>
+        <w:spacing w:line="360" w:lineRule="auto"/>
+        <w:ind w:left="840" w:leftChars="0" w:hanging="420" w:firstLineChars="0"/>
+        <w:rPr>
+          <w:rFonts w:hint="default" w:ascii="Sitka Subheading" w:hAnsi="Sitka Subheading" w:cs="Sitka Subheading"/>
+        </w:rPr>
+      </w:pPr>
+      <w:r>
+        <w:rPr>
+          <w:rFonts w:hint="default" w:ascii="Sitka Subheading" w:hAnsi="Sitka Subheading" w:cs="Sitka Subheading"/>
+        </w:rPr>
+        <w:t>ip link set v-net-0 up</w:t>
+      </w:r>
+    </w:p>
+    <w:p>
+      <w:pPr>
+        <w:numPr>
+          <w:ilvl w:val="1"/>
+          <w:numId w:val="11"/>
+        </w:numPr>
+        <w:spacing w:line="360" w:lineRule="auto"/>
+        <w:ind w:left="840" w:leftChars="0" w:hanging="420" w:firstLineChars="0"/>
+        <w:rPr>
+          <w:rFonts w:hint="default" w:ascii="Sitka Subheading" w:hAnsi="Sitka Subheading" w:cs="Sitka Subheading"/>
+        </w:rPr>
+      </w:pPr>
+    </w:p>
+    <w:p>
+      <w:pPr>
+        <w:numPr>
+          <w:ilvl w:val="1"/>
+          <w:numId w:val="11"/>
+        </w:numPr>
+        <w:spacing w:line="360" w:lineRule="auto"/>
+        <w:ind w:left="840" w:leftChars="0" w:hanging="420" w:firstLineChars="0"/>
+        <w:rPr>
+          <w:rFonts w:hint="default" w:ascii="Sitka Subheading" w:hAnsi="Sitka Subheading" w:cs="Sitka Subheading"/>
+        </w:rPr>
+      </w:pPr>
+      <w:r>
+        <w:rPr>
+          <w:rFonts w:hint="default" w:ascii="Sitka Subheading" w:hAnsi="Sitka Subheading" w:cs="Sitka Subheading"/>
+        </w:rPr>
+        <w:t>Connect interface to bridge</w:t>
+      </w:r>
+    </w:p>
+    <w:p>
+      <w:pPr>
+        <w:numPr>
+          <w:ilvl w:val="1"/>
+          <w:numId w:val="11"/>
+        </w:numPr>
+        <w:spacing w:line="360" w:lineRule="auto"/>
+        <w:ind w:left="840" w:leftChars="0" w:hanging="420" w:firstLineChars="0"/>
+        <w:rPr>
+          <w:rFonts w:hint="default" w:ascii="Sitka Subheading" w:hAnsi="Sitka Subheading" w:cs="Sitka Subheading"/>
+        </w:rPr>
+      </w:pPr>
+    </w:p>
+    <w:p>
+      <w:pPr>
+        <w:numPr>
+          <w:ilvl w:val="1"/>
+          <w:numId w:val="11"/>
+        </w:numPr>
+        <w:spacing w:line="360" w:lineRule="auto"/>
+        <w:ind w:left="840" w:leftChars="0" w:hanging="420" w:firstLineChars="0"/>
+        <w:rPr>
+          <w:rFonts w:hint="default" w:ascii="Sitka Subheading" w:hAnsi="Sitka Subheading" w:cs="Sitka Subheading"/>
+        </w:rPr>
+      </w:pPr>
+      <w:r>
+        <w:rPr>
+          <w:rFonts w:hint="default" w:ascii="Sitka Subheading" w:hAnsi="Sitka Subheading" w:cs="Sitka Subheading"/>
+        </w:rPr>
+        <w:t>ip link set &lt;interface-name&gt; master &lt;bridge-name&gt;</w:t>
+      </w:r>
+    </w:p>
+    <w:p>
+      <w:pPr>
+        <w:numPr>
+          <w:ilvl w:val="1"/>
+          <w:numId w:val="11"/>
+        </w:numPr>
+        <w:spacing w:line="360" w:lineRule="auto"/>
+        <w:ind w:left="840" w:leftChars="0" w:hanging="420" w:firstLineChars="0"/>
+        <w:rPr>
+          <w:rFonts w:hint="default" w:ascii="Sitka Subheading" w:hAnsi="Sitka Subheading" w:cs="Sitka Subheading"/>
+        </w:rPr>
+      </w:pPr>
+    </w:p>
+    <w:p>
+      <w:pPr>
+        <w:numPr>
+          <w:ilvl w:val="1"/>
+          <w:numId w:val="11"/>
+        </w:numPr>
+        <w:spacing w:line="360" w:lineRule="auto"/>
+        <w:ind w:left="840" w:leftChars="0" w:hanging="420" w:firstLineChars="0"/>
+        <w:rPr>
+          <w:rFonts w:hint="default" w:ascii="Sitka Subheading" w:hAnsi="Sitka Subheading" w:cs="Sitka Subheading"/>
+        </w:rPr>
+      </w:pPr>
+      <w:r>
+        <w:rPr>
+          <w:rFonts w:hint="default" w:ascii="Sitka Subheading" w:hAnsi="Sitka Subheading" w:cs="Sitka Subheading"/>
+        </w:rPr>
+        <w:t>Examples</w:t>
+      </w:r>
+    </w:p>
+    <w:p>
+      <w:pPr>
+        <w:numPr>
+          <w:ilvl w:val="1"/>
+          <w:numId w:val="11"/>
+        </w:numPr>
+        <w:spacing w:line="360" w:lineRule="auto"/>
+        <w:ind w:left="840" w:leftChars="0" w:hanging="420" w:firstLineChars="0"/>
+        <w:rPr>
+          <w:rFonts w:hint="default" w:ascii="Sitka Subheading" w:hAnsi="Sitka Subheading" w:cs="Sitka Subheading"/>
+        </w:rPr>
+      </w:pPr>
+    </w:p>
+    <w:p>
+      <w:pPr>
+        <w:numPr>
+          <w:ilvl w:val="1"/>
+          <w:numId w:val="11"/>
+        </w:numPr>
+        <w:spacing w:line="360" w:lineRule="auto"/>
+        <w:ind w:left="840" w:leftChars="0" w:hanging="420" w:firstLineChars="0"/>
+        <w:rPr>
+          <w:rFonts w:hint="default" w:ascii="Sitka Subheading" w:hAnsi="Sitka Subheading" w:cs="Sitka Subheading"/>
+        </w:rPr>
+      </w:pPr>
+      <w:r>
+        <w:rPr>
+          <w:rFonts w:hint="default" w:ascii="Sitka Subheading" w:hAnsi="Sitka Subheading" w:cs="Sitka Subheading"/>
+        </w:rPr>
+        <w:t>ip link set veth-red-br master v-net-0</w:t>
+      </w:r>
+    </w:p>
+    <w:p>
+      <w:pPr>
+        <w:numPr>
+          <w:ilvl w:val="1"/>
+          <w:numId w:val="11"/>
+        </w:numPr>
+        <w:spacing w:line="360" w:lineRule="auto"/>
+        <w:ind w:left="840" w:leftChars="0" w:hanging="420" w:firstLineChars="0"/>
+        <w:rPr>
+          <w:rFonts w:hint="default" w:ascii="Sitka Subheading" w:hAnsi="Sitka Subheading" w:cs="Sitka Subheading"/>
+        </w:rPr>
+      </w:pPr>
+    </w:p>
+    <w:p>
+      <w:pPr>
+        <w:numPr>
+          <w:ilvl w:val="1"/>
+          <w:numId w:val="11"/>
+        </w:numPr>
+        <w:spacing w:line="360" w:lineRule="auto"/>
+        <w:ind w:left="840" w:leftChars="0" w:hanging="420" w:firstLineChars="0"/>
+        <w:rPr>
+          <w:rFonts w:hint="default" w:ascii="Sitka Subheading" w:hAnsi="Sitka Subheading" w:cs="Sitka Subheading"/>
+        </w:rPr>
+      </w:pPr>
+      <w:r>
+        <w:rPr>
+          <w:rFonts w:hint="default" w:ascii="Sitka Subheading" w:hAnsi="Sitka Subheading" w:cs="Sitka Subheading"/>
+        </w:rPr>
+        <w:t>ip link set veth-blue-br master v-net-0</w:t>
+      </w:r>
+    </w:p>
+    <w:p>
+      <w:pPr>
+        <w:numPr>
+          <w:ilvl w:val="1"/>
+          <w:numId w:val="11"/>
+        </w:numPr>
+        <w:spacing w:line="360" w:lineRule="auto"/>
+        <w:ind w:left="840" w:leftChars="0" w:hanging="420" w:firstLineChars="0"/>
+        <w:rPr>
+          <w:rFonts w:hint="default" w:ascii="Sitka Subheading" w:hAnsi="Sitka Subheading" w:cs="Sitka Subheading"/>
+        </w:rPr>
+      </w:pPr>
+    </w:p>
+    <w:p>
+      <w:pPr>
+        <w:numPr>
+          <w:ilvl w:val="1"/>
+          <w:numId w:val="11"/>
+        </w:numPr>
+        <w:spacing w:line="360" w:lineRule="auto"/>
+        <w:ind w:left="840" w:leftChars="0" w:hanging="420" w:firstLineChars="0"/>
+        <w:rPr>
+          <w:rFonts w:hint="default" w:ascii="Sitka Subheading" w:hAnsi="Sitka Subheading" w:cs="Sitka Subheading"/>
+        </w:rPr>
+      </w:pPr>
+      <w:r>
+        <w:rPr>
+          <w:rFonts w:hint="default" w:ascii="Sitka Subheading" w:hAnsi="Sitka Subheading" w:cs="Sitka Subheading"/>
+        </w:rPr>
+        <w:t>Assign IP to bridge</w:t>
+      </w:r>
+    </w:p>
+    <w:p>
+      <w:pPr>
+        <w:numPr>
+          <w:ilvl w:val="1"/>
+          <w:numId w:val="11"/>
+        </w:numPr>
+        <w:spacing w:line="360" w:lineRule="auto"/>
+        <w:ind w:left="840" w:leftChars="0" w:hanging="420" w:firstLineChars="0"/>
+        <w:rPr>
+          <w:rFonts w:hint="default" w:ascii="Sitka Subheading" w:hAnsi="Sitka Subheading" w:cs="Sitka Subheading"/>
+        </w:rPr>
+      </w:pPr>
+    </w:p>
+    <w:p>
+      <w:pPr>
+        <w:numPr>
+          <w:ilvl w:val="1"/>
+          <w:numId w:val="11"/>
+        </w:numPr>
+        <w:spacing w:line="360" w:lineRule="auto"/>
+        <w:ind w:left="840" w:leftChars="0" w:hanging="420" w:firstLineChars="0"/>
+        <w:rPr>
+          <w:rFonts w:hint="default" w:ascii="Sitka Subheading" w:hAnsi="Sitka Subheading" w:cs="Sitka Subheading"/>
+        </w:rPr>
+      </w:pPr>
+      <w:r>
+        <w:rPr>
+          <w:rFonts w:hint="default" w:ascii="Sitka Subheading" w:hAnsi="Sitka Subheading" w:cs="Sitka Subheading"/>
+        </w:rPr>
+        <w:t>ip addr add &lt;ip&gt;/&lt;mask&gt; dev &lt;bridge-name&gt;</w:t>
+      </w:r>
+    </w:p>
+    <w:p>
+      <w:pPr>
+        <w:numPr>
+          <w:ilvl w:val="1"/>
+          <w:numId w:val="11"/>
+        </w:numPr>
+        <w:spacing w:line="360" w:lineRule="auto"/>
+        <w:ind w:left="840" w:leftChars="0" w:hanging="420" w:firstLineChars="0"/>
+        <w:rPr>
+          <w:rFonts w:hint="default" w:ascii="Sitka Subheading" w:hAnsi="Sitka Subheading" w:cs="Sitka Subheading"/>
+        </w:rPr>
+      </w:pPr>
+    </w:p>
+    <w:p>
+      <w:pPr>
+        <w:numPr>
+          <w:ilvl w:val="1"/>
+          <w:numId w:val="11"/>
+        </w:numPr>
+        <w:spacing w:line="360" w:lineRule="auto"/>
+        <w:ind w:left="840" w:leftChars="0" w:hanging="420" w:firstLineChars="0"/>
+        <w:rPr>
+          <w:rFonts w:hint="default" w:ascii="Sitka Subheading" w:hAnsi="Sitka Subheading" w:cs="Sitka Subheading"/>
+        </w:rPr>
+      </w:pPr>
+      <w:r>
+        <w:rPr>
+          <w:rFonts w:hint="default" w:ascii="Sitka Subheading" w:hAnsi="Sitka Subheading" w:cs="Sitka Subheading"/>
+        </w:rPr>
+        <w:t>Example</w:t>
+      </w:r>
+    </w:p>
+    <w:p>
+      <w:pPr>
+        <w:numPr>
+          <w:ilvl w:val="1"/>
+          <w:numId w:val="11"/>
+        </w:numPr>
+        <w:spacing w:line="360" w:lineRule="auto"/>
+        <w:ind w:left="840" w:leftChars="0" w:hanging="420" w:firstLineChars="0"/>
+        <w:rPr>
+          <w:rFonts w:hint="default" w:ascii="Sitka Subheading" w:hAnsi="Sitka Subheading" w:cs="Sitka Subheading"/>
+        </w:rPr>
+      </w:pPr>
+    </w:p>
+    <w:p>
+      <w:pPr>
+        <w:numPr>
+          <w:ilvl w:val="1"/>
+          <w:numId w:val="11"/>
+        </w:numPr>
+        <w:spacing w:line="360" w:lineRule="auto"/>
+        <w:ind w:left="840" w:leftChars="0" w:hanging="420" w:firstLineChars="0"/>
+        <w:rPr>
+          <w:rFonts w:hint="default" w:ascii="Sitka Subheading" w:hAnsi="Sitka Subheading" w:cs="Sitka Subheading"/>
+        </w:rPr>
+      </w:pPr>
+      <w:r>
+        <w:rPr>
+          <w:rFonts w:hint="default" w:ascii="Sitka Subheading" w:hAnsi="Sitka Subheading" w:cs="Sitka Subheading"/>
+        </w:rPr>
+        <w:t>ip addr add 192.168.15.5/24 dev v-net-0</w:t>
+      </w:r>
+    </w:p>
+    <w:p>
+      <w:pPr>
+        <w:numPr>
+          <w:ilvl w:val="1"/>
+          <w:numId w:val="11"/>
+        </w:numPr>
+        <w:spacing w:line="360" w:lineRule="auto"/>
+        <w:ind w:left="840" w:leftChars="0" w:hanging="420" w:firstLineChars="0"/>
+        <w:rPr>
+          <w:rFonts w:hint="default" w:ascii="Sitka Subheading" w:hAnsi="Sitka Subheading" w:cs="Sitka Subheading"/>
+        </w:rPr>
+      </w:pPr>
+    </w:p>
+    <w:p>
+      <w:pPr>
+        <w:numPr>
+          <w:ilvl w:val="1"/>
+          <w:numId w:val="11"/>
+        </w:numPr>
+        <w:spacing w:line="360" w:lineRule="auto"/>
+        <w:ind w:left="840" w:leftChars="0" w:hanging="420" w:firstLineChars="0"/>
+        <w:rPr>
+          <w:rFonts w:hint="default" w:ascii="Sitka Subheading" w:hAnsi="Sitka Subheading" w:cs="Sitka Subheading"/>
+        </w:rPr>
+      </w:pPr>
+      <w:r>
+        <w:rPr>
+          <w:rFonts w:hint="default" w:ascii="Sitka Subheading" w:hAnsi="Sitka Subheading" w:cs="Sitka Subheading"/>
+        </w:rPr>
+        <w:t>Add route inside namespace</w:t>
+      </w:r>
+    </w:p>
+    <w:p>
+      <w:pPr>
+        <w:numPr>
+          <w:ilvl w:val="1"/>
+          <w:numId w:val="11"/>
+        </w:numPr>
+        <w:spacing w:line="360" w:lineRule="auto"/>
+        <w:ind w:left="840" w:leftChars="0" w:hanging="420" w:firstLineChars="0"/>
+        <w:rPr>
+          <w:rFonts w:hint="default" w:ascii="Sitka Subheading" w:hAnsi="Sitka Subheading" w:cs="Sitka Subheading"/>
+        </w:rPr>
+      </w:pPr>
+    </w:p>
+    <w:p>
+      <w:pPr>
+        <w:numPr>
+          <w:ilvl w:val="1"/>
+          <w:numId w:val="11"/>
+        </w:numPr>
+        <w:spacing w:line="360" w:lineRule="auto"/>
+        <w:ind w:left="840" w:leftChars="0" w:hanging="420" w:firstLineChars="0"/>
+        <w:rPr>
+          <w:rFonts w:hint="default" w:ascii="Sitka Subheading" w:hAnsi="Sitka Subheading" w:cs="Sitka Subheading"/>
+        </w:rPr>
+      </w:pPr>
+      <w:r>
+        <w:rPr>
+          <w:rFonts w:hint="default" w:ascii="Sitka Subheading" w:hAnsi="Sitka Subheading" w:cs="Sitka Subheading"/>
+        </w:rPr>
+        <w:t>ip netns exec &lt;namespace-name&gt; ip route add &lt;network&gt;/&lt;mask&gt; via &lt;gateway-ip&gt;</w:t>
+      </w:r>
+    </w:p>
+    <w:p>
+      <w:pPr>
+        <w:numPr>
+          <w:ilvl w:val="1"/>
+          <w:numId w:val="11"/>
+        </w:numPr>
+        <w:spacing w:line="360" w:lineRule="auto"/>
+        <w:ind w:left="840" w:leftChars="0" w:hanging="420" w:firstLineChars="0"/>
+        <w:rPr>
+          <w:rFonts w:hint="default" w:ascii="Sitka Subheading" w:hAnsi="Sitka Subheading" w:cs="Sitka Subheading"/>
+        </w:rPr>
+      </w:pPr>
+    </w:p>
+    <w:p>
+      <w:pPr>
+        <w:numPr>
+          <w:ilvl w:val="1"/>
+          <w:numId w:val="11"/>
+        </w:numPr>
+        <w:spacing w:line="360" w:lineRule="auto"/>
+        <w:ind w:left="840" w:leftChars="0" w:hanging="420" w:firstLineChars="0"/>
+        <w:rPr>
+          <w:rFonts w:hint="default" w:ascii="Sitka Subheading" w:hAnsi="Sitka Subheading" w:cs="Sitka Subheading"/>
+        </w:rPr>
+      </w:pPr>
+      <w:r>
+        <w:rPr>
+          <w:rFonts w:hint="default" w:ascii="Sitka Subheading" w:hAnsi="Sitka Subheading" w:cs="Sitka Subheading"/>
+        </w:rPr>
+        <w:t>Examples</w:t>
+      </w:r>
+    </w:p>
+    <w:p>
+      <w:pPr>
+        <w:numPr>
+          <w:ilvl w:val="1"/>
+          <w:numId w:val="11"/>
+        </w:numPr>
+        <w:spacing w:line="360" w:lineRule="auto"/>
+        <w:ind w:left="840" w:leftChars="0" w:hanging="420" w:firstLineChars="0"/>
+        <w:rPr>
+          <w:rFonts w:hint="default" w:ascii="Sitka Subheading" w:hAnsi="Sitka Subheading" w:cs="Sitka Subheading"/>
+        </w:rPr>
+      </w:pPr>
+    </w:p>
+    <w:p>
+      <w:pPr>
+        <w:numPr>
+          <w:ilvl w:val="1"/>
+          <w:numId w:val="11"/>
+        </w:numPr>
+        <w:spacing w:line="360" w:lineRule="auto"/>
+        <w:ind w:left="840" w:leftChars="0" w:hanging="420" w:firstLineChars="0"/>
+        <w:rPr>
+          <w:rFonts w:hint="default" w:ascii="Sitka Subheading" w:hAnsi="Sitka Subheading" w:cs="Sitka Subheading"/>
+        </w:rPr>
+      </w:pPr>
+      <w:r>
+        <w:rPr>
+          <w:rFonts w:hint="default" w:ascii="Sitka Subheading" w:hAnsi="Sitka Subheading" w:cs="Sitka Subheading"/>
+        </w:rPr>
+        <w:t>ip netns exec red ip route add 10.10.10.0/24 via 192.168.15.5</w:t>
+      </w:r>
+    </w:p>
+    <w:p>
+      <w:pPr>
+        <w:numPr>
+          <w:ilvl w:val="1"/>
+          <w:numId w:val="11"/>
+        </w:numPr>
+        <w:spacing w:line="360" w:lineRule="auto"/>
+        <w:ind w:left="840" w:leftChars="0" w:hanging="420" w:firstLineChars="0"/>
+        <w:rPr>
+          <w:rFonts w:hint="default" w:ascii="Sitka Subheading" w:hAnsi="Sitka Subheading" w:cs="Sitka Subheading"/>
+        </w:rPr>
+      </w:pPr>
+    </w:p>
+    <w:p>
+      <w:pPr>
+        <w:numPr>
+          <w:ilvl w:val="1"/>
+          <w:numId w:val="11"/>
+        </w:numPr>
+        <w:spacing w:line="360" w:lineRule="auto"/>
+        <w:ind w:left="840" w:leftChars="0" w:hanging="420" w:firstLineChars="0"/>
+        <w:rPr>
+          <w:rFonts w:hint="default" w:ascii="Sitka Subheading" w:hAnsi="Sitka Subheading" w:cs="Sitka Subheading"/>
+        </w:rPr>
+      </w:pPr>
+      <w:r>
+        <w:rPr>
+          <w:rFonts w:hint="default" w:ascii="Sitka Subheading" w:hAnsi="Sitka Subheading" w:cs="Sitka Subheading"/>
+        </w:rPr>
+        <w:t>ip netns exec blue ip route add 10.10.10.0/24 via 192.168.15.5</w:t>
+      </w:r>
+    </w:p>
+    <w:p>
+      <w:pPr>
+        <w:numPr>
+          <w:ilvl w:val="1"/>
+          <w:numId w:val="11"/>
+        </w:numPr>
+        <w:spacing w:line="360" w:lineRule="auto"/>
+        <w:ind w:left="840" w:leftChars="0" w:hanging="420" w:firstLineChars="0"/>
+        <w:rPr>
+          <w:rFonts w:hint="default" w:ascii="Sitka Subheading" w:hAnsi="Sitka Subheading" w:cs="Sitka Subheading"/>
+        </w:rPr>
+      </w:pPr>
+    </w:p>
+    <w:p>
+      <w:pPr>
+        <w:numPr>
+          <w:ilvl w:val="1"/>
+          <w:numId w:val="11"/>
+        </w:numPr>
+        <w:spacing w:line="360" w:lineRule="auto"/>
+        <w:ind w:left="840" w:leftChars="0" w:hanging="420" w:firstLineChars="0"/>
+        <w:rPr>
+          <w:rFonts w:hint="default" w:ascii="Sitka Subheading" w:hAnsi="Sitka Subheading" w:cs="Sitka Subheading"/>
+        </w:rPr>
+      </w:pPr>
+      <w:r>
+        <w:rPr>
+          <w:rFonts w:hint="default" w:ascii="Sitka Subheading" w:hAnsi="Sitka Subheading" w:cs="Sitka Subheading"/>
+        </w:rPr>
+        <w:t>Check IP forwarding</w:t>
+      </w:r>
+    </w:p>
+    <w:p>
+      <w:pPr>
+        <w:numPr>
+          <w:ilvl w:val="1"/>
+          <w:numId w:val="11"/>
+        </w:numPr>
+        <w:spacing w:line="360" w:lineRule="auto"/>
+        <w:ind w:left="840" w:leftChars="0" w:hanging="420" w:firstLineChars="0"/>
+        <w:rPr>
+          <w:rFonts w:hint="default" w:ascii="Sitka Subheading" w:hAnsi="Sitka Subheading" w:cs="Sitka Subheading"/>
+        </w:rPr>
+      </w:pPr>
+    </w:p>
+    <w:p>
+      <w:pPr>
+        <w:numPr>
+          <w:ilvl w:val="1"/>
+          <w:numId w:val="11"/>
+        </w:numPr>
+        <w:spacing w:line="360" w:lineRule="auto"/>
+        <w:ind w:left="840" w:leftChars="0" w:hanging="420" w:firstLineChars="0"/>
+        <w:rPr>
+          <w:rFonts w:hint="default" w:ascii="Sitka Subheading" w:hAnsi="Sitka Subheading" w:cs="Sitka Subheading"/>
+        </w:rPr>
+      </w:pPr>
+      <w:r>
+        <w:rPr>
+          <w:rFonts w:hint="default" w:ascii="Sitka Subheading" w:hAnsi="Sitka Subheading" w:cs="Sitka Subheading"/>
+        </w:rPr>
+        <w:t>cat /proc/sys/net/ipv4/ip_forward</w:t>
+      </w:r>
+    </w:p>
+    <w:p>
+      <w:pPr>
+        <w:numPr>
+          <w:ilvl w:val="1"/>
+          <w:numId w:val="11"/>
+        </w:numPr>
+        <w:spacing w:line="360" w:lineRule="auto"/>
+        <w:ind w:left="840" w:leftChars="0" w:hanging="420" w:firstLineChars="0"/>
+        <w:rPr>
+          <w:rFonts w:hint="default" w:ascii="Sitka Subheading" w:hAnsi="Sitka Subheading" w:cs="Sitka Subheading"/>
+        </w:rPr>
+      </w:pPr>
+    </w:p>
+    <w:p>
+      <w:pPr>
+        <w:numPr>
+          <w:ilvl w:val="1"/>
+          <w:numId w:val="11"/>
+        </w:numPr>
+        <w:spacing w:line="360" w:lineRule="auto"/>
+        <w:ind w:left="840" w:leftChars="0" w:hanging="420" w:firstLineChars="0"/>
+        <w:rPr>
+          <w:rFonts w:hint="default" w:ascii="Sitka Subheading" w:hAnsi="Sitka Subheading" w:cs="Sitka Subheading"/>
+        </w:rPr>
+      </w:pPr>
+      <w:r>
+        <w:rPr>
+          <w:rFonts w:hint="default" w:ascii="Sitka Subheading" w:hAnsi="Sitka Subheading" w:cs="Sitka Subheading"/>
+        </w:rPr>
+        <w:t>Enable IP forwarding</w:t>
+      </w:r>
+    </w:p>
+    <w:p>
+      <w:pPr>
+        <w:numPr>
+          <w:ilvl w:val="1"/>
+          <w:numId w:val="11"/>
+        </w:numPr>
+        <w:spacing w:line="360" w:lineRule="auto"/>
+        <w:ind w:left="840" w:leftChars="0" w:hanging="420" w:firstLineChars="0"/>
+        <w:rPr>
+          <w:rFonts w:hint="default" w:ascii="Sitka Subheading" w:hAnsi="Sitka Subheading" w:cs="Sitka Subheading"/>
+        </w:rPr>
+      </w:pPr>
+    </w:p>
+    <w:p>
+      <w:pPr>
+        <w:numPr>
+          <w:ilvl w:val="1"/>
+          <w:numId w:val="11"/>
+        </w:numPr>
+        <w:spacing w:line="360" w:lineRule="auto"/>
+        <w:ind w:left="840" w:leftChars="0" w:hanging="420" w:firstLineChars="0"/>
+        <w:rPr>
+          <w:rFonts w:hint="default" w:ascii="Sitka Subheading" w:hAnsi="Sitka Subheading" w:cs="Sitka Subheading"/>
+        </w:rPr>
+      </w:pPr>
+      <w:r>
+        <w:rPr>
+          <w:rFonts w:hint="default" w:ascii="Sitka Subheading" w:hAnsi="Sitka Subheading" w:cs="Sitka Subheading"/>
+        </w:rPr>
+        <w:t>echo 1 &gt; /proc/sys/net/ipv4/ip_forward</w:t>
+      </w:r>
+    </w:p>
+    <w:p>
+      <w:pPr>
+        <w:numPr>
+          <w:ilvl w:val="1"/>
+          <w:numId w:val="11"/>
+        </w:numPr>
+        <w:spacing w:line="360" w:lineRule="auto"/>
+        <w:ind w:left="840" w:leftChars="0" w:hanging="420" w:firstLineChars="0"/>
+        <w:rPr>
+          <w:rFonts w:hint="default" w:ascii="Sitka Subheading" w:hAnsi="Sitka Subheading" w:cs="Sitka Subheading"/>
+        </w:rPr>
+      </w:pPr>
+    </w:p>
+    <w:p>
+      <w:pPr>
+        <w:numPr>
+          <w:ilvl w:val="1"/>
+          <w:numId w:val="11"/>
+        </w:numPr>
+        <w:spacing w:line="360" w:lineRule="auto"/>
+        <w:ind w:left="840" w:leftChars="0" w:hanging="420" w:firstLineChars="0"/>
+        <w:rPr>
+          <w:rFonts w:hint="default" w:ascii="Sitka Subheading" w:hAnsi="Sitka Subheading" w:cs="Sitka Subheading"/>
+        </w:rPr>
+      </w:pPr>
+      <w:r>
+        <w:rPr>
+          <w:rFonts w:hint="default" w:ascii="Sitka Subheading" w:hAnsi="Sitka Subheading" w:cs="Sitka Subheading"/>
+        </w:rPr>
+        <w:t>Enable NAT</w:t>
+      </w:r>
+    </w:p>
+    <w:p>
+      <w:pPr>
+        <w:numPr>
+          <w:ilvl w:val="1"/>
+          <w:numId w:val="11"/>
+        </w:numPr>
+        <w:spacing w:line="360" w:lineRule="auto"/>
+        <w:ind w:left="840" w:leftChars="0" w:hanging="420" w:firstLineChars="0"/>
+        <w:rPr>
+          <w:rFonts w:hint="default" w:ascii="Sitka Subheading" w:hAnsi="Sitka Subheading" w:cs="Sitka Subheading"/>
+        </w:rPr>
+      </w:pPr>
+    </w:p>
+    <w:p>
+      <w:pPr>
+        <w:numPr>
+          <w:ilvl w:val="1"/>
+          <w:numId w:val="11"/>
+        </w:numPr>
+        <w:spacing w:line="360" w:lineRule="auto"/>
+        <w:ind w:left="840" w:leftChars="0" w:hanging="420" w:firstLineChars="0"/>
+        <w:rPr>
+          <w:rFonts w:hint="default" w:ascii="Sitka Subheading" w:hAnsi="Sitka Subheading" w:cs="Sitka Subheading"/>
+        </w:rPr>
+      </w:pPr>
+      <w:r>
+        <w:rPr>
+          <w:rFonts w:hint="default" w:ascii="Sitka Subheading" w:hAnsi="Sitka Subheading" w:cs="Sitka Subheading"/>
+        </w:rPr>
+        <w:t>iptables -t nat -A POSTROUTING -o &lt;interface-name&gt; -j MASQUERADE</w:t>
+      </w:r>
+    </w:p>
+    <w:p>
+      <w:pPr>
+        <w:numPr>
+          <w:ilvl w:val="1"/>
+          <w:numId w:val="11"/>
+        </w:numPr>
+        <w:spacing w:line="360" w:lineRule="auto"/>
+        <w:ind w:left="840" w:leftChars="0" w:hanging="420" w:firstLineChars="0"/>
+        <w:rPr>
+          <w:rFonts w:hint="default" w:ascii="Sitka Subheading" w:hAnsi="Sitka Subheading" w:cs="Sitka Subheading"/>
+        </w:rPr>
+      </w:pPr>
+    </w:p>
+    <w:p>
+      <w:pPr>
+        <w:numPr>
+          <w:ilvl w:val="1"/>
+          <w:numId w:val="11"/>
+        </w:numPr>
+        <w:spacing w:line="360" w:lineRule="auto"/>
+        <w:ind w:left="840" w:leftChars="0" w:hanging="420" w:firstLineChars="0"/>
+        <w:rPr>
+          <w:rFonts w:hint="default" w:ascii="Sitka Subheading" w:hAnsi="Sitka Subheading" w:cs="Sitka Subheading"/>
+        </w:rPr>
+      </w:pPr>
+      <w:r>
+        <w:rPr>
+          <w:rFonts w:hint="default" w:ascii="Sitka Subheading" w:hAnsi="Sitka Subheading" w:cs="Sitka Subheading"/>
+        </w:rPr>
+        <w:t>Example</w:t>
+      </w:r>
+    </w:p>
+    <w:p>
+      <w:pPr>
+        <w:numPr>
+          <w:ilvl w:val="1"/>
+          <w:numId w:val="11"/>
+        </w:numPr>
+        <w:spacing w:line="360" w:lineRule="auto"/>
+        <w:ind w:left="840" w:leftChars="0" w:hanging="420" w:firstLineChars="0"/>
+        <w:rPr>
+          <w:rFonts w:hint="default" w:ascii="Sitka Subheading" w:hAnsi="Sitka Subheading" w:cs="Sitka Subheading"/>
+        </w:rPr>
+      </w:pPr>
+    </w:p>
+    <w:p>
+      <w:pPr>
+        <w:numPr>
+          <w:ilvl w:val="1"/>
+          <w:numId w:val="11"/>
+        </w:numPr>
+        <w:spacing w:line="360" w:lineRule="auto"/>
+        <w:ind w:left="840" w:leftChars="0" w:hanging="420" w:firstLineChars="0"/>
+        <w:rPr>
+          <w:rFonts w:hint="default" w:ascii="Sitka Subheading" w:hAnsi="Sitka Subheading" w:cs="Sitka Subheading"/>
+        </w:rPr>
+      </w:pPr>
+      <w:r>
+        <w:rPr>
+          <w:rFonts w:hint="default" w:ascii="Sitka Subheading" w:hAnsi="Sitka Subheading" w:cs="Sitka Subheading"/>
+        </w:rPr>
+        <w:t>iptables -t nat -A POSTROUTING -o enp0s8 -j MASQUERADE</w:t>
+      </w:r>
+    </w:p>
+    <w:p>
+      <w:pPr>
+        <w:numPr>
+          <w:ilvl w:val="1"/>
+          <w:numId w:val="11"/>
+        </w:numPr>
+        <w:spacing w:line="360" w:lineRule="auto"/>
+        <w:ind w:left="840" w:leftChars="0" w:hanging="420" w:firstLineChars="0"/>
+        <w:rPr>
+          <w:rFonts w:hint="default" w:ascii="Sitka Subheading" w:hAnsi="Sitka Subheading" w:cs="Sitka Subheading"/>
+        </w:rPr>
+      </w:pPr>
+    </w:p>
+    <w:p>
+      <w:pPr>
+        <w:numPr>
+          <w:ilvl w:val="1"/>
+          <w:numId w:val="11"/>
+        </w:numPr>
+        <w:spacing w:line="360" w:lineRule="auto"/>
+        <w:ind w:left="840" w:leftChars="0" w:hanging="420" w:firstLineChars="0"/>
+        <w:rPr>
+          <w:rFonts w:hint="default" w:ascii="Sitka Subheading" w:hAnsi="Sitka Subheading" w:cs="Sitka Subheading"/>
+        </w:rPr>
+      </w:pPr>
+      <w:r>
+        <w:rPr>
+          <w:rFonts w:hint="default" w:ascii="Sitka Subheading" w:hAnsi="Sitka Subheading" w:cs="Sitka Subheading"/>
+        </w:rPr>
+        <w:t>Add DNAT port forwarding</w:t>
+      </w:r>
+    </w:p>
+    <w:p>
+      <w:pPr>
+        <w:numPr>
+          <w:ilvl w:val="1"/>
+          <w:numId w:val="11"/>
+        </w:numPr>
+        <w:spacing w:line="360" w:lineRule="auto"/>
+        <w:ind w:left="840" w:leftChars="0" w:hanging="420" w:firstLineChars="0"/>
+        <w:rPr>
+          <w:rFonts w:hint="default" w:ascii="Sitka Subheading" w:hAnsi="Sitka Subheading" w:cs="Sitka Subheading"/>
+        </w:rPr>
+      </w:pPr>
+    </w:p>
+    <w:p>
+      <w:pPr>
+        <w:numPr>
+          <w:ilvl w:val="1"/>
+          <w:numId w:val="11"/>
+        </w:numPr>
+        <w:spacing w:line="360" w:lineRule="auto"/>
+        <w:ind w:left="840" w:leftChars="0" w:hanging="420" w:firstLineChars="0"/>
+        <w:rPr>
+          <w:rFonts w:hint="default" w:ascii="Sitka Subheading" w:hAnsi="Sitka Subheading" w:cs="Sitka Subheading"/>
+        </w:rPr>
+      </w:pPr>
+      <w:r>
+        <w:rPr>
+          <w:rFonts w:hint="default" w:ascii="Sitka Subheading" w:hAnsi="Sitka Subheading" w:cs="Sitka Subheading"/>
+        </w:rPr>
+        <w:t>iptables -t nat -A PREROUTING -p tcp --dport &lt;host-port&gt; -j DNAT --to-destination &lt;ip&gt;:&lt;port&gt;</w:t>
+      </w:r>
+    </w:p>
+    <w:p>
+      <w:pPr>
+        <w:numPr>
+          <w:ilvl w:val="1"/>
+          <w:numId w:val="11"/>
+        </w:numPr>
+        <w:spacing w:line="360" w:lineRule="auto"/>
+        <w:ind w:left="840" w:leftChars="0" w:hanging="420" w:firstLineChars="0"/>
+        <w:rPr>
+          <w:rFonts w:hint="default" w:ascii="Sitka Subheading" w:hAnsi="Sitka Subheading" w:cs="Sitka Subheading"/>
+        </w:rPr>
+      </w:pPr>
+    </w:p>
+    <w:p>
+      <w:pPr>
+        <w:numPr>
+          <w:ilvl w:val="1"/>
+          <w:numId w:val="11"/>
+        </w:numPr>
+        <w:spacing w:line="360" w:lineRule="auto"/>
+        <w:ind w:left="840" w:leftChars="0" w:hanging="420" w:firstLineChars="0"/>
+        <w:rPr>
+          <w:rFonts w:hint="default" w:ascii="Sitka Subheading" w:hAnsi="Sitka Subheading" w:cs="Sitka Subheading"/>
+        </w:rPr>
+      </w:pPr>
+      <w:r>
+        <w:rPr>
+          <w:rFonts w:hint="default" w:ascii="Sitka Subheading" w:hAnsi="Sitka Subheading" w:cs="Sitka Subheading"/>
+        </w:rPr>
+        <w:t>Example</w:t>
+      </w:r>
+    </w:p>
+    <w:p>
+      <w:pPr>
+        <w:numPr>
+          <w:ilvl w:val="1"/>
+          <w:numId w:val="11"/>
+        </w:numPr>
+        <w:spacing w:line="360" w:lineRule="auto"/>
+        <w:ind w:left="840" w:leftChars="0" w:hanging="420" w:firstLineChars="0"/>
+        <w:rPr>
+          <w:rFonts w:hint="default" w:ascii="Sitka Subheading" w:hAnsi="Sitka Subheading" w:cs="Sitka Subheading"/>
+        </w:rPr>
+      </w:pPr>
+    </w:p>
+    <w:p>
+      <w:pPr>
+        <w:numPr>
+          <w:ilvl w:val="1"/>
+          <w:numId w:val="11"/>
+        </w:numPr>
+        <w:spacing w:line="360" w:lineRule="auto"/>
+        <w:ind w:left="840" w:leftChars="0" w:hanging="420" w:firstLineChars="0"/>
+        <w:rPr>
+          <w:rFonts w:hint="default" w:ascii="Sitka Subheading" w:hAnsi="Sitka Subheading" w:cs="Sitka Subheading"/>
+        </w:rPr>
+      </w:pPr>
+      <w:r>
+        <w:rPr>
+          <w:rFonts w:hint="default" w:ascii="Sitka Subheading" w:hAnsi="Sitka Subheading" w:cs="Sitka Subheading"/>
+        </w:rPr>
+        <w:t>iptables -t nat -A PREROUTING -p tcp --dport 8080 -j DNAT --to-destination 192.168.15.2:80</w:t>
+      </w:r>
+    </w:p>
+    <w:p>
+      <w:pPr>
+        <w:numPr>
+          <w:ilvl w:val="1"/>
+          <w:numId w:val="11"/>
+        </w:numPr>
+        <w:spacing w:line="360" w:lineRule="auto"/>
+        <w:ind w:left="840" w:leftChars="0" w:hanging="420" w:firstLineChars="0"/>
+        <w:rPr>
+          <w:rFonts w:hint="default" w:ascii="Sitka Subheading" w:hAnsi="Sitka Subheading" w:cs="Sitka Subheading"/>
+        </w:rPr>
+      </w:pPr>
+    </w:p>
+    <w:p>
+      <w:pPr>
+        <w:numPr>
+          <w:ilvl w:val="1"/>
+          <w:numId w:val="11"/>
+        </w:numPr>
+        <w:spacing w:line="360" w:lineRule="auto"/>
+        <w:ind w:left="840" w:leftChars="0" w:hanging="420" w:firstLineChars="0"/>
+        <w:rPr>
+          <w:rFonts w:hint="default" w:ascii="Sitka Subheading" w:hAnsi="Sitka Subheading" w:cs="Sitka Subheading"/>
+        </w:rPr>
+      </w:pPr>
+      <w:r>
+        <w:rPr>
+          <w:rFonts w:hint="default" w:ascii="Sitka Subheading" w:hAnsi="Sitka Subheading" w:cs="Sitka Subheading"/>
+        </w:rPr>
+        <w:t>Access forwarded application</w:t>
+      </w:r>
+    </w:p>
+    <w:p>
+      <w:pPr>
+        <w:numPr>
+          <w:ilvl w:val="1"/>
+          <w:numId w:val="11"/>
+        </w:numPr>
+        <w:spacing w:line="360" w:lineRule="auto"/>
+        <w:ind w:left="840" w:leftChars="0" w:hanging="420" w:firstLineChars="0"/>
+        <w:rPr>
+          <w:rFonts w:hint="default" w:ascii="Sitka Subheading" w:hAnsi="Sitka Subheading" w:cs="Sitka Subheading"/>
+        </w:rPr>
+      </w:pPr>
+    </w:p>
+    <w:p>
+      <w:pPr>
+        <w:numPr>
+          <w:ilvl w:val="1"/>
+          <w:numId w:val="11"/>
+        </w:numPr>
+        <w:spacing w:line="360" w:lineRule="auto"/>
+        <w:ind w:left="840" w:leftChars="0" w:hanging="420" w:firstLineChars="0"/>
+        <w:rPr>
+          <w:rFonts w:hint="default" w:ascii="Sitka Subheading" w:hAnsi="Sitka Subheading" w:cs="Sitka Subheading"/>
+        </w:rPr>
+      </w:pPr>
+      <w:r>
+        <w:rPr>
+          <w:rFonts w:hint="default" w:ascii="Sitka Subheading" w:hAnsi="Sitka Subheading" w:cs="Sitka Subheading"/>
+        </w:rPr>
+        <w:t>curl http://&lt;host-ip&gt;:&lt;port&gt;</w:t>
+      </w:r>
+    </w:p>
+    <w:p>
+      <w:pPr>
+        <w:numPr>
+          <w:ilvl w:val="1"/>
+          <w:numId w:val="11"/>
+        </w:numPr>
+        <w:spacing w:line="360" w:lineRule="auto"/>
+        <w:ind w:left="840" w:leftChars="0" w:hanging="420" w:firstLineChars="0"/>
+        <w:rPr>
+          <w:rFonts w:hint="default" w:ascii="Sitka Subheading" w:hAnsi="Sitka Subheading" w:cs="Sitka Subheading"/>
+        </w:rPr>
+      </w:pPr>
+    </w:p>
+    <w:p>
+      <w:pPr>
+        <w:numPr>
+          <w:ilvl w:val="1"/>
+          <w:numId w:val="11"/>
+        </w:numPr>
+        <w:spacing w:line="360" w:lineRule="auto"/>
+        <w:ind w:left="840" w:leftChars="0" w:hanging="420" w:firstLineChars="0"/>
+        <w:rPr>
+          <w:rFonts w:hint="default" w:ascii="Sitka Subheading" w:hAnsi="Sitka Subheading" w:cs="Sitka Subheading"/>
+        </w:rPr>
+      </w:pPr>
+      <w:r>
+        <w:rPr>
+          <w:rFonts w:hint="default" w:ascii="Sitka Subheading" w:hAnsi="Sitka Subheading" w:cs="Sitka Subheading"/>
+        </w:rPr>
+        <w:t>Example</w:t>
+      </w:r>
+    </w:p>
+    <w:p>
+      <w:pPr>
+        <w:numPr>
+          <w:ilvl w:val="1"/>
+          <w:numId w:val="11"/>
+        </w:numPr>
+        <w:spacing w:line="360" w:lineRule="auto"/>
+        <w:ind w:left="840" w:leftChars="0" w:hanging="420" w:firstLineChars="0"/>
+        <w:rPr>
+          <w:rFonts w:hint="default" w:ascii="Sitka Subheading" w:hAnsi="Sitka Subheading" w:cs="Sitka Subheading"/>
+        </w:rPr>
+      </w:pPr>
+    </w:p>
+    <w:p>
+      <w:pPr>
+        <w:numPr>
+          <w:ilvl w:val="1"/>
+          <w:numId w:val="11"/>
+        </w:numPr>
+        <w:spacing w:line="360" w:lineRule="auto"/>
+        <w:ind w:left="840" w:leftChars="0" w:hanging="420" w:firstLineChars="0"/>
+        <w:rPr>
+          <w:rFonts w:hint="default" w:ascii="Sitka Subheading" w:hAnsi="Sitka Subheading" w:cs="Sitka Subheading"/>
+        </w:rPr>
+      </w:pPr>
+      <w:r>
+        <w:rPr>
+          <w:rFonts w:hint="default" w:ascii="Sitka Subheading" w:hAnsi="Sitka Subheading" w:cs="Sitka Subheading"/>
+        </w:rPr>
+        <w:t>curl http://10.10.10.10:8080</w:t>
+      </w:r>
     </w:p>
     <w:p>
       <w:pPr>

</xml_diff>